<commit_message>
Updates Light Suite and co.
Updates Light Suite and co.
</commit_message>
<xml_diff>
--- a/docs/deConfUSIon_User_Manual.docx
+++ b/docs/deConfUSIon_User_Manual.docx
@@ -33,7 +33,7 @@
       </w:r>
       <w:r>
         <w:br/>
-        <w:t>15 October 2026</w:t>
+        <w:t>21 October 2026</w:t>
       </w:r>
     </w:p>
     <w:p>
@@ -49,7 +49,10 @@
         <w:jc w:val="center"/>
       </w:pPr>
       <w:r>
-        <w:t>A practical route from the original recording through quality control and processing to reviewed visualization, regions, connectivity and groups.</w:t>
+        <w:t xml:space="preserve">A practical route from the original recording </w:t>
+      </w:r>
+      <w:r>
+        <w:t>through quality control and processing to reviewed visualization, regions, connectivity and groups.</w:t>
       </w:r>
     </w:p>
     <w:p>
@@ -92,7 +95,7 @@
       <w:r>
         <w:fldChar w:fldCharType="separate"/>
       </w:r>
-      <w:hyperlink w:anchor="_Toc242991778" w:history="1">
+      <w:hyperlink w:anchor="_Toc243479451" w:history="1">
         <w:r>
           <w:rPr>
             <w:rStyle w:val="Hyperlink"/>
@@ -119,7 +122,7 @@
             <w:noProof/>
             <w:webHidden/>
           </w:rPr>
-          <w:instrText xml:space="preserve"> PAGEREF _Toc242991778 \h </w:instrText>
+          <w:instrText xml:space="preserve"> PAGEREF _Toc243479451 \h </w:instrText>
         </w:r>
         <w:r>
           <w:rPr>
@@ -167,7 +170,7 @@
           <w14:ligatures w14:val="standardContextual"/>
         </w:rPr>
       </w:pPr>
-      <w:hyperlink w:anchor="_Toc242991779" w:history="1">
+      <w:hyperlink w:anchor="_Toc243479452" w:history="1">
         <w:r>
           <w:rPr>
             <w:rStyle w:val="Hyperlink"/>
@@ -194,7 +197,7 @@
             <w:noProof/>
             <w:webHidden/>
           </w:rPr>
-          <w:instrText xml:space="preserve"> PAGEREF _Toc242991779 \h </w:instrText>
+          <w:instrText xml:space="preserve"> PAGEREF _Toc243479452 \h </w:instrText>
         </w:r>
         <w:r>
           <w:rPr>
@@ -242,7 +245,7 @@
           <w14:ligatures w14:val="standardContextual"/>
         </w:rPr>
       </w:pPr>
-      <w:hyperlink w:anchor="_Toc242991780" w:history="1">
+      <w:hyperlink w:anchor="_Toc243479453" w:history="1">
         <w:r>
           <w:rPr>
             <w:rStyle w:val="Hyperlink"/>
@@ -269,7 +272,7 @@
             <w:noProof/>
             <w:webHidden/>
           </w:rPr>
-          <w:instrText xml:space="preserve"> PAGEREF _Toc242991780 \h </w:instrText>
+          <w:instrText xml:space="preserve"> PAGEREF _Toc243479453 \h </w:instrText>
         </w:r>
         <w:r>
           <w:rPr>
@@ -317,7 +320,7 @@
           <w14:ligatures w14:val="standardContextual"/>
         </w:rPr>
       </w:pPr>
-      <w:hyperlink w:anchor="_Toc242991781" w:history="1">
+      <w:hyperlink w:anchor="_Toc243479454" w:history="1">
         <w:r>
           <w:rPr>
             <w:rStyle w:val="Hyperlink"/>
@@ -344,7 +347,7 @@
             <w:noProof/>
             <w:webHidden/>
           </w:rPr>
-          <w:instrText xml:space="preserve"> PAGEREF _Toc242991781 \h </w:instrText>
+          <w:instrText xml:space="preserve"> PAGEREF _Toc243479454 \h </w:instrText>
         </w:r>
         <w:r>
           <w:rPr>
@@ -392,7 +395,7 @@
           <w14:ligatures w14:val="standardContextual"/>
         </w:rPr>
       </w:pPr>
-      <w:hyperlink w:anchor="_Toc242991782" w:history="1">
+      <w:hyperlink w:anchor="_Toc243479455" w:history="1">
         <w:r>
           <w:rPr>
             <w:rStyle w:val="Hyperlink"/>
@@ -419,7 +422,7 @@
             <w:noProof/>
             <w:webHidden/>
           </w:rPr>
-          <w:instrText xml:space="preserve"> PAGEREF _Toc242991782 \h </w:instrText>
+          <w:instrText xml:space="preserve"> PAGEREF _Toc243479455 \h </w:instrText>
         </w:r>
         <w:r>
           <w:rPr>
@@ -467,7 +470,7 @@
           <w14:ligatures w14:val="standardContextual"/>
         </w:rPr>
       </w:pPr>
-      <w:hyperlink w:anchor="_Toc242991783" w:history="1">
+      <w:hyperlink w:anchor="_Toc243479456" w:history="1">
         <w:r>
           <w:rPr>
             <w:rStyle w:val="Hyperlink"/>
@@ -494,7 +497,7 @@
             <w:noProof/>
             <w:webHidden/>
           </w:rPr>
-          <w:instrText xml:space="preserve"> PAGEREF _Toc242991783 \h </w:instrText>
+          <w:instrText xml:space="preserve"> PAGEREF _Toc243479456 \h </w:instrText>
         </w:r>
         <w:r>
           <w:rPr>
@@ -542,7 +545,7 @@
           <w14:ligatures w14:val="standardContextual"/>
         </w:rPr>
       </w:pPr>
-      <w:hyperlink w:anchor="_Toc242991784" w:history="1">
+      <w:hyperlink w:anchor="_Toc243479457" w:history="1">
         <w:r>
           <w:rPr>
             <w:rStyle w:val="Hyperlink"/>
@@ -569,7 +572,7 @@
             <w:noProof/>
             <w:webHidden/>
           </w:rPr>
-          <w:instrText xml:space="preserve"> PAGEREF _Toc242991784 \h </w:instrText>
+          <w:instrText xml:space="preserve"> PAGEREF _Toc243479457 \h </w:instrText>
         </w:r>
         <w:r>
           <w:rPr>
@@ -617,7 +620,7 @@
           <w14:ligatures w14:val="standardContextual"/>
         </w:rPr>
       </w:pPr>
-      <w:hyperlink w:anchor="_Toc242991785" w:history="1">
+      <w:hyperlink w:anchor="_Toc243479458" w:history="1">
         <w:r>
           <w:rPr>
             <w:rStyle w:val="Hyperlink"/>
@@ -644,7 +647,7 @@
             <w:noProof/>
             <w:webHidden/>
           </w:rPr>
-          <w:instrText xml:space="preserve"> PAGEREF _Toc242991785 \h </w:instrText>
+          <w:instrText xml:space="preserve"> PAGEREF _Toc243479458 \h </w:instrText>
         </w:r>
         <w:r>
           <w:rPr>
@@ -692,7 +695,7 @@
           <w14:ligatures w14:val="standardContextual"/>
         </w:rPr>
       </w:pPr>
-      <w:hyperlink w:anchor="_Toc242991786" w:history="1">
+      <w:hyperlink w:anchor="_Toc243479459" w:history="1">
         <w:r>
           <w:rPr>
             <w:rStyle w:val="Hyperlink"/>
@@ -719,7 +722,7 @@
             <w:noProof/>
             <w:webHidden/>
           </w:rPr>
-          <w:instrText xml:space="preserve"> PAGEREF _Toc242991786 \h </w:instrText>
+          <w:instrText xml:space="preserve"> PAGEREF _Toc243479459 \h </w:instrText>
         </w:r>
         <w:r>
           <w:rPr>
@@ -767,7 +770,7 @@
           <w14:ligatures w14:val="standardContextual"/>
         </w:rPr>
       </w:pPr>
-      <w:hyperlink w:anchor="_Toc242991787" w:history="1">
+      <w:hyperlink w:anchor="_Toc243479460" w:history="1">
         <w:r>
           <w:rPr>
             <w:rStyle w:val="Hyperlink"/>
@@ -794,7 +797,7 @@
             <w:noProof/>
             <w:webHidden/>
           </w:rPr>
-          <w:instrText xml:space="preserve"> PAGEREF _Toc242991787 \h </w:instrText>
+          <w:instrText xml:space="preserve"> PAGEREF _Toc243479460 \h </w:instrText>
         </w:r>
         <w:r>
           <w:rPr>
@@ -842,7 +845,7 @@
           <w14:ligatures w14:val="standardContextual"/>
         </w:rPr>
       </w:pPr>
-      <w:hyperlink w:anchor="_Toc242991788" w:history="1">
+      <w:hyperlink w:anchor="_Toc243479461" w:history="1">
         <w:r>
           <w:rPr>
             <w:rStyle w:val="Hyperlink"/>
@@ -869,7 +872,7 @@
             <w:noProof/>
             <w:webHidden/>
           </w:rPr>
-          <w:instrText xml:space="preserve"> PAGEREF _Toc242991788 \h </w:instrText>
+          <w:instrText xml:space="preserve"> PAGEREF _Toc243479461 \h </w:instrText>
         </w:r>
         <w:r>
           <w:rPr>
@@ -917,7 +920,7 @@
           <w14:ligatures w14:val="standardContextual"/>
         </w:rPr>
       </w:pPr>
-      <w:hyperlink w:anchor="_Toc242991789" w:history="1">
+      <w:hyperlink w:anchor="_Toc243479462" w:history="1">
         <w:r>
           <w:rPr>
             <w:rStyle w:val="Hyperlink"/>
@@ -944,7 +947,7 @@
             <w:noProof/>
             <w:webHidden/>
           </w:rPr>
-          <w:instrText xml:space="preserve"> PAGEREF _Toc242991789 \h </w:instrText>
+          <w:instrText xml:space="preserve"> PAGEREF _Toc243479462 \h </w:instrText>
         </w:r>
         <w:r>
           <w:rPr>
@@ -992,7 +995,7 @@
           <w14:ligatures w14:val="standardContextual"/>
         </w:rPr>
       </w:pPr>
-      <w:hyperlink w:anchor="_Toc242991790" w:history="1">
+      <w:hyperlink w:anchor="_Toc243479463" w:history="1">
         <w:r>
           <w:rPr>
             <w:rStyle w:val="Hyperlink"/>
@@ -1019,7 +1022,7 @@
             <w:noProof/>
             <w:webHidden/>
           </w:rPr>
-          <w:instrText xml:space="preserve"> PAGEREF _Toc242991790 \h </w:instrText>
+          <w:instrText xml:space="preserve"> PAGEREF _Toc243479463 \h </w:instrText>
         </w:r>
         <w:r>
           <w:rPr>
@@ -1067,7 +1070,7 @@
           <w14:ligatures w14:val="standardContextual"/>
         </w:rPr>
       </w:pPr>
-      <w:hyperlink w:anchor="_Toc242991791" w:history="1">
+      <w:hyperlink w:anchor="_Toc243479464" w:history="1">
         <w:r>
           <w:rPr>
             <w:rStyle w:val="Hyperlink"/>
@@ -1094,7 +1097,7 @@
             <w:noProof/>
             <w:webHidden/>
           </w:rPr>
-          <w:instrText xml:space="preserve"> PAGEREF _Toc242991791 \h </w:instrText>
+          <w:instrText xml:space="preserve"> PAGEREF _Toc243479464 \h </w:instrText>
         </w:r>
         <w:r>
           <w:rPr>
@@ -1142,7 +1145,7 @@
           <w14:ligatures w14:val="standardContextual"/>
         </w:rPr>
       </w:pPr>
-      <w:hyperlink w:anchor="_Toc242991792" w:history="1">
+      <w:hyperlink w:anchor="_Toc243479465" w:history="1">
         <w:r>
           <w:rPr>
             <w:rStyle w:val="Hyperlink"/>
@@ -1169,7 +1172,7 @@
             <w:noProof/>
             <w:webHidden/>
           </w:rPr>
-          <w:instrText xml:space="preserve"> PAGEREF _Toc242991792 \h </w:instrText>
+          <w:instrText xml:space="preserve"> PAGEREF _Toc243479465 \h </w:instrText>
         </w:r>
         <w:r>
           <w:rPr>
@@ -1217,7 +1220,7 @@
           <w14:ligatures w14:val="standardContextual"/>
         </w:rPr>
       </w:pPr>
-      <w:hyperlink w:anchor="_Toc242991793" w:history="1">
+      <w:hyperlink w:anchor="_Toc243479466" w:history="1">
         <w:r>
           <w:rPr>
             <w:rStyle w:val="Hyperlink"/>
@@ -1244,7 +1247,7 @@
             <w:noProof/>
             <w:webHidden/>
           </w:rPr>
-          <w:instrText xml:space="preserve"> PAGEREF _Toc242991793 \h </w:instrText>
+          <w:instrText xml:space="preserve"> PAGEREF _Toc243479466 \h </w:instrText>
         </w:r>
         <w:r>
           <w:rPr>
@@ -1292,7 +1295,7 @@
           <w14:ligatures w14:val="standardContextual"/>
         </w:rPr>
       </w:pPr>
-      <w:hyperlink w:anchor="_Toc242991794" w:history="1">
+      <w:hyperlink w:anchor="_Toc243479467" w:history="1">
         <w:r>
           <w:rPr>
             <w:rStyle w:val="Hyperlink"/>
@@ -1319,7 +1322,7 @@
             <w:noProof/>
             <w:webHidden/>
           </w:rPr>
-          <w:instrText xml:space="preserve"> PAGEREF _Toc242991794 \h </w:instrText>
+          <w:instrText xml:space="preserve"> PAGEREF _Toc243479467 \h </w:instrText>
         </w:r>
         <w:r>
           <w:rPr>
@@ -1367,7 +1370,7 @@
           <w14:ligatures w14:val="standardContextual"/>
         </w:rPr>
       </w:pPr>
-      <w:hyperlink w:anchor="_Toc242991795" w:history="1">
+      <w:hyperlink w:anchor="_Toc243479468" w:history="1">
         <w:r>
           <w:rPr>
             <w:rStyle w:val="Hyperlink"/>
@@ -1394,7 +1397,7 @@
             <w:noProof/>
             <w:webHidden/>
           </w:rPr>
-          <w:instrText xml:space="preserve"> PAGEREF _Toc242991795 \h </w:instrText>
+          <w:instrText xml:space="preserve"> PAGEREF _Toc243479468 \h </w:instrText>
         </w:r>
         <w:r>
           <w:rPr>
@@ -1442,7 +1445,7 @@
           <w14:ligatures w14:val="standardContextual"/>
         </w:rPr>
       </w:pPr>
-      <w:hyperlink w:anchor="_Toc242991796" w:history="1">
+      <w:hyperlink w:anchor="_Toc243479469" w:history="1">
         <w:r>
           <w:rPr>
             <w:rStyle w:val="Hyperlink"/>
@@ -1469,7 +1472,7 @@
             <w:noProof/>
             <w:webHidden/>
           </w:rPr>
-          <w:instrText xml:space="preserve"> PAGEREF _Toc242991796 \h </w:instrText>
+          <w:instrText xml:space="preserve"> PAGEREF _Toc243479469 \h </w:instrText>
         </w:r>
         <w:r>
           <w:rPr>
@@ -1517,7 +1520,7 @@
           <w14:ligatures w14:val="standardContextual"/>
         </w:rPr>
       </w:pPr>
-      <w:hyperlink w:anchor="_Toc242991797" w:history="1">
+      <w:hyperlink w:anchor="_Toc243479470" w:history="1">
         <w:r>
           <w:rPr>
             <w:rStyle w:val="Hyperlink"/>
@@ -1544,7 +1547,7 @@
             <w:noProof/>
             <w:webHidden/>
           </w:rPr>
-          <w:instrText xml:space="preserve"> PAGEREF _Toc242991797 \h </w:instrText>
+          <w:instrText xml:space="preserve"> PAGEREF _Toc243479470 \h </w:instrText>
         </w:r>
         <w:r>
           <w:rPr>
@@ -1592,7 +1595,7 @@
           <w14:ligatures w14:val="standardContextual"/>
         </w:rPr>
       </w:pPr>
-      <w:hyperlink w:anchor="_Toc242991798" w:history="1">
+      <w:hyperlink w:anchor="_Toc243479471" w:history="1">
         <w:r>
           <w:rPr>
             <w:rStyle w:val="Hyperlink"/>
@@ -1619,7 +1622,7 @@
             <w:noProof/>
             <w:webHidden/>
           </w:rPr>
-          <w:instrText xml:space="preserve"> PAGEREF _Toc242991798 \h </w:instrText>
+          <w:instrText xml:space="preserve"> PAGEREF _Toc243479471 \h </w:instrText>
         </w:r>
         <w:r>
           <w:rPr>
@@ -1667,7 +1670,7 @@
           <w14:ligatures w14:val="standardContextual"/>
         </w:rPr>
       </w:pPr>
-      <w:hyperlink w:anchor="_Toc242991799" w:history="1">
+      <w:hyperlink w:anchor="_Toc243479472" w:history="1">
         <w:r>
           <w:rPr>
             <w:rStyle w:val="Hyperlink"/>
@@ -1694,7 +1697,7 @@
             <w:noProof/>
             <w:webHidden/>
           </w:rPr>
-          <w:instrText xml:space="preserve"> PAGEREF _Toc242991799 \h </w:instrText>
+          <w:instrText xml:space="preserve"> PAGEREF _Toc243479472 \h </w:instrText>
         </w:r>
         <w:r>
           <w:rPr>
@@ -1742,7 +1745,7 @@
           <w14:ligatures w14:val="standardContextual"/>
         </w:rPr>
       </w:pPr>
-      <w:hyperlink w:anchor="_Toc242991800" w:history="1">
+      <w:hyperlink w:anchor="_Toc243479473" w:history="1">
         <w:r>
           <w:rPr>
             <w:rStyle w:val="Hyperlink"/>
@@ -1769,7 +1772,7 @@
             <w:noProof/>
             <w:webHidden/>
           </w:rPr>
-          <w:instrText xml:space="preserve"> PAGEREF _Toc242991800 \h </w:instrText>
+          <w:instrText xml:space="preserve"> PAGEREF _Toc243479473 \h </w:instrText>
         </w:r>
         <w:r>
           <w:rPr>
@@ -1817,7 +1820,7 @@
           <w14:ligatures w14:val="standardContextual"/>
         </w:rPr>
       </w:pPr>
-      <w:hyperlink w:anchor="_Toc242991801" w:history="1">
+      <w:hyperlink w:anchor="_Toc243479474" w:history="1">
         <w:r>
           <w:rPr>
             <w:rStyle w:val="Hyperlink"/>
@@ -1844,7 +1847,7 @@
             <w:noProof/>
             <w:webHidden/>
           </w:rPr>
-          <w:instrText xml:space="preserve"> PAGEREF _Toc242991801 \h </w:instrText>
+          <w:instrText xml:space="preserve"> PAGEREF _Toc243479474 \h </w:instrText>
         </w:r>
         <w:r>
           <w:rPr>
@@ -1892,7 +1895,7 @@
           <w14:ligatures w14:val="standardContextual"/>
         </w:rPr>
       </w:pPr>
-      <w:hyperlink w:anchor="_Toc242991802" w:history="1">
+      <w:hyperlink w:anchor="_Toc243479475" w:history="1">
         <w:r>
           <w:rPr>
             <w:rStyle w:val="Hyperlink"/>
@@ -1919,7 +1922,7 @@
             <w:noProof/>
             <w:webHidden/>
           </w:rPr>
-          <w:instrText xml:space="preserve"> PAGEREF _Toc242991802 \h </w:instrText>
+          <w:instrText xml:space="preserve"> PAGEREF _Toc243479475 \h </w:instrText>
         </w:r>
         <w:r>
           <w:rPr>
@@ -1967,7 +1970,7 @@
           <w14:ligatures w14:val="standardContextual"/>
         </w:rPr>
       </w:pPr>
-      <w:hyperlink w:anchor="_Toc242991803" w:history="1">
+      <w:hyperlink w:anchor="_Toc243479476" w:history="1">
         <w:r>
           <w:rPr>
             <w:rStyle w:val="Hyperlink"/>
@@ -1994,7 +1997,7 @@
             <w:noProof/>
             <w:webHidden/>
           </w:rPr>
-          <w:instrText xml:space="preserve"> PAGEREF _Toc242991803 \h </w:instrText>
+          <w:instrText xml:space="preserve"> PAGEREF _Toc243479476 \h </w:instrText>
         </w:r>
         <w:r>
           <w:rPr>
@@ -2042,7 +2045,7 @@
           <w14:ligatures w14:val="standardContextual"/>
         </w:rPr>
       </w:pPr>
-      <w:hyperlink w:anchor="_Toc242991804" w:history="1">
+      <w:hyperlink w:anchor="_Toc243479477" w:history="1">
         <w:r>
           <w:rPr>
             <w:rStyle w:val="Hyperlink"/>
@@ -2069,7 +2072,7 @@
             <w:noProof/>
             <w:webHidden/>
           </w:rPr>
-          <w:instrText xml:space="preserve"> PAGEREF _Toc242991804 \h </w:instrText>
+          <w:instrText xml:space="preserve"> PAGEREF _Toc243479477 \h </w:instrText>
         </w:r>
         <w:r>
           <w:rPr>
@@ -2117,7 +2120,7 @@
           <w14:ligatures w14:val="standardContextual"/>
         </w:rPr>
       </w:pPr>
-      <w:hyperlink w:anchor="_Toc242991805" w:history="1">
+      <w:hyperlink w:anchor="_Toc243479478" w:history="1">
         <w:r>
           <w:rPr>
             <w:rStyle w:val="Hyperlink"/>
@@ -2144,7 +2147,7 @@
             <w:noProof/>
             <w:webHidden/>
           </w:rPr>
-          <w:instrText xml:space="preserve"> PAGEREF _Toc242991805 \h </w:instrText>
+          <w:instrText xml:space="preserve"> PAGEREF _Toc243479478 \h </w:instrText>
         </w:r>
         <w:r>
           <w:rPr>
@@ -2192,7 +2195,7 @@
           <w14:ligatures w14:val="standardContextual"/>
         </w:rPr>
       </w:pPr>
-      <w:hyperlink w:anchor="_Toc242991806" w:history="1">
+      <w:hyperlink w:anchor="_Toc243479479" w:history="1">
         <w:r>
           <w:rPr>
             <w:rStyle w:val="Hyperlink"/>
@@ -2219,7 +2222,7 @@
             <w:noProof/>
             <w:webHidden/>
           </w:rPr>
-          <w:instrText xml:space="preserve"> PAGEREF _Toc242991806 \h </w:instrText>
+          <w:instrText xml:space="preserve"> PAGEREF _Toc243479479 \h </w:instrText>
         </w:r>
         <w:r>
           <w:rPr>
@@ -2267,7 +2270,7 @@
           <w14:ligatures w14:val="standardContextual"/>
         </w:rPr>
       </w:pPr>
-      <w:hyperlink w:anchor="_Toc242991807" w:history="1">
+      <w:hyperlink w:anchor="_Toc243479480" w:history="1">
         <w:r>
           <w:rPr>
             <w:rStyle w:val="Hyperlink"/>
@@ -2294,7 +2297,7 @@
             <w:noProof/>
             <w:webHidden/>
           </w:rPr>
-          <w:instrText xml:space="preserve"> PAGEREF _Toc242991807 \h </w:instrText>
+          <w:instrText xml:space="preserve"> PAGEREF _Toc243479480 \h </w:instrText>
         </w:r>
         <w:r>
           <w:rPr>
@@ -2315,6 +2318,81 @@
             <w:webHidden/>
           </w:rPr>
           <w:t>24</w:t>
+        </w:r>
+        <w:r>
+          <w:rPr>
+            <w:noProof/>
+            <w:webHidden/>
+          </w:rPr>
+          <w:fldChar w:fldCharType="end"/>
+        </w:r>
+      </w:hyperlink>
+    </w:p>
+    <w:p>
+      <w:pPr>
+        <w:pStyle w:val="TOC2"/>
+        <w:tabs>
+          <w:tab w:val="right" w:leader="dot" w:pos="9880"/>
+        </w:tabs>
+        <w:rPr>
+          <w:rFonts w:asciiTheme="minorHAnsi" w:hAnsiTheme="minorHAnsi"/>
+          <w:noProof/>
+          <w:color w:val="auto"/>
+          <w:kern w:val="2"/>
+          <w:sz w:val="24"/>
+          <w:szCs w:val="24"/>
+          <w:lang w:val="de-DE" w:eastAsia="de-DE"/>
+          <w14:ligatures w14:val="standardContextual"/>
+        </w:rPr>
+      </w:pPr>
+      <w:hyperlink w:anchor="_Toc243479481" w:history="1">
+        <w:r>
+          <w:rPr>
+            <w:rStyle w:val="Hyperlink"/>
+            <w:noProof/>
+          </w:rPr>
+          <w:t>LightSuite guided atlas registration</w:t>
+        </w:r>
+        <w:r>
+          <w:rPr>
+            <w:noProof/>
+            <w:webHidden/>
+          </w:rPr>
+          <w:tab/>
+        </w:r>
+        <w:r>
+          <w:rPr>
+            <w:noProof/>
+            <w:webHidden/>
+          </w:rPr>
+          <w:fldChar w:fldCharType="begin"/>
+        </w:r>
+        <w:r>
+          <w:rPr>
+            <w:noProof/>
+            <w:webHidden/>
+          </w:rPr>
+          <w:instrText xml:space="preserve"> PAGEREF _Toc243479481 \h </w:instrText>
+        </w:r>
+        <w:r>
+          <w:rPr>
+            <w:noProof/>
+            <w:webHidden/>
+          </w:rPr>
+        </w:r>
+        <w:r>
+          <w:rPr>
+            <w:noProof/>
+            <w:webHidden/>
+          </w:rPr>
+          <w:fldChar w:fldCharType="separate"/>
+        </w:r>
+        <w:r>
+          <w:rPr>
+            <w:noProof/>
+            <w:webHidden/>
+          </w:rPr>
+          <w:t>25</w:t>
         </w:r>
         <w:r>
           <w:rPr>
@@ -2342,7 +2420,7 @@
           <w14:ligatures w14:val="standardContextual"/>
         </w:rPr>
       </w:pPr>
-      <w:hyperlink w:anchor="_Toc242991808" w:history="1">
+      <w:hyperlink w:anchor="_Toc243479482" w:history="1">
         <w:r>
           <w:rPr>
             <w:rStyle w:val="Hyperlink"/>
@@ -2369,7 +2447,7 @@
             <w:noProof/>
             <w:webHidden/>
           </w:rPr>
-          <w:instrText xml:space="preserve"> PAGEREF _Toc242991808 \h </w:instrText>
+          <w:instrText xml:space="preserve"> PAGEREF _Toc243479482 \h </w:instrText>
         </w:r>
         <w:r>
           <w:rPr>
@@ -2389,7 +2467,7 @@
             <w:noProof/>
             <w:webHidden/>
           </w:rPr>
-          <w:t>26</w:t>
+          <w:t>31</w:t>
         </w:r>
         <w:r>
           <w:rPr>
@@ -2417,7 +2495,7 @@
           <w14:ligatures w14:val="standardContextual"/>
         </w:rPr>
       </w:pPr>
-      <w:hyperlink w:anchor="_Toc242991809" w:history="1">
+      <w:hyperlink w:anchor="_Toc243479483" w:history="1">
         <w:r>
           <w:rPr>
             <w:rStyle w:val="Hyperlink"/>
@@ -2444,7 +2522,7 @@
             <w:noProof/>
             <w:webHidden/>
           </w:rPr>
-          <w:instrText xml:space="preserve"> PAGEREF _Toc242991809 \h </w:instrText>
+          <w:instrText xml:space="preserve"> PAGEREF _Toc243479483 \h </w:instrText>
         </w:r>
         <w:r>
           <w:rPr>
@@ -2464,7 +2542,7 @@
             <w:noProof/>
             <w:webHidden/>
           </w:rPr>
-          <w:t>26</w:t>
+          <w:t>31</w:t>
         </w:r>
         <w:r>
           <w:rPr>
@@ -2492,7 +2570,7 @@
           <w14:ligatures w14:val="standardContextual"/>
         </w:rPr>
       </w:pPr>
-      <w:hyperlink w:anchor="_Toc242991810" w:history="1">
+      <w:hyperlink w:anchor="_Toc243479484" w:history="1">
         <w:r>
           <w:rPr>
             <w:rStyle w:val="Hyperlink"/>
@@ -2519,7 +2597,7 @@
             <w:noProof/>
             <w:webHidden/>
           </w:rPr>
-          <w:instrText xml:space="preserve"> PAGEREF _Toc242991810 \h </w:instrText>
+          <w:instrText xml:space="preserve"> PAGEREF _Toc243479484 \h </w:instrText>
         </w:r>
         <w:r>
           <w:rPr>
@@ -2539,7 +2617,7 @@
             <w:noProof/>
             <w:webHidden/>
           </w:rPr>
-          <w:t>27</w:t>
+          <w:t>32</w:t>
         </w:r>
         <w:r>
           <w:rPr>
@@ -2567,7 +2645,7 @@
           <w14:ligatures w14:val="standardContextual"/>
         </w:rPr>
       </w:pPr>
-      <w:hyperlink w:anchor="_Toc242991811" w:history="1">
+      <w:hyperlink w:anchor="_Toc243479485" w:history="1">
         <w:r>
           <w:rPr>
             <w:rStyle w:val="Hyperlink"/>
@@ -2594,7 +2672,7 @@
             <w:noProof/>
             <w:webHidden/>
           </w:rPr>
-          <w:instrText xml:space="preserve"> PAGEREF _Toc242991811 \h </w:instrText>
+          <w:instrText xml:space="preserve"> PAGEREF _Toc243479485 \h </w:instrText>
         </w:r>
         <w:r>
           <w:rPr>
@@ -2614,7 +2692,7 @@
             <w:noProof/>
             <w:webHidden/>
           </w:rPr>
-          <w:t>29</w:t>
+          <w:t>34</w:t>
         </w:r>
         <w:r>
           <w:rPr>
@@ -2642,7 +2720,7 @@
           <w14:ligatures w14:val="standardContextual"/>
         </w:rPr>
       </w:pPr>
-      <w:hyperlink w:anchor="_Toc242991812" w:history="1">
+      <w:hyperlink w:anchor="_Toc243479486" w:history="1">
         <w:r>
           <w:rPr>
             <w:rStyle w:val="Hyperlink"/>
@@ -2669,7 +2747,7 @@
             <w:noProof/>
             <w:webHidden/>
           </w:rPr>
-          <w:instrText xml:space="preserve"> PAGEREF _Toc242991812 \h </w:instrText>
+          <w:instrText xml:space="preserve"> PAGEREF _Toc243479486 \h </w:instrText>
         </w:r>
         <w:r>
           <w:rPr>
@@ -2689,7 +2767,7 @@
             <w:noProof/>
             <w:webHidden/>
           </w:rPr>
-          <w:t>31</w:t>
+          <w:t>36</w:t>
         </w:r>
         <w:r>
           <w:rPr>
@@ -2717,7 +2795,7 @@
           <w14:ligatures w14:val="standardContextual"/>
         </w:rPr>
       </w:pPr>
-      <w:hyperlink w:anchor="_Toc242991813" w:history="1">
+      <w:hyperlink w:anchor="_Toc243479487" w:history="1">
         <w:r>
           <w:rPr>
             <w:rStyle w:val="Hyperlink"/>
@@ -2744,7 +2822,7 @@
             <w:noProof/>
             <w:webHidden/>
           </w:rPr>
-          <w:instrText xml:space="preserve"> PAGEREF _Toc242991813 \h </w:instrText>
+          <w:instrText xml:space="preserve"> PAGEREF _Toc243479487 \h </w:instrText>
         </w:r>
         <w:r>
           <w:rPr>
@@ -2764,7 +2842,7 @@
             <w:noProof/>
             <w:webHidden/>
           </w:rPr>
-          <w:t>31</w:t>
+          <w:t>36</w:t>
         </w:r>
         <w:r>
           <w:rPr>
@@ -2792,7 +2870,7 @@
           <w14:ligatures w14:val="standardContextual"/>
         </w:rPr>
       </w:pPr>
-      <w:hyperlink w:anchor="_Toc242991814" w:history="1">
+      <w:hyperlink w:anchor="_Toc243479488" w:history="1">
         <w:r>
           <w:rPr>
             <w:rStyle w:val="Hyperlink"/>
@@ -2819,7 +2897,7 @@
             <w:noProof/>
             <w:webHidden/>
           </w:rPr>
-          <w:instrText xml:space="preserve"> PAGEREF _Toc242991814 \h </w:instrText>
+          <w:instrText xml:space="preserve"> PAGEREF _Toc243479488 \h </w:instrText>
         </w:r>
         <w:r>
           <w:rPr>
@@ -2839,7 +2917,7 @@
             <w:noProof/>
             <w:webHidden/>
           </w:rPr>
-          <w:t>32</w:t>
+          <w:t>37</w:t>
         </w:r>
         <w:r>
           <w:rPr>
@@ -2867,7 +2945,7 @@
           <w14:ligatures w14:val="standardContextual"/>
         </w:rPr>
       </w:pPr>
-      <w:hyperlink w:anchor="_Toc242991815" w:history="1">
+      <w:hyperlink w:anchor="_Toc243479489" w:history="1">
         <w:r>
           <w:rPr>
             <w:rStyle w:val="Hyperlink"/>
@@ -2894,7 +2972,7 @@
             <w:noProof/>
             <w:webHidden/>
           </w:rPr>
-          <w:instrText xml:space="preserve"> PAGEREF _Toc242991815 \h </w:instrText>
+          <w:instrText xml:space="preserve"> PAGEREF _Toc243479489 \h </w:instrText>
         </w:r>
         <w:r>
           <w:rPr>
@@ -2914,7 +2992,7 @@
             <w:noProof/>
             <w:webHidden/>
           </w:rPr>
-          <w:t>33</w:t>
+          <w:t>38</w:t>
         </w:r>
         <w:r>
           <w:rPr>
@@ -2942,7 +3020,7 @@
           <w14:ligatures w14:val="standardContextual"/>
         </w:rPr>
       </w:pPr>
-      <w:hyperlink w:anchor="_Toc242991816" w:history="1">
+      <w:hyperlink w:anchor="_Toc243479490" w:history="1">
         <w:r>
           <w:rPr>
             <w:rStyle w:val="Hyperlink"/>
@@ -2969,7 +3047,7 @@
             <w:noProof/>
             <w:webHidden/>
           </w:rPr>
-          <w:instrText xml:space="preserve"> PAGEREF _Toc242991816 \h </w:instrText>
+          <w:instrText xml:space="preserve"> PAGEREF _Toc243479490 \h </w:instrText>
         </w:r>
         <w:r>
           <w:rPr>
@@ -2989,7 +3067,7 @@
             <w:noProof/>
             <w:webHidden/>
           </w:rPr>
-          <w:t>33</w:t>
+          <w:t>38</w:t>
         </w:r>
         <w:r>
           <w:rPr>
@@ -3017,7 +3095,7 @@
           <w14:ligatures w14:val="standardContextual"/>
         </w:rPr>
       </w:pPr>
-      <w:hyperlink w:anchor="_Toc242991817" w:history="1">
+      <w:hyperlink w:anchor="_Toc243479491" w:history="1">
         <w:r>
           <w:rPr>
             <w:rStyle w:val="Hyperlink"/>
@@ -3044,7 +3122,7 @@
             <w:noProof/>
             <w:webHidden/>
           </w:rPr>
-          <w:instrText xml:space="preserve"> PAGEREF _Toc242991817 \h </w:instrText>
+          <w:instrText xml:space="preserve"> PAGEREF _Toc243479491 \h </w:instrText>
         </w:r>
         <w:r>
           <w:rPr>
@@ -3064,7 +3142,7 @@
             <w:noProof/>
             <w:webHidden/>
           </w:rPr>
-          <w:t>34</w:t>
+          <w:t>39</w:t>
         </w:r>
         <w:r>
           <w:rPr>
@@ -3092,7 +3170,7 @@
           <w14:ligatures w14:val="standardContextual"/>
         </w:rPr>
       </w:pPr>
-      <w:hyperlink w:anchor="_Toc242991818" w:history="1">
+      <w:hyperlink w:anchor="_Toc243479492" w:history="1">
         <w:r>
           <w:rPr>
             <w:rStyle w:val="Hyperlink"/>
@@ -3119,7 +3197,7 @@
             <w:noProof/>
             <w:webHidden/>
           </w:rPr>
-          <w:instrText xml:space="preserve"> PAGEREF _Toc242991818 \h </w:instrText>
+          <w:instrText xml:space="preserve"> PAGEREF _Toc243479492 \h </w:instrText>
         </w:r>
         <w:r>
           <w:rPr>
@@ -3139,7 +3217,7 @@
             <w:noProof/>
             <w:webHidden/>
           </w:rPr>
-          <w:t>35</w:t>
+          <w:t>40</w:t>
         </w:r>
         <w:r>
           <w:rPr>
@@ -3167,7 +3245,7 @@
           <w14:ligatures w14:val="standardContextual"/>
         </w:rPr>
       </w:pPr>
-      <w:hyperlink w:anchor="_Toc242991819" w:history="1">
+      <w:hyperlink w:anchor="_Toc243479493" w:history="1">
         <w:r>
           <w:rPr>
             <w:rStyle w:val="Hyperlink"/>
@@ -3194,7 +3272,7 @@
             <w:noProof/>
             <w:webHidden/>
           </w:rPr>
-          <w:instrText xml:space="preserve"> PAGEREF _Toc242991819 \h </w:instrText>
+          <w:instrText xml:space="preserve"> PAGEREF _Toc243479493 \h </w:instrText>
         </w:r>
         <w:r>
           <w:rPr>
@@ -3214,7 +3292,7 @@
             <w:noProof/>
             <w:webHidden/>
           </w:rPr>
-          <w:t>35</w:t>
+          <w:t>40</w:t>
         </w:r>
         <w:r>
           <w:rPr>
@@ -3242,7 +3320,7 @@
           <w14:ligatures w14:val="standardContextual"/>
         </w:rPr>
       </w:pPr>
-      <w:hyperlink w:anchor="_Toc242991820" w:history="1">
+      <w:hyperlink w:anchor="_Toc243479494" w:history="1">
         <w:r>
           <w:rPr>
             <w:rStyle w:val="Hyperlink"/>
@@ -3269,7 +3347,7 @@
             <w:noProof/>
             <w:webHidden/>
           </w:rPr>
-          <w:instrText xml:space="preserve"> PAGEREF _Toc242991820 \h </w:instrText>
+          <w:instrText xml:space="preserve"> PAGEREF _Toc243479494 \h </w:instrText>
         </w:r>
         <w:r>
           <w:rPr>
@@ -3289,7 +3367,7 @@
             <w:noProof/>
             <w:webHidden/>
           </w:rPr>
-          <w:t>36</w:t>
+          <w:t>41</w:t>
         </w:r>
         <w:r>
           <w:rPr>
@@ -3351,7 +3429,7 @@
         <w:pStyle w:val="Heading1"/>
         <w:pageBreakBefore/>
       </w:pPr>
-      <w:bookmarkStart w:id="0" w:name="_Toc242991778"/>
+      <w:bookmarkStart w:id="0" w:name="_Toc243479451"/>
       <w:r>
         <w:rPr>
           <w:b w:val="0"/>
@@ -3365,7 +3443,7 @@
       <w:pPr>
         <w:pStyle w:val="Heading2"/>
       </w:pPr>
-      <w:bookmarkStart w:id="1" w:name="_Toc242991779"/>
+      <w:bookmarkStart w:id="1" w:name="_Toc243479452"/>
       <w:r>
         <w:rPr>
           <w:b w:val="0"/>
@@ -3380,7 +3458,10 @@
         <w:ind w:left="317" w:hanging="259"/>
       </w:pPr>
       <w:r>
-        <w:t xml:space="preserve">1. Download the complete repository from </w:t>
+        <w:t xml:space="preserve">1. </w:t>
+      </w:r>
+      <w:r>
+        <w:t xml:space="preserve">Download the complete repository from </w:t>
       </w:r>
       <w:hyperlink r:id="rId8">
         <w:r>
@@ -3401,7 +3482,10 @@
         <w:ind w:left="317" w:hanging="259"/>
       </w:pPr>
       <w:r>
-        <w:t xml:space="preserve">2. Place it on a local drive. Keep the root scripts, </w:t>
+        <w:t xml:space="preserve">2. </w:t>
+      </w:r>
+      <w:r>
+        <w:t xml:space="preserve">Place it on a local drive. Keep the root scripts, </w:t>
       </w:r>
       <w:r>
         <w:rPr>
@@ -3460,7 +3544,10 @@
         <w:ind w:left="317" w:hanging="259"/>
       </w:pPr>
       <w:r>
-        <w:t>3. Start MATLAB. The illustrated reference installation uses MATLAB R2023b on Windows. Functions such as image registration need their corresponding MATLAB toolbox; a missing-function error identifies a dependency to check.</w:t>
+        <w:t xml:space="preserve">3. </w:t>
+      </w:r>
+      <w:r>
+        <w:t>Start MATLAB. The illustrated reference installation uses MATLAB R2023b on Windows. Functions such as image registration need their corresponding MATLAB toolbox; a missing-function error identifies a dependency to check.</w:t>
       </w:r>
     </w:p>
     <w:p>
@@ -3469,7 +3556,10 @@
         <w:ind w:left="317" w:hanging="259"/>
       </w:pPr>
       <w:r>
-        <w:t xml:space="preserve">4. Change MATLAB's current folder to the extracted </w:t>
+        <w:t xml:space="preserve">4. </w:t>
+      </w:r>
+      <w:r>
+        <w:t xml:space="preserve">Change MATLAB's current folder to the extracted </w:t>
       </w:r>
       <w:r>
         <w:rPr>
@@ -3485,6 +3575,9 @@
     <w:p>
       <w:pPr>
         <w:pStyle w:val="CodeBlock"/>
+        <w:rPr>
+          <w:rFonts w:hint="eastAsia"/>
+        </w:rPr>
       </w:pPr>
       <w:r>
         <w:t>deConfUSIon_setup</w:t>
@@ -3513,7 +3606,7 @@
       <w:pPr>
         <w:pStyle w:val="Heading2"/>
       </w:pPr>
-      <w:bookmarkStart w:id="2" w:name="_Toc242991780"/>
+      <w:bookmarkStart w:id="2" w:name="_Toc243479453"/>
       <w:r>
         <w:rPr>
           <w:b w:val="0"/>
@@ -3553,7 +3646,7 @@
         <w:pStyle w:val="Heading1"/>
         <w:pageBreakBefore/>
       </w:pPr>
-      <w:bookmarkStart w:id="3" w:name="_Toc242991781"/>
+      <w:bookmarkStart w:id="3" w:name="_Toc243479454"/>
       <w:r>
         <w:rPr>
           <w:b w:val="0"/>
@@ -3968,12 +4061,18 @@
       <w:pPr>
         <w:pStyle w:val="Heading2"/>
       </w:pPr>
-      <w:bookmarkStart w:id="4" w:name="_Toc242991782"/>
+      <w:bookmarkStart w:id="4" w:name="_Toc243479455"/>
       <w:r>
         <w:rPr>
           <w:b w:val="0"/>
         </w:rPr>
-        <w:t>Keep these records</w:t>
+        <w:t xml:space="preserve">Keep these </w:t>
+      </w:r>
+      <w:r>
+        <w:rPr>
+          <w:b w:val="0"/>
+        </w:rPr>
+        <w:t>records</w:t>
       </w:r>
       <w:bookmarkEnd w:id="4"/>
     </w:p>
@@ -3998,7 +4097,7 @@
       <w:pPr>
         <w:pStyle w:val="Heading1"/>
       </w:pPr>
-      <w:bookmarkStart w:id="5" w:name="_Toc242991783"/>
+      <w:bookmarkStart w:id="5" w:name="_Toc243479456"/>
       <w:r>
         <w:rPr>
           <w:b w:val="0"/>
@@ -4026,7 +4125,7 @@
           <w:noProof/>
         </w:rPr>
         <w:drawing>
-          <wp:inline distT="0" distB="0" distL="0" distR="0" wp14:anchorId="4DE2CABC" wp14:editId="108865BE">
+          <wp:inline distT="0" distB="0" distL="0" distR="0">
             <wp:extent cx="9962147" cy="6309360"/>
             <wp:effectExtent l="0" t="0" r="0" b="0"/>
             <wp:docPr id="2" name="Picture 2" descr="Studio workflow overview"/>
@@ -4081,7 +4180,10 @@
       </w:pPr>
       <w:r>
         <w:lastRenderedPageBreak/>
-        <w:t xml:space="preserve">1. Click </w:t>
+        <w:t xml:space="preserve">1. </w:t>
+      </w:r>
+      <w:r>
+        <w:t xml:space="preserve">Click </w:t>
       </w:r>
       <w:r>
         <w:rPr>
@@ -4099,7 +4201,13 @@
         <w:ind w:left="317" w:hanging="259"/>
       </w:pPr>
       <w:r>
-        <w:t>2. Review the load options. Confirm dimensions, volume/frame count, TR and any warning about irregular timestamps.</w:t>
+        <w:t xml:space="preserve">2. </w:t>
+      </w:r>
+      <w:r>
+        <w:t xml:space="preserve">Review the load options. Confirm dimensions, volume/frame </w:t>
+      </w:r>
+      <w:r>
+        <w:t>count, TR and any warning about irregular timestamps.</w:t>
       </w:r>
     </w:p>
     <w:p>
@@ -4108,7 +4216,10 @@
         <w:ind w:left="317" w:hanging="259"/>
       </w:pPr>
       <w:r>
-        <w:t>3. Confirm the analysis output folder. A local output folder helps separate processing time from server write time.</w:t>
+        <w:t xml:space="preserve">3. </w:t>
+      </w:r>
+      <w:r>
+        <w:t>Confirm the analysis output folder. A local output folder helps separate processing time from server write time.</w:t>
       </w:r>
     </w:p>
     <w:p>
@@ -4117,7 +4228,10 @@
         <w:ind w:left="317" w:hanging="259"/>
       </w:pPr>
       <w:r>
-        <w:t>4. Check the active dataset label before opening a viewer or applying a processing step.</w:t>
+        <w:t xml:space="preserve">4. </w:t>
+      </w:r>
+      <w:r>
+        <w:t>Check the active dataset label before opening a viewer or applying a processing step.</w:t>
       </w:r>
     </w:p>
     <w:p>
@@ -4126,14 +4240,17 @@
         <w:ind w:left="317" w:hanging="259"/>
       </w:pPr>
       <w:r>
-        <w:t>5. Open Time-Course Viewer and inspect early, middle and late frames before correcting anything.</w:t>
+        <w:t xml:space="preserve">5. </w:t>
+      </w:r>
+      <w:r>
+        <w:t>Open Time-Course Viewer and inspect early, middle and late frames before correcting anything.</w:t>
       </w:r>
     </w:p>
     <w:p>
       <w:pPr>
         <w:pStyle w:val="Heading2"/>
       </w:pPr>
-      <w:bookmarkStart w:id="6" w:name="_Toc242991784"/>
+      <w:bookmarkStart w:id="6" w:name="_Toc243479457"/>
       <w:r>
         <w:rPr>
           <w:b w:val="0"/>
@@ -4168,7 +4285,7 @@
         <w:pStyle w:val="Heading1"/>
         <w:pageBreakBefore/>
       </w:pPr>
-      <w:bookmarkStart w:id="7" w:name="_Toc242991785"/>
+      <w:bookmarkStart w:id="7" w:name="_Toc243479458"/>
       <w:r>
         <w:rPr>
           <w:b w:val="0"/>
@@ -4184,7 +4301,10 @@
         <w:ind w:left="317" w:hanging="259"/>
       </w:pPr>
       <w:r>
-        <w:t>1. Load the original 2D movie and confirm a Y by X by time layout.</w:t>
+        <w:t xml:space="preserve">1. </w:t>
+      </w:r>
+      <w:r>
+        <w:t>Load the original 2D movie and confirm a Y by X by time layout.</w:t>
       </w:r>
     </w:p>
     <w:p>
@@ -4193,7 +4313,10 @@
         <w:ind w:left="317" w:hanging="259"/>
       </w:pPr>
       <w:r>
-        <w:t>2. Inspect the raw movie for displacement, jumps, saturation, dropouts and slow drift.</w:t>
+        <w:t xml:space="preserve">2. </w:t>
+      </w:r>
+      <w:r>
+        <w:t>Inspect the raw movie for displacement, jumps, saturation, dropouts and slow drift.</w:t>
       </w:r>
     </w:p>
     <w:p>
@@ -4202,7 +4325,10 @@
         <w:ind w:left="317" w:hanging="259"/>
       </w:pPr>
       <w:r>
-        <w:t>3. Run QC and review the frames that produced warnings.</w:t>
+        <w:t xml:space="preserve">3. </w:t>
+      </w:r>
+      <w:r>
+        <w:t>Run QC and review the frames that produced warnings.</w:t>
       </w:r>
     </w:p>
     <w:p>
@@ -4211,7 +4337,10 @@
         <w:ind w:left="317" w:hanging="259"/>
       </w:pPr>
       <w:r>
-        <w:t>4. Make a separate derived branch for one justified correction. Compare it with the raw recording using the same ROI and time interval.</w:t>
+        <w:t xml:space="preserve">4. </w:t>
+      </w:r>
+      <w:r>
+        <w:t>Make a separate derived branch for one justified correction. Compare it with the raw recording using the same ROI and time interval.</w:t>
       </w:r>
     </w:p>
     <w:p>
@@ -4220,7 +4349,10 @@
         <w:ind w:left="317" w:hanging="259"/>
       </w:pPr>
       <w:r>
-        <w:t>5. Set baseline and signal windows from the event log, then open SCM GUI.</w:t>
+        <w:t xml:space="preserve">5. </w:t>
+      </w:r>
+      <w:r>
+        <w:t>Set baseline and signal windows from the event log, then open SCM GUI.</w:t>
       </w:r>
     </w:p>
     <w:p>
@@ -4229,7 +4361,10 @@
         <w:ind w:left="317" w:hanging="259"/>
       </w:pPr>
       <w:r>
-        <w:t>6. Prepare an inclusion mask and, if anatomical ROIs are required, register the slice to the atlas.</w:t>
+        <w:t xml:space="preserve">6. </w:t>
+      </w:r>
+      <w:r>
+        <w:t>Prepare an inclusion mask and, if anatomical ROIs are required, register the slice to the atlas.</w:t>
       </w:r>
     </w:p>
     <w:p>
@@ -4238,7 +4373,10 @@
         <w:ind w:left="317" w:hanging="259"/>
       </w:pPr>
       <w:r>
-        <w:t>7. Review fixed or automatic ROIs and their traces before exporting.</w:t>
+        <w:t xml:space="preserve">7. </w:t>
+      </w:r>
+      <w:r>
+        <w:t>Review fixed or automatic ROIs and their traces before exporting.</w:t>
       </w:r>
     </w:p>
     <w:p>
@@ -4247,14 +4385,20 @@
         <w:ind w:left="317" w:hanging="259"/>
       </w:pPr>
       <w:r>
-        <w:t>8. Continue to FC or Group Analysis with the matching anatomy, timing and export files.</w:t>
+        <w:t xml:space="preserve">8. </w:t>
+      </w:r>
+      <w:r>
+        <w:t xml:space="preserve">Continue to FC or Group Analysis with the matching anatomy, </w:t>
+      </w:r>
+      <w:r>
+        <w:t>timing and export files.</w:t>
       </w:r>
     </w:p>
     <w:p>
       <w:pPr>
         <w:pStyle w:val="Heading2"/>
       </w:pPr>
-      <w:bookmarkStart w:id="8" w:name="_Toc242991786"/>
+      <w:bookmarkStart w:id="8" w:name="_Toc243479459"/>
       <w:r>
         <w:rPr>
           <w:b w:val="0"/>
@@ -4278,7 +4422,7 @@
         <w:pStyle w:val="Heading1"/>
         <w:pageBreakBefore/>
       </w:pPr>
-      <w:bookmarkStart w:id="9" w:name="_Toc242991787"/>
+      <w:bookmarkStart w:id="9" w:name="_Toc243479460"/>
       <w:r>
         <w:rPr>
           <w:b w:val="0"/>
@@ -4299,7 +4443,10 @@
         <w:ind w:left="317" w:hanging="259"/>
       </w:pPr>
       <w:r>
-        <w:t xml:space="preserve">1. In Studio choose </w:t>
+        <w:t xml:space="preserve">1. </w:t>
+      </w:r>
+      <w:r>
+        <w:t xml:space="preserve">In Studio choose </w:t>
       </w:r>
       <w:r>
         <w:rPr>
@@ -4317,7 +4464,10 @@
         <w:ind w:left="317" w:hanging="259"/>
       </w:pPr>
       <w:r>
-        <w:t>2. Select the continuous-stream or split-file route that matches the acquisition.</w:t>
+        <w:t xml:space="preserve">2. </w:t>
+      </w:r>
+      <w:r>
+        <w:t>Select the continuous-stream or split-file route that matches the acquisition.</w:t>
       </w:r>
     </w:p>
     <w:p>
@@ -4326,7 +4476,10 @@
         <w:ind w:left="317" w:hanging="259"/>
       </w:pPr>
       <w:r>
-        <w:t>3. Enter the source slice count and frame/dwell information from the recording protocol.</w:t>
+        <w:t xml:space="preserve">3. </w:t>
+      </w:r>
+      <w:r>
+        <w:t>Enter the source slice count and frame/dwell information from the recording protocol.</w:t>
       </w:r>
     </w:p>
     <w:p>
@@ -4335,7 +4488,10 @@
         <w:ind w:left="317" w:hanging="259"/>
       </w:pPr>
       <w:r>
-        <w:t>4. Review the reconstructed dimensions and retained time indices.</w:t>
+        <w:t xml:space="preserve">4. </w:t>
+      </w:r>
+      <w:r>
+        <w:t>Review the reconstructed dimensions and retained time indices.</w:t>
       </w:r>
     </w:p>
     <w:p>
@@ -4344,7 +4500,10 @@
         <w:ind w:left="317" w:hanging="259"/>
       </w:pPr>
       <w:r>
-        <w:t>5. Inspect the beginning and end of every reconstructed plane for a plane offset or movement contamination.</w:t>
+        <w:t xml:space="preserve">5. </w:t>
+      </w:r>
+      <w:r>
+        <w:t>Inspect the beginning and end of every reconstructed plane for a plane offset or movement contamination.</w:t>
       </w:r>
     </w:p>
     <w:p>
@@ -4353,14 +4512,17 @@
         <w:ind w:left="317" w:hanging="259"/>
       </w:pPr>
       <w:r>
-        <w:t>6. Save the reconstruction and its metadata before further processing.</w:t>
+        <w:t xml:space="preserve">6. </w:t>
+      </w:r>
+      <w:r>
+        <w:t>Save the reconstruction and its metadata before further processing.</w:t>
       </w:r>
     </w:p>
     <w:p>
       <w:pPr>
         <w:pStyle w:val="Heading2"/>
       </w:pPr>
-      <w:bookmarkStart w:id="10" w:name="_Toc242991788"/>
+      <w:bookmarkStart w:id="10" w:name="_Toc243479461"/>
       <w:r>
         <w:rPr>
           <w:b w:val="0"/>
@@ -4384,7 +4546,7 @@
         <w:pStyle w:val="Heading1"/>
         <w:pageBreakBefore/>
       </w:pPr>
-      <w:bookmarkStart w:id="11" w:name="_Toc242991789"/>
+      <w:bookmarkStart w:id="11" w:name="_Toc243479462"/>
       <w:r>
         <w:rPr>
           <w:b w:val="0"/>
@@ -4400,7 +4562,10 @@
         <w:ind w:left="317" w:hanging="259"/>
       </w:pPr>
       <w:r>
-        <w:t>1. Load the matrix-probe movie and confirm Y, X, Z and time.</w:t>
+        <w:t xml:space="preserve">1. </w:t>
+      </w:r>
+      <w:r>
+        <w:t>Load the matrix-probe movie and confirm Y, X, Z and time.</w:t>
       </w:r>
     </w:p>
     <w:p>
@@ -4409,7 +4574,10 @@
         <w:ind w:left="317" w:hanging="259"/>
       </w:pPr>
       <w:r>
-        <w:t>2. Check physical spacing, axis permutation and displayed laterality against acquisition records.</w:t>
+        <w:t xml:space="preserve">2. </w:t>
+      </w:r>
+      <w:r>
+        <w:t>Check physical spacing, axis permutation and displayed laterality against acquisition records.</w:t>
       </w:r>
     </w:p>
     <w:p>
@@ -4418,7 +4586,10 @@
         <w:ind w:left="317" w:hanging="259"/>
       </w:pPr>
       <w:r>
-        <w:t>3. Inspect several nonempty planes at early, middle and late times. Empty boundary planes may reflect missing acquired coverage.</w:t>
+        <w:t xml:space="preserve">3. </w:t>
+      </w:r>
+      <w:r>
+        <w:t>Inspect several nonempty planes at early, middle and late times. Empty boundary planes may reflect missing acquired coverage.</w:t>
       </w:r>
     </w:p>
     <w:p>
@@ -4427,7 +4598,10 @@
         <w:ind w:left="317" w:hanging="259"/>
       </w:pPr>
       <w:r>
-        <w:t>4. Run QC. Review component spatial patterns and time courses before selecting PCA/ICA removal.</w:t>
+        <w:t xml:space="preserve">4. </w:t>
+      </w:r>
+      <w:r>
+        <w:t>Run QC. Review component spatial patterns and time courses before selecting PCA/ICA removal.</w:t>
       </w:r>
     </w:p>
     <w:p>
@@ -4436,7 +4610,13 @@
         <w:ind w:left="317" w:hanging="259"/>
       </w:pPr>
       <w:r>
-        <w:t>5. Compare the corrected mean anatomy and raw time course with the input.</w:t>
+        <w:t xml:space="preserve">5. </w:t>
+      </w:r>
+      <w:r>
+        <w:t xml:space="preserve">Compare the corrected mean </w:t>
+      </w:r>
+      <w:r>
+        <w:t>anatomy and raw time course with the input.</w:t>
       </w:r>
     </w:p>
     <w:p>
@@ -4445,7 +4625,10 @@
         <w:ind w:left="317" w:hanging="259"/>
       </w:pPr>
       <w:r>
-        <w:t>6. If using Imregdemons, choose the dimensional mode that matches the data; true 3D requires consistent geometry.</w:t>
+        <w:t xml:space="preserve">6. </w:t>
+      </w:r>
+      <w:r>
+        <w:t>If using Imregdemons, choose the dimensional mode that matches the data; true 3D requires consistent geometry.</w:t>
       </w:r>
     </w:p>
     <w:p>
@@ -4454,7 +4637,10 @@
         <w:ind w:left="317" w:hanging="259"/>
       </w:pPr>
       <w:r>
-        <w:t>7. Recheck TR after temporal reduction, then choose valid filters and event windows.</w:t>
+        <w:t xml:space="preserve">7. </w:t>
+      </w:r>
+      <w:r>
+        <w:t>Recheck TR after temporal reduction, then choose valid filters and event windows.</w:t>
       </w:r>
     </w:p>
     <w:p>
@@ -4463,14 +4649,17 @@
         <w:ind w:left="317" w:hanging="259"/>
       </w:pPr>
       <w:r>
-        <w:t>8. Register the atlas and inspect multiple anatomical cuts before extracting labels or FC.</w:t>
+        <w:t xml:space="preserve">8. </w:t>
+      </w:r>
+      <w:r>
+        <w:t>Register the atlas and inspect multiple anatomical cuts before extracting labels or FC.</w:t>
       </w:r>
     </w:p>
     <w:p>
       <w:pPr>
         <w:pStyle w:val="Heading2"/>
       </w:pPr>
-      <w:bookmarkStart w:id="12" w:name="_Toc242991790"/>
+      <w:bookmarkStart w:id="12" w:name="_Toc243479463"/>
       <w:r>
         <w:rPr>
           <w:b w:val="0"/>
@@ -4500,7 +4689,7 @@
         <w:pStyle w:val="Heading1"/>
         <w:pageBreakBefore/>
       </w:pPr>
-      <w:bookmarkStart w:id="13" w:name="_Toc242991791"/>
+      <w:bookmarkStart w:id="13" w:name="_Toc243479464"/>
       <w:r>
         <w:rPr>
           <w:b w:val="0"/>
@@ -4528,7 +4717,7 @@
           <w:noProof/>
         </w:rPr>
         <w:drawing>
-          <wp:inline distT="0" distB="0" distL="0" distR="0" wp14:anchorId="5BB3DC86" wp14:editId="1E1FEADB">
+          <wp:inline distT="0" distB="0" distL="0" distR="0">
             <wp:extent cx="3429000" cy="2286000"/>
             <wp:effectExtent l="0" t="0" r="0" b="0"/>
             <wp:docPr id="4" name="Picture 4" descr="Frame rejection quality control"/>
@@ -4845,7 +5034,10 @@
               <w:jc w:val="left"/>
             </w:pPr>
             <w:r>
-              <w:t>Local traces and affected frames</w:t>
+              <w:t xml:space="preserve">Local </w:t>
+            </w:r>
+            <w:r>
+              <w:t>traces and affected frames</w:t>
             </w:r>
           </w:p>
         </w:tc>
@@ -5156,7 +5348,10 @@
     </w:p>
     <w:p>
       <w:r>
-        <w:t>QC thresholds are screening rules. A flagged frame is not automatically invalid, and a smooth-looking trace is not automatically physiological. Save QC outputs and record accepted exclusions or corrections.</w:t>
+        <w:t xml:space="preserve">QC thresholds are screening rules. A flagged frame is not automatically invalid, and a smooth-looking trace is not </w:t>
+      </w:r>
+      <w:r>
+        <w:t>automatically physiological. Save QC outputs and record accepted exclusions or corrections.</w:t>
       </w:r>
     </w:p>
     <w:p>
@@ -5164,7 +5359,7 @@
         <w:pStyle w:val="Heading1"/>
         <w:pageBreakBefore/>
       </w:pPr>
-      <w:bookmarkStart w:id="14" w:name="_Toc242991792"/>
+      <w:bookmarkStart w:id="14" w:name="_Toc243479465"/>
       <w:r>
         <w:rPr>
           <w:b w:val="0"/>
@@ -5180,7 +5375,10 @@
         <w:ind w:left="317" w:hanging="259"/>
       </w:pPr>
       <w:r>
-        <w:t>1. Open the frame-rejection/QC view for the selected dataset.</w:t>
+        <w:t xml:space="preserve">1. </w:t>
+      </w:r>
+      <w:r>
+        <w:t>Open the frame-rejection/QC view for the selected dataset.</w:t>
       </w:r>
     </w:p>
     <w:p>
@@ -5189,7 +5387,10 @@
         <w:ind w:left="317" w:hanging="259"/>
       </w:pPr>
       <w:r>
-        <w:t>2. Review the threshold, flagged indices and the original movie around each event.</w:t>
+        <w:t xml:space="preserve">2. </w:t>
+      </w:r>
+      <w:r>
+        <w:t>Review the threshold, flagged indices and the original movie around each event.</w:t>
       </w:r>
     </w:p>
     <w:p>
@@ -5198,7 +5399,10 @@
         <w:ind w:left="317" w:hanging="259"/>
       </w:pPr>
       <w:r>
-        <w:t>3. Decide which events are artifacts using acquisition and experimental evidence.</w:t>
+        <w:t xml:space="preserve">3. </w:t>
+      </w:r>
+      <w:r>
+        <w:t>Decide which events are artifacts using acquisition and experimental evidence.</w:t>
       </w:r>
     </w:p>
     <w:p>
@@ -5207,7 +5411,10 @@
         <w:ind w:left="317" w:hanging="259"/>
       </w:pPr>
       <w:r>
-        <w:t>4. Apply the chosen correction to a derived dataset and save its record.</w:t>
+        <w:t xml:space="preserve">4. </w:t>
+      </w:r>
+      <w:r>
+        <w:t>Apply the chosen correction to a derived dataset and save its record.</w:t>
       </w:r>
     </w:p>
     <w:p>
@@ -5216,7 +5423,10 @@
         <w:ind w:left="317" w:hanging="259"/>
       </w:pPr>
       <w:r>
-        <w:t>5. Compare original and corrected traces, including the time around each gap.</w:t>
+        <w:t xml:space="preserve">5. </w:t>
+      </w:r>
+      <w:r>
+        <w:t>Compare original and corrected traces, including the time around each gap.</w:t>
       </w:r>
     </w:p>
     <w:p>
@@ -5234,13 +5444,19 @@
         <w:pStyle w:val="Heading1"/>
         <w:pageBreakBefore/>
       </w:pPr>
-      <w:bookmarkStart w:id="15" w:name="_Toc242991793"/>
+      <w:bookmarkStart w:id="15" w:name="_Toc243479466"/>
       <w:r>
         <w:rPr>
           <w:b w:val="0"/>
         </w:rPr>
         <w:lastRenderedPageBreak/>
-        <w:t>9 Choose preprocessing deliberately</w:t>
+        <w:t xml:space="preserve">9 </w:t>
+      </w:r>
+      <w:r>
+        <w:rPr>
+          <w:b w:val="0"/>
+        </w:rPr>
+        <w:t>Choose preprocessing deliberately</w:t>
       </w:r>
       <w:bookmarkEnd w:id="15"/>
     </w:p>
@@ -5511,7 +5727,10 @@
               <w:jc w:val="left"/>
             </w:pPr>
             <w:r>
-              <w:t>Reduce noise or very long movies</w:t>
+              <w:t xml:space="preserve">Reduce </w:t>
+            </w:r>
+            <w:r>
+              <w:t>noise or very long movies</w:t>
             </w:r>
           </w:p>
         </w:tc>
@@ -5961,7 +6180,10 @@
               <w:jc w:val="left"/>
             </w:pPr>
             <w:r>
-              <w:t>Model identified confounds or experimental predictors</w:t>
+              <w:t xml:space="preserve">Model identified confounds or </w:t>
+            </w:r>
+            <w:r>
+              <w:t>experimental predictors</w:t>
             </w:r>
           </w:p>
         </w:tc>
@@ -6009,12 +6231,18 @@
       <w:pPr>
         <w:pStyle w:val="Heading2"/>
       </w:pPr>
-      <w:bookmarkStart w:id="16" w:name="_Toc242991794"/>
+      <w:bookmarkStart w:id="16" w:name="_Toc243479467"/>
       <w:r>
         <w:rPr>
           <w:b w:val="0"/>
         </w:rPr>
-        <w:t>Chop and temporal reduction</w:t>
+        <w:t xml:space="preserve">Chop and temporal </w:t>
+      </w:r>
+      <w:r>
+        <w:rPr>
+          <w:b w:val="0"/>
+        </w:rPr>
+        <w:t>reduction</w:t>
       </w:r>
       <w:bookmarkEnd w:id="16"/>
     </w:p>
@@ -6027,7 +6255,7 @@
       <w:pPr>
         <w:pStyle w:val="Heading2"/>
       </w:pPr>
-      <w:bookmarkStart w:id="17" w:name="_Toc242991795"/>
+      <w:bookmarkStart w:id="17" w:name="_Toc243479468"/>
       <w:r>
         <w:rPr>
           <w:b w:val="0"/>
@@ -6046,7 +6274,7 @@
       <w:pPr>
         <w:pStyle w:val="Heading2"/>
       </w:pPr>
-      <w:bookmarkStart w:id="18" w:name="_Toc242991796"/>
+      <w:bookmarkStart w:id="18" w:name="_Toc243479469"/>
       <w:r>
         <w:rPr>
           <w:b w:val="0"/>
@@ -6076,7 +6304,7 @@
       <w:pPr>
         <w:pStyle w:val="Heading1"/>
       </w:pPr>
-      <w:bookmarkStart w:id="19" w:name="_Toc242991797"/>
+      <w:bookmarkStart w:id="19" w:name="_Toc243479470"/>
       <w:r>
         <w:rPr>
           <w:b w:val="0"/>
@@ -6104,7 +6332,7 @@
           <w:noProof/>
         </w:rPr>
         <w:drawing>
-          <wp:inline distT="0" distB="0" distL="0" distR="0" wp14:anchorId="498195CC" wp14:editId="0B5C7C78">
+          <wp:inline distT="0" distB="0" distL="0" distR="0">
             <wp:extent cx="9464040" cy="6309360"/>
             <wp:effectExtent l="0" t="0" r="0" b="0"/>
             <wp:docPr id="6" name="Picture 6" descr="PCA component review"/>
@@ -6164,7 +6392,10 @@
         <w:ind w:left="317" w:hanging="259"/>
       </w:pPr>
       <w:r>
-        <w:t>1. Confirm the spatial scope and estimation method in the component GUI.</w:t>
+        <w:t xml:space="preserve">1. </w:t>
+      </w:r>
+      <w:r>
+        <w:t>Confirm the spatial scope and estimation method in the component GUI.</w:t>
       </w:r>
     </w:p>
     <w:p>
@@ -6173,7 +6404,10 @@
         <w:ind w:left="317" w:hanging="259"/>
       </w:pPr>
       <w:r>
-        <w:t>2. Inspect the component time course and available spatial information.</w:t>
+        <w:t xml:space="preserve">2. </w:t>
+      </w:r>
+      <w:r>
+        <w:t>Inspect the component time course and available spatial information.</w:t>
       </w:r>
     </w:p>
     <w:p>
@@ -6182,7 +6416,10 @@
         <w:ind w:left="317" w:hanging="259"/>
       </w:pPr>
       <w:r>
-        <w:t>3. Compare timing with motion, acquisition events, physiology and stimulation.</w:t>
+        <w:t xml:space="preserve">3. </w:t>
+      </w:r>
+      <w:r>
+        <w:t>Compare timing with motion, acquisition events, physiology and stimulation.</w:t>
       </w:r>
     </w:p>
     <w:p>
@@ -6191,7 +6428,10 @@
         <w:ind w:left="317" w:hanging="259"/>
       </w:pPr>
       <w:r>
-        <w:t>4. Select only components supported by a clear rationale, then apply removal.</w:t>
+        <w:t xml:space="preserve">4. </w:t>
+      </w:r>
+      <w:r>
+        <w:t>Select only components supported by a clear rationale, then apply removal.</w:t>
       </w:r>
     </w:p>
     <w:p>
@@ -6200,7 +6440,10 @@
         <w:ind w:left="317" w:hanging="259"/>
       </w:pPr>
       <w:r>
-        <w:t>5. Let computation and saving finish. Compare the derived mean image, representative raw traces and the expected response with the original.</w:t>
+        <w:t xml:space="preserve">5. </w:t>
+      </w:r>
+      <w:r>
+        <w:t>Let computation and saving finish. Compare the derived mean image, representative raw traces and the expected response with the original.</w:t>
       </w:r>
     </w:p>
     <w:p>
@@ -6212,7 +6455,7 @@
       <w:pPr>
         <w:pStyle w:val="Heading2"/>
       </w:pPr>
-      <w:bookmarkStart w:id="20" w:name="_Toc242991798"/>
+      <w:bookmarkStart w:id="20" w:name="_Toc243479471"/>
       <w:r>
         <w:rPr>
           <w:b w:val="0"/>
@@ -6231,7 +6474,7 @@
         <w:pStyle w:val="Heading1"/>
         <w:pageBreakBefore/>
       </w:pPr>
-      <w:bookmarkStart w:id="21" w:name="_Toc242991799"/>
+      <w:bookmarkStart w:id="21" w:name="_Toc243479472"/>
       <w:r>
         <w:rPr>
           <w:b w:val="0"/>
@@ -6453,7 +6696,10 @@
               <w:jc w:val="left"/>
             </w:pPr>
             <w:r>
-              <w:t>Minutes within each selected scan</w:t>
+              <w:t xml:space="preserve">Minutes </w:t>
+            </w:r>
+            <w:r>
+              <w:t>within each selected scan</w:t>
             </w:r>
           </w:p>
         </w:tc>
@@ -6590,7 +6836,10 @@
     </w:p>
     <w:p>
       <w:r>
-        <w:t>Review the active baseline source when using another scan or shared baseline. The reference changes amplitudes; it does not align anatomy or make sequential recordings simultaneous. Keep external baseline files and exported shared-baseline sidecars with the analysis.</w:t>
+        <w:t xml:space="preserve">Review the active baseline source when using another scan or shared baseline. The reference changes </w:t>
+      </w:r>
+      <w:r>
+        <w:t>amplitudes; it does not align anatomy or make sequential recordings simultaneous. Keep external baseline files and exported shared-baseline sidecars with the analysis.</w:t>
       </w:r>
     </w:p>
     <w:p>
@@ -6609,7 +6858,7 @@
       <w:pPr>
         <w:pStyle w:val="Heading1"/>
       </w:pPr>
-      <w:bookmarkStart w:id="22" w:name="_Toc242991800"/>
+      <w:bookmarkStart w:id="22" w:name="_Toc243479473"/>
       <w:r>
         <w:rPr>
           <w:b w:val="0"/>
@@ -6637,7 +6886,7 @@
           <w:noProof/>
         </w:rPr>
         <w:drawing>
-          <wp:inline distT="0" distB="0" distL="0" distR="0" wp14:anchorId="761FB466" wp14:editId="39589EB9">
+          <wp:inline distT="0" distB="0" distL="0" distR="0">
             <wp:extent cx="9464040" cy="6309360"/>
             <wp:effectExtent l="0" t="0" r="0" b="0"/>
             <wp:docPr id="9" name="Picture 9" descr="SCM ROI and time course"/>
@@ -6692,7 +6941,10 @@
       </w:pPr>
       <w:r>
         <w:lastRenderedPageBreak/>
-        <w:t xml:space="preserve">1. Open </w:t>
+        <w:t xml:space="preserve">1. </w:t>
+      </w:r>
+      <w:r>
+        <w:t xml:space="preserve">Open </w:t>
       </w:r>
       <w:r>
         <w:rPr>
@@ -6710,7 +6962,10 @@
         <w:ind w:left="317" w:hanging="259"/>
       </w:pPr>
       <w:r>
-        <w:t>2. Confirm the displayed slice, baseline and signal windows.</w:t>
+        <w:t xml:space="preserve">2. </w:t>
+      </w:r>
+      <w:r>
+        <w:t>Confirm the displayed slice, baseline and signal windows.</w:t>
       </w:r>
     </w:p>
     <w:p>
@@ -6719,7 +6974,10 @@
         <w:ind w:left="317" w:hanging="259"/>
       </w:pPr>
       <w:r>
-        <w:t>3. Set the sign policy and a sensible percentage color range. Lower overlay opacity when anatomy is hidden.</w:t>
+        <w:t xml:space="preserve">3. </w:t>
+      </w:r>
+      <w:r>
+        <w:t>Set the sign policy and a sensible percentage color range. Lower overlay opacity when anatomy is hidden.</w:t>
       </w:r>
     </w:p>
     <w:p>
@@ -6728,7 +6986,10 @@
         <w:ind w:left="317" w:hanging="259"/>
       </w:pPr>
       <w:r>
-        <w:t xml:space="preserve">4. Enter the ROI size and center, then use </w:t>
+        <w:t xml:space="preserve">4. </w:t>
+      </w:r>
+      <w:r>
+        <w:t xml:space="preserve">Enter the ROI size and center, then use </w:t>
       </w:r>
       <w:r>
         <w:rPr>
@@ -6746,7 +7007,10 @@
         <w:ind w:left="317" w:hanging="259"/>
       </w:pPr>
       <w:r>
-        <w:t>5. Inspect its outline and populated time course, including baseline and signal bands.</w:t>
+        <w:t xml:space="preserve">5. </w:t>
+      </w:r>
+      <w:r>
+        <w:t>Inspect its outline and populated time course, including baseline and signal bands.</w:t>
       </w:r>
     </w:p>
     <w:p>
@@ -6755,7 +7019,10 @@
         <w:ind w:left="317" w:hanging="259"/>
       </w:pPr>
       <w:r>
-        <w:t>6. Save or export the intended ROI trace and its settings.</w:t>
+        <w:t xml:space="preserve">6. </w:t>
+      </w:r>
+      <w:r>
+        <w:t>Save or export the intended ROI trace and its settings.</w:t>
       </w:r>
     </w:p>
     <w:p>
@@ -6767,7 +7034,7 @@
       <w:pPr>
         <w:pStyle w:val="Heading2"/>
       </w:pPr>
-      <w:bookmarkStart w:id="23" w:name="_Toc242991801"/>
+      <w:bookmarkStart w:id="23" w:name="_Toc243479474"/>
       <w:r>
         <w:rPr>
           <w:b w:val="0"/>
@@ -6824,7 +7091,7 @@
       <w:pPr>
         <w:pStyle w:val="Heading1"/>
       </w:pPr>
-      <w:bookmarkStart w:id="24" w:name="_Toc242991802"/>
+      <w:bookmarkStart w:id="24" w:name="_Toc243479475"/>
       <w:r>
         <w:rPr>
           <w:b w:val="0"/>
@@ -6839,7 +7106,10 @@
         <w:pStyle w:val="FigureCaption"/>
       </w:pPr>
       <w:r>
-        <w:t>Figure 5. Target and Control painting</w:t>
+        <w:t xml:space="preserve">Figure 5. Target </w:t>
+      </w:r>
+      <w:r>
+        <w:t>and Control painting</w:t>
       </w:r>
     </w:p>
     <w:p>
@@ -6852,7 +7122,7 @@
           <w:noProof/>
         </w:rPr>
         <w:drawing>
-          <wp:inline distT="0" distB="0" distL="0" distR="0" wp14:anchorId="17CDE7D1" wp14:editId="5142F0C7">
+          <wp:inline distT="0" distB="0" distL="0" distR="0">
             <wp:extent cx="9464040" cy="6309360"/>
             <wp:effectExtent l="0" t="0" r="0" b="0"/>
             <wp:docPr id="12" name="Picture 12" descr="Target and Control painting"/>
@@ -6907,7 +7177,10 @@
       </w:pPr>
       <w:r>
         <w:lastRenderedPageBreak/>
-        <w:t xml:space="preserve">1. Open </w:t>
+        <w:t xml:space="preserve">1. </w:t>
+      </w:r>
+      <w:r>
+        <w:t xml:space="preserve">Open </w:t>
       </w:r>
       <w:r>
         <w:rPr>
@@ -6934,7 +7207,13 @@
         <w:ind w:left="317" w:hanging="259"/>
       </w:pPr>
       <w:r>
-        <w:t>2. Choose square pixels, physical X/Y size or whole atlas region. Whole-region mode requires named atlas labels.</w:t>
+        <w:t xml:space="preserve">2. </w:t>
+      </w:r>
+      <w:r>
+        <w:t xml:space="preserve">Choose square pixels, physical X/Y </w:t>
+      </w:r>
+      <w:r>
+        <w:t>size or whole atlas region. Whole-region mode requires named atlas labels.</w:t>
       </w:r>
     </w:p>
     <w:p>
@@ -6943,7 +7222,10 @@
         <w:ind w:left="317" w:hanging="259"/>
       </w:pPr>
       <w:r>
-        <w:t>3. Enter search start/end and plateau duration in minutes per scan. A duration of zero uses the whole interval; a positive duration searches complete windows within it.</w:t>
+        <w:t xml:space="preserve">3. </w:t>
+      </w:r>
+      <w:r>
+        <w:t>Enter search start/end and plateau duration in minutes per scan. A duration of zero uses the whole interval; a positive duration searches complete windows within it.</w:t>
       </w:r>
     </w:p>
     <w:p>
@@ -6952,7 +7234,10 @@
         <w:ind w:left="317" w:hanging="259"/>
       </w:pPr>
       <w:r>
-        <w:t>4. Choose Target, Control or both, and confirm image-side assignment and the split column.</w:t>
+        <w:t xml:space="preserve">4. </w:t>
+      </w:r>
+      <w:r>
+        <w:t>Choose Target, Control or both, and confirm image-side assignment and the split column.</w:t>
       </w:r>
     </w:p>
     <w:p>
@@ -6961,7 +7246,10 @@
         <w:ind w:left="317" w:hanging="259"/>
       </w:pPr>
       <w:r>
-        <w:t>5. Choose atlas region(s), coverage, rectangle and slice range as required.</w:t>
+        <w:t xml:space="preserve">5. </w:t>
+      </w:r>
+      <w:r>
+        <w:t>Choose atlas region(s), coverage, rectangle and slice range as required.</w:t>
       </w:r>
     </w:p>
     <w:p>
@@ -6970,7 +7258,10 @@
         <w:ind w:left="317" w:hanging="259"/>
       </w:pPr>
       <w:r>
-        <w:t xml:space="preserve">6. Paint the intended restriction, review it, then click </w:t>
+        <w:t xml:space="preserve">6. </w:t>
+      </w:r>
+      <w:r>
+        <w:t xml:space="preserve">Paint the intended restriction, review it, then click </w:t>
       </w:r>
       <w:r>
         <w:rPr>
@@ -6986,7 +7277,7 @@
       <w:pPr>
         <w:pStyle w:val="Heading2"/>
       </w:pPr>
-      <w:bookmarkStart w:id="25" w:name="_Toc242991803"/>
+      <w:bookmarkStart w:id="25" w:name="_Toc243479476"/>
       <w:r>
         <w:rPr>
           <w:b w:val="0"/>
@@ -7027,7 +7318,7 @@
       <w:pPr>
         <w:pStyle w:val="Heading2"/>
       </w:pPr>
-      <w:bookmarkStart w:id="26" w:name="_Toc242991804"/>
+      <w:bookmarkStart w:id="26" w:name="_Toc243479477"/>
       <w:r>
         <w:rPr>
           <w:b w:val="0"/>
@@ -7046,7 +7337,7 @@
         <w:pStyle w:val="Heading1"/>
         <w:pageBreakBefore/>
       </w:pPr>
-      <w:bookmarkStart w:id="27" w:name="_Toc242991805"/>
+      <w:bookmarkStart w:id="27" w:name="_Toc243479478"/>
       <w:r>
         <w:rPr>
           <w:b w:val="0"/>
@@ -7060,7 +7351,7 @@
       <w:pPr>
         <w:pStyle w:val="Heading2"/>
       </w:pPr>
-      <w:bookmarkStart w:id="28" w:name="_Toc242991806"/>
+      <w:bookmarkStart w:id="28" w:name="_Toc243479479"/>
       <w:r>
         <w:rPr>
           <w:b w:val="0"/>
@@ -7090,7 +7381,7 @@
       <w:pPr>
         <w:pStyle w:val="Heading2"/>
       </w:pPr>
-      <w:bookmarkStart w:id="29" w:name="_Toc242991807"/>
+      <w:bookmarkStart w:id="29" w:name="_Toc243479480"/>
       <w:r>
         <w:rPr>
           <w:b w:val="0"/>
@@ -7118,7 +7409,7 @@
           <w:noProof/>
         </w:rPr>
         <w:drawing>
-          <wp:inline distT="0" distB="0" distL="0" distR="0" wp14:anchorId="101BD072" wp14:editId="16186A33">
+          <wp:inline distT="0" distB="0" distL="0" distR="0">
             <wp:extent cx="9464040" cy="6309360"/>
             <wp:effectExtent l="0" t="0" r="0" b="0"/>
             <wp:docPr id="15" name="Picture 15" descr="Coronal registration controls"/>
@@ -7173,7 +7464,10 @@
       </w:pPr>
       <w:r>
         <w:lastRenderedPageBreak/>
-        <w:t>1. Open the 2D coronal registration route for the chosen source slice.</w:t>
+        <w:t xml:space="preserve">1. </w:t>
+      </w:r>
+      <w:r>
+        <w:t>Open the 2D coronal registration route for the chosen source slice.</w:t>
       </w:r>
     </w:p>
     <w:p>
@@ -7182,7 +7476,10 @@
         <w:ind w:left="317" w:hanging="259"/>
       </w:pPr>
       <w:r>
-        <w:t>2. Confirm displayed orientation and laterality from acquisition records.</w:t>
+        <w:t xml:space="preserve">2. </w:t>
+      </w:r>
+      <w:r>
+        <w:t>Confirm displayed orientation and laterality from acquisition records.</w:t>
       </w:r>
     </w:p>
     <w:p>
@@ -7191,7 +7488,13 @@
         <w:ind w:left="317" w:hanging="259"/>
       </w:pPr>
       <w:r>
-        <w:t>3. Select the matching atlas plane and adjust alignment using several landmarks.</w:t>
+        <w:t xml:space="preserve">3. </w:t>
+      </w:r>
+      <w:r>
+        <w:t xml:space="preserve">Select the </w:t>
+      </w:r>
+      <w:r>
+        <w:t>matching atlas plane and adjust alignment using several landmarks.</w:t>
       </w:r>
     </w:p>
     <w:p>
@@ -7200,7 +7503,10 @@
         <w:ind w:left="317" w:hanging="259"/>
       </w:pPr>
       <w:r>
-        <w:t>4. Inspect boundaries and vascular/anatomical correspondence across the field.</w:t>
+        <w:t xml:space="preserve">4. </w:t>
+      </w:r>
+      <w:r>
+        <w:t>Inspect boundaries and vascular/anatomical correspondence across the field.</w:t>
       </w:r>
     </w:p>
     <w:p>
@@ -7209,7 +7515,10 @@
         <w:ind w:left="317" w:hanging="259"/>
       </w:pPr>
       <w:r>
-        <w:t>5. Save explicitly. Keep the dated Slice folder, transform and underlay files together.</w:t>
+        <w:t xml:space="preserve">5. </w:t>
+      </w:r>
+      <w:r>
+        <w:t>Save explicitly. Keep the dated Slice folder, transform and underlay files together.</w:t>
       </w:r>
     </w:p>
     <w:p>
@@ -7218,7 +7527,10 @@
         <w:ind w:left="317" w:hanging="259"/>
       </w:pPr>
       <w:r>
-        <w:t xml:space="preserve">6. Reopen that package with </w:t>
+        <w:t xml:space="preserve">6. </w:t>
+      </w:r>
+      <w:r>
+        <w:t xml:space="preserve">Reopen that package with </w:t>
       </w:r>
       <w:r>
         <w:rPr>
@@ -7237,35 +7549,38 @@
     </w:p>
     <w:p>
       <w:pPr>
-        <w:pStyle w:val="Heading1"/>
-        <w:pageBreakBefore/>
-      </w:pPr>
-      <w:bookmarkStart w:id="30" w:name="_Toc242991808"/>
+        <w:pStyle w:val="Heading2"/>
+      </w:pPr>
+      <w:bookmarkStart w:id="30" w:name="b_lightsuite_guide"/>
+      <w:bookmarkStart w:id="31" w:name="_Toc243479481"/>
+      <w:bookmarkEnd w:id="30"/>
       <w:r>
         <w:rPr>
           <w:b w:val="0"/>
         </w:rPr>
-        <w:lastRenderedPageBreak/>
-        <w:t>15 Inspect movies and the 3D model</w:t>
-      </w:r>
-      <w:bookmarkEnd w:id="30"/>
-    </w:p>
-    <w:p>
-      <w:pPr>
-        <w:pStyle w:val="Heading2"/>
-      </w:pPr>
-      <w:bookmarkStart w:id="31" w:name="_Toc242991809"/>
+        <w:t>LightSuite guided atlas registration</w:t>
+      </w:r>
+      <w:bookmarkEnd w:id="31"/>
+    </w:p>
+    <w:p>
+      <w:r>
+        <w:t>Open Registration to Atlas &gt; LightSuite (beta), or run deConfUSIon_LightSuite. This optional route registers volumetric Doppler anatomy to a vascular reference. Check dependencies, the animal and scan, and measured voxel spacing in millimetres before starting.</w:t>
+      </w:r>
+    </w:p>
+    <w:p>
+      <w:pPr>
+        <w:pStyle w:val="Heading3"/>
+      </w:pPr>
       <w:r>
         <w:rPr>
           <w:b w:val="0"/>
         </w:rPr>
-        <w:t>Time Course Viewer and Video GUI</w:t>
-      </w:r>
-      <w:bookmarkEnd w:id="31"/>
-    </w:p>
-    <w:p>
-      <w:r>
-        <w:t>The Time-Course Viewer helps inspect the active movie and ROI traces. Start raw intensity display with neutral contrast and inspect representative frames. Video GUI combines the functional movie/PSC view with underlay and atlas context. Set frame/time, sign, percentage range and opacity deliberately.</w:t>
+        <w:t>Follow the guided workflow</w:t>
+      </w:r>
+    </w:p>
+    <w:p>
+      <w:r>
+        <w:t>Continue automatically between steps is enabled by default. Preparation opens orientation confirmation, then landmark editing. Save pairs (S) keeps editing; the green Save + continue to fit button finishes editing and starts fitting. Accept + save all outputs maps anatomy and exports the atlas package. Disable automatic continuation to run individual steps.</w:t>
       </w:r>
     </w:p>
     <w:p>
@@ -7274,7 +7589,10 @@
         <w:ind w:left="317" w:hanging="259"/>
       </w:pPr>
       <w:r>
-        <w:t>1. Open Video from the intended result and choose a representative frame.</w:t>
+        <w:t xml:space="preserve">1. </w:t>
+      </w:r>
+      <w:r>
+        <w:t>1 Prepare + start: build a median anatomy from the current Doppler recording, using its original geometry. Do not prepare registration from a percentage-change movie.</w:t>
       </w:r>
     </w:p>
     <w:p>
@@ -7283,16 +7601,10 @@
         <w:ind w:left="317" w:hanging="259"/>
       </w:pPr>
       <w:r>
-        <w:t xml:space="preserve">2. Open </w:t>
-      </w:r>
-      <w:r>
-        <w:rPr>
-          <w:b/>
-        </w:rPr>
-        <w:t>Underlay</w:t>
-      </w:r>
-      <w:r>
-        <w:t xml:space="preserve"> to load a replacement background or matching atlas package.</w:t>
+        <w:t xml:space="preserve">2. </w:t>
+      </w:r>
+      <w:r>
+        <w:t>2 Confirm orientation: compare sample and vascular atlas; confirm AP, DV, ML and laterality. Closing leaves this step unconfirmed.</w:t>
       </w:r>
     </w:p>
     <w:p>
@@ -7301,7 +7613,10 @@
         <w:ind w:left="317" w:hanging="259"/>
       </w:pPr>
       <w:r>
-        <w:t>3. Check alignment and native/atlas coordinates before placing ROIs.</w:t>
+        <w:t xml:space="preserve">3. </w:t>
+      </w:r>
+      <w:r>
+        <w:t>3 Edit landmarks: distribute reliable matching features throughout the acquired volume; complete or cancel every pending pair before saving.</w:t>
       </w:r>
     </w:p>
     <w:p>
@@ -7310,7 +7625,10 @@
         <w:ind w:left="317" w:hanging="259"/>
       </w:pPr>
       <w:r>
-        <w:t>4. Use consistent display settings when comparing recordings.</w:t>
+        <w:t xml:space="preserve">4. </w:t>
+      </w:r>
+      <w:r>
+        <w:t>4 Fit registration: affine and B-spline fitting report stage and iteration progress. fUS defaults are a 1.6 mm B-spline grid and landmark weight 0.1.</w:t>
       </w:r>
     </w:p>
     <w:p>
@@ -7319,7 +7637,22 @@
         <w:ind w:left="317" w:hanging="259"/>
       </w:pPr>
       <w:r>
-        <w:t>5. Export a short movie first and review the result before a long export.</w:t>
+        <w:t xml:space="preserve">5. </w:t>
+      </w:r>
+      <w:r>
+        <w:t>5 Review + accept: compare vessels, boundaries and coverage on several coronal, horizontal and sagittal slices. Rejecting or closing does not export.</w:t>
+      </w:r>
+    </w:p>
+    <w:p>
+      <w:pPr>
+        <w:pStyle w:val="ListParagraph"/>
+        <w:ind w:left="317" w:hanging="259"/>
+      </w:pPr>
+      <w:r>
+        <w:t xml:space="preserve">6. </w:t>
+      </w:r>
+      <w:r>
+        <w:t>6 Save all outputs: acceptance automatically saves mapped anatomy, native region labels, available vascular/histology backgrounds and editable tissue masks. SAVED identifies the output folder.</w:t>
       </w:r>
     </w:p>
     <w:p>
@@ -7336,9 +7669,434 @@
     </w:p>
     <w:p>
       <w:pPr>
+        <w:pStyle w:val="FigureCaption"/>
+      </w:pPr>
+      <w:r>
+        <w:lastRenderedPageBreak/>
+        <w:t>Guided LightSuite workspace</w:t>
+      </w:r>
+      <w:bookmarkStart w:id="32" w:name="b_lightsuite_guided_workspace"/>
+      <w:bookmarkEnd w:id="32"/>
+    </w:p>
+    <w:p>
+      <w:pPr>
+        <w:spacing w:after="100"/>
+        <w:jc w:val="center"/>
+      </w:pPr>
+      <w:r>
+        <w:rPr>
+          <w:noProof/>
+        </w:rPr>
+        <w:drawing>
+          <wp:inline distT="0" distB="0" distL="0" distR="0">
+            <wp:extent cx="8310994" cy="6309359"/>
+            <wp:effectExtent l="0" t="0" r="0" b="0"/>
+            <wp:docPr id="18" name="Picture 18" descr="Guided LightSuite workspace"/>
+            <wp:cNvGraphicFramePr>
+              <a:graphicFrameLocks xmlns:a="http://schemas.openxmlformats.org/drawingml/2006/main" noChangeAspect="1"/>
+            </wp:cNvGraphicFramePr>
+            <a:graphic xmlns:a="http://schemas.openxmlformats.org/drawingml/2006/main">
+              <a:graphicData uri="http://schemas.openxmlformats.org/drawingml/2006/picture">
+                <pic:pic xmlns:pic="http://schemas.openxmlformats.org/drawingml/2006/picture">
+                  <pic:nvPicPr>
+                    <pic:cNvPr id="0" name="lightsuite_guided_workspace.png"/>
+                    <pic:cNvPicPr/>
+                  </pic:nvPicPr>
+                  <pic:blipFill>
+                    <a:blip r:embed="rId37"/>
+                    <a:stretch>
+                      <a:fillRect/>
+                    </a:stretch>
+                  </pic:blipFill>
+                  <pic:spPr>
+                    <a:xfrm>
+                      <a:off x="0" y="0"/>
+                      <a:ext cx="8310994" cy="6309359"/>
+                    </a:xfrm>
+                    <a:prstGeom prst="rect">
+                      <a:avLst/>
+                    </a:prstGeom>
+                  </pic:spPr>
+                </pic:pic>
+              </a:graphicData>
+            </a:graphic>
+          </wp:inline>
+        </w:drawing>
+      </w:r>
+    </w:p>
+    <w:p>
+      <w:r>
+        <w:t xml:space="preserve">Actual guided workspace with anonymized example identifiers. Coloured numbered </w:t>
+      </w:r>
+      <w:r>
+        <w:t>buttons perform analysis; the current step is emphasized. Green controls save results and blue Help controls open instructions. This is an interface example, not an accepted registration.</w:t>
+      </w:r>
+    </w:p>
+    <w:p>
+      <w:pPr>
+        <w:sectPr>
+          <w:headerReference w:type="default" r:id="rId38"/>
+          <w:footerReference w:type="default" r:id="rId39"/>
+          <w:pgSz w:w="23810" w:h="16838"/>
+          <w:pgMar w:top="1368" w:right="1008" w:bottom="1008" w:left="1008" w:header="360" w:footer="432" w:gutter="0"/>
+          <w:cols w:space="720"/>
+          <w:docGrid w:linePitch="360"/>
+        </w:sectPr>
+      </w:pPr>
+    </w:p>
+    <w:p>
+      <w:pPr>
+        <w:pStyle w:val="Heading3"/>
+      </w:pPr>
+      <w:r>
+        <w:rPr>
+          <w:b w:val="0"/>
+        </w:rPr>
+        <w:lastRenderedPageBreak/>
+        <w:t>Choose and edit reliable landmarks</w:t>
+      </w:r>
+    </w:p>
+    <w:p>
+      <w:r>
+        <w:t>Prefer distinctive vessel bifurcations and junctions identifiable in both sample and vascular atlas. Clear midline, ventricle boundaries and characteristic brain contours may help. Check features in multiple views; distribute pairs across AP, DV, ML and both imaged hemispheres. Do not force matches outside acquired coverage.</w:t>
+      </w:r>
+    </w:p>
+    <w:p>
+      <w:r>
+        <w:t>The paper reports a median of 219 user landmarks per mouse, not a required threshold. Five noncoplanar pairs are only the numerical minimum. Add confident, distributed matches in rounds and check unused anatomical features after fitting. Neither point count nor a low fitting residual establishes anatomical accuracy.</w:t>
+      </w:r>
+    </w:p>
+    <w:p>
+      <w:r>
+        <w:t>In Mark matching points mode, right-click an image to undo the last click. Undoing an atlas point keeps its sample pending for correction; another right-click cancels that sample. Delete selected pair removes both points. Zoom and pan retain their normal mouse controls.</w:t>
+      </w:r>
+    </w:p>
+    <w:p>
+      <w:r>
+        <w:t>BUSY identifies the operation; READY means the editor accepts input. UNSAVED CHANGES and PENDING POINT differ from SAVED with a timestamp. Important Command Window messages have bold stage labels, time, animal, scan and file path. Marker edits do not recalculate image enhancement.</w:t>
+      </w:r>
+    </w:p>
+    <w:p>
+      <w:pPr>
+        <w:sectPr>
+          <w:headerReference w:type="default" r:id="rId40"/>
+          <w:footerReference w:type="default" r:id="rId41"/>
+          <w:pgSz w:w="11906" w:h="16838"/>
+          <w:pgMar w:top="1368" w:right="1008" w:bottom="1008" w:left="1008" w:header="360" w:footer="432" w:gutter="0"/>
+          <w:cols w:space="720"/>
+          <w:docGrid w:linePitch="360"/>
+        </w:sectPr>
+      </w:pPr>
+    </w:p>
+    <w:p>
+      <w:pPr>
+        <w:pStyle w:val="FigureCaption"/>
+      </w:pPr>
+      <w:r>
+        <w:lastRenderedPageBreak/>
+        <w:t>Landmark editor with save and activity indicators</w:t>
+      </w:r>
+      <w:bookmarkStart w:id="33" w:name="b_lightsuite_landmark_editor"/>
+      <w:bookmarkEnd w:id="33"/>
+    </w:p>
+    <w:p>
+      <w:pPr>
+        <w:spacing w:after="100"/>
+        <w:jc w:val="center"/>
+      </w:pPr>
+      <w:r>
+        <w:rPr>
+          <w:noProof/>
+        </w:rPr>
+        <w:drawing>
+          <wp:inline distT="0" distB="0" distL="0" distR="0">
+            <wp:extent cx="8555271" cy="6309359"/>
+            <wp:effectExtent l="0" t="0" r="0" b="0"/>
+            <wp:docPr id="21" name="Picture 21" descr="Landmark editor with save and activity indicators"/>
+            <wp:cNvGraphicFramePr>
+              <a:graphicFrameLocks xmlns:a="http://schemas.openxmlformats.org/drawingml/2006/main" noChangeAspect="1"/>
+            </wp:cNvGraphicFramePr>
+            <a:graphic xmlns:a="http://schemas.openxmlformats.org/drawingml/2006/main">
+              <a:graphicData uri="http://schemas.openxmlformats.org/drawingml/2006/picture">
+                <pic:pic xmlns:pic="http://schemas.openxmlformats.org/drawingml/2006/picture">
+                  <pic:nvPicPr>
+                    <pic:cNvPr id="0" name="lightsuite_landmark_editor.png"/>
+                    <pic:cNvPicPr/>
+                  </pic:nvPicPr>
+                  <pic:blipFill>
+                    <a:blip r:embed="rId42"/>
+                    <a:stretch>
+                      <a:fillRect/>
+                    </a:stretch>
+                  </pic:blipFill>
+                  <pic:spPr>
+                    <a:xfrm>
+                      <a:off x="0" y="0"/>
+                      <a:ext cx="8555271" cy="6309359"/>
+                    </a:xfrm>
+                    <a:prstGeom prst="rect">
+                      <a:avLst/>
+                    </a:prstGeom>
+                  </pic:spPr>
+                </pic:pic>
+              </a:graphicData>
+            </a:graphic>
+          </wp:inline>
+        </w:drawing>
+      </w:r>
+    </w:p>
+    <w:p>
+      <w:r>
+        <w:t xml:space="preserve">Actual paired editor with acquired </w:t>
+      </w:r>
+      <w:r>
+        <w:t>Doppler anatomy and the published vascular reference. Identifiers are anonymized; no matched points or registration acceptance are implied. The header, save badge, activity line and green Save + continue button identify the current task.</w:t>
+      </w:r>
+    </w:p>
+    <w:p>
+      <w:pPr>
+        <w:sectPr>
+          <w:headerReference w:type="default" r:id="rId43"/>
+          <w:footerReference w:type="default" r:id="rId44"/>
+          <w:pgSz w:w="23810" w:h="16838"/>
+          <w:pgMar w:top="1368" w:right="1008" w:bottom="1008" w:left="1008" w:header="360" w:footer="432" w:gutter="0"/>
+          <w:cols w:space="720"/>
+          <w:docGrid w:linePitch="360"/>
+        </w:sectPr>
+      </w:pPr>
+    </w:p>
+    <w:p>
+      <w:pPr>
+        <w:pStyle w:val="Heading3"/>
+      </w:pPr>
+      <w:r>
+        <w:rPr>
+          <w:b w:val="0"/>
+        </w:rPr>
+        <w:lastRenderedPageBreak/>
+        <w:t>Load saved outputs</w:t>
+      </w:r>
+    </w:p>
+    <w:p>
+      <w:r>
+        <w:t xml:space="preserve">In SCM or Video choose Underlay &gt; LOAD ATLAS &gt; LightSuite folder and select the project. Normal folder loads </w:t>
+      </w:r>
+      <w:r>
+        <w:t>standard registrations; Single file remains available. Atlas underlay offers Vascular, Histology and Regions when installed and exported, preserving native functional data and anatomical region context.</w:t>
+      </w:r>
+    </w:p>
+    <w:p>
+      <w:r>
+        <w:t>Keep LightSuite_Native_Regions.mat and LightSuite_Native_Backgrounds.mat together. Regions includes IDs, names and hemisphere masks. LightSuite_Native_Mask.mat supplies anatomy and an editable tissue mask to Mask Editor. anatomy_in_atlas.mat is mapped anatomy for QC, not a functional movie. Retain the complete session and transform chain.</w:t>
+      </w:r>
+    </w:p>
+    <w:p>
+      <w:r>
+        <w:t>Older labels-only projects generate missing backgrounds once from their accepted saved fit when the complete project and dependencies are available, without refitting. A standalone old region file cannot recreate images. Histology needs the Allen CCF2020 average template; install with -IncludeHistology and export again if absent.</w:t>
+      </w:r>
+    </w:p>
+    <w:p>
+      <w:pPr>
+        <w:pStyle w:val="Heading3"/>
+      </w:pPr>
+      <w:r>
+        <w:rPr>
+          <w:b w:val="0"/>
+        </w:rPr>
+        <w:t>Method scope and interpretation</w:t>
+      </w:r>
+    </w:p>
+    <w:p>
+      <w:r>
+        <w:t>Native outputs require the exact original recording grid. Cropping, resampling, reorientation or another scan needs appropriate registration. Fitted projects open read-only; use Revise fit in new project to change landmarks while preserving the previous fit. Numerical inverse checks do not replace anatomical review.</w:t>
+      </w:r>
+    </w:p>
+    <w:p>
+      <w:r>
+        <w:t>The preprint constructs a within-mouse anatomy from aligned repeated sessions before atlas registration. This workspace prepares a median template from the selected recording and does not automatically reproduce that multi-session construction. Expression mapping and implant tracing require suitable histology or fluorescence data.</w:t>
+      </w:r>
+    </w:p>
+    <w:p>
+      <w:pPr>
+        <w:pStyle w:val="Heading3"/>
+      </w:pPr>
+      <w:r>
+        <w:rPr>
+          <w:b w:val="0"/>
+        </w:rPr>
+        <w:t>LightSuite citation and acknowledgment</w:t>
+      </w:r>
+    </w:p>
+    <w:p>
+      <w:r>
+        <w:t xml:space="preserve">We acknowledge Dimokratis Karamanlis and all LightSuite coauthors for the original framework, methods and resources. Cite their preprint alongside deConfUSIon and the relevant atlas </w:t>
+      </w:r>
+      <w:r>
+        <w:t>references. It was posted on 14 October 2026 and had not been peer reviewed. These integration screenshots do not reproduce paper figures.</w:t>
+      </w:r>
+    </w:p>
+    <w:p>
+      <w:hyperlink r:id="rId45">
+        <w:r>
+          <w:rPr>
+            <w:color w:val="007C86"/>
+            <w:u w:val="single"/>
+          </w:rPr>
+          <w:t>Karamanlis D, Xie Y, Foucher CG, Alappat M, Masood A, Dimitropoulou I, Pivron LAF, Martínez de Paz JM, Macé E, Gaspari S, El-Boustani S. LightSuite: scalable atlas registration and cell detection across the central nervous system. bioRxiv (2026). doi:10.64898/2026.10.13.757638.</w:t>
+        </w:r>
+      </w:hyperlink>
+    </w:p>
+    <w:p>
+      <w:r>
+        <w:lastRenderedPageBreak/>
+        <w:t>Brunner et al. (2021). Whole-brain functional ultrasound imaging in awake head-fixed mice. Nature Protocols 16, 3547-3571. doi:10.1038/s41596-021-00548-8. LightSuite resources: Zenodo 21338217 (CC BY 4.0).</w:t>
+      </w:r>
+    </w:p>
+    <w:p>
+      <w:hyperlink r:id="rId46">
+        <w:r>
+          <w:rPr>
+            <w:color w:val="007C86"/>
+            <w:u w:val="single"/>
+          </w:rPr>
+          <w:t>LightSuite</w:t>
+        </w:r>
+      </w:hyperlink>
+      <w:r>
+        <w:t xml:space="preserve"> | </w:t>
+      </w:r>
+      <w:hyperlink r:id="rId47">
+        <w:r>
+          <w:rPr>
+            <w:color w:val="007C86"/>
+            <w:u w:val="single"/>
+          </w:rPr>
+          <w:t>LightSuite fUS</w:t>
+        </w:r>
+      </w:hyperlink>
+    </w:p>
+    <w:p>
+      <w:pPr>
+        <w:pStyle w:val="Heading1"/>
+        <w:pageBreakBefore/>
+      </w:pPr>
+      <w:bookmarkStart w:id="34" w:name="_Toc243479482"/>
+      <w:r>
+        <w:rPr>
+          <w:b w:val="0"/>
+        </w:rPr>
+        <w:lastRenderedPageBreak/>
+        <w:t>15 Inspect movies and the 3D model</w:t>
+      </w:r>
+      <w:bookmarkEnd w:id="34"/>
+    </w:p>
+    <w:p>
+      <w:pPr>
         <w:pStyle w:val="Heading2"/>
       </w:pPr>
-      <w:bookmarkStart w:id="32" w:name="_Toc242991810"/>
+      <w:bookmarkStart w:id="35" w:name="_Toc243479483"/>
+      <w:r>
+        <w:rPr>
+          <w:b w:val="0"/>
+        </w:rPr>
+        <w:t>Time Course Viewer and Video GUI</w:t>
+      </w:r>
+      <w:bookmarkEnd w:id="35"/>
+    </w:p>
+    <w:p>
+      <w:r>
+        <w:t>The Time-Course Viewer helps inspect the active movie and ROI traces. Start raw intensity display with neutral contrast and inspect representative frames. Video GUI combines the functional movie/PSC view with underlay and atlas context. Set frame/time, sign, percentage range and opacity deliberately.</w:t>
+      </w:r>
+    </w:p>
+    <w:p>
+      <w:pPr>
+        <w:pStyle w:val="ListParagraph"/>
+        <w:ind w:left="317" w:hanging="259"/>
+      </w:pPr>
+      <w:r>
+        <w:t xml:space="preserve">1. </w:t>
+      </w:r>
+      <w:r>
+        <w:t>Open Video from the intended result and choose a representative frame.</w:t>
+      </w:r>
+    </w:p>
+    <w:p>
+      <w:pPr>
+        <w:pStyle w:val="ListParagraph"/>
+        <w:ind w:left="317" w:hanging="259"/>
+      </w:pPr>
+      <w:r>
+        <w:t xml:space="preserve">2. </w:t>
+      </w:r>
+      <w:r>
+        <w:t xml:space="preserve">Open </w:t>
+      </w:r>
+      <w:r>
+        <w:rPr>
+          <w:b/>
+        </w:rPr>
+        <w:t>Underlay</w:t>
+      </w:r>
+      <w:r>
+        <w:t xml:space="preserve"> to load a replacement background or matching atlas package.</w:t>
+      </w:r>
+    </w:p>
+    <w:p>
+      <w:pPr>
+        <w:pStyle w:val="ListParagraph"/>
+        <w:ind w:left="317" w:hanging="259"/>
+      </w:pPr>
+      <w:r>
+        <w:t xml:space="preserve">3. </w:t>
+      </w:r>
+      <w:r>
+        <w:t xml:space="preserve">Check alignment and native/atlas coordinates before </w:t>
+      </w:r>
+      <w:r>
+        <w:t>placing ROIs.</w:t>
+      </w:r>
+    </w:p>
+    <w:p>
+      <w:pPr>
+        <w:pStyle w:val="ListParagraph"/>
+        <w:ind w:left="317" w:hanging="259"/>
+      </w:pPr>
+      <w:r>
+        <w:t xml:space="preserve">4. </w:t>
+      </w:r>
+      <w:r>
+        <w:t>Use consistent display settings when comparing recordings.</w:t>
+      </w:r>
+    </w:p>
+    <w:p>
+      <w:pPr>
+        <w:pStyle w:val="ListParagraph"/>
+        <w:ind w:left="317" w:hanging="259"/>
+      </w:pPr>
+      <w:r>
+        <w:t xml:space="preserve">5. </w:t>
+      </w:r>
+      <w:r>
+        <w:t>Export a short movie first and review the result before a long export.</w:t>
+      </w:r>
+    </w:p>
+    <w:p>
+      <w:pPr>
+        <w:sectPr>
+          <w:headerReference w:type="default" r:id="rId48"/>
+          <w:footerReference w:type="default" r:id="rId49"/>
+          <w:pgSz w:w="11906" w:h="16838"/>
+          <w:pgMar w:top="1368" w:right="1008" w:bottom="1008" w:left="1008" w:header="360" w:footer="432" w:gutter="0"/>
+          <w:cols w:space="720"/>
+          <w:docGrid w:linePitch="360"/>
+        </w:sectPr>
+      </w:pPr>
+    </w:p>
+    <w:p>
+      <w:pPr>
+        <w:pStyle w:val="Heading2"/>
+      </w:pPr>
+      <w:bookmarkStart w:id="36" w:name="_Toc243479484"/>
       <w:r>
         <w:rPr>
           <w:b w:val="0"/>
@@ -7346,14 +8104,14 @@
         <w:lastRenderedPageBreak/>
         <w:t>Volumetric display</w:t>
       </w:r>
-      <w:bookmarkEnd w:id="32"/>
+      <w:bookmarkEnd w:id="36"/>
     </w:p>
     <w:p>
       <w:pPr>
         <w:pStyle w:val="FigureCaption"/>
       </w:pPr>
       <w:r>
-        <w:t>Figure 7. Complete reference atlas views</w:t>
+        <w:t>Figure 9. Complete reference atlas views</w:t>
       </w:r>
     </w:p>
     <w:p>
@@ -7366,10 +8124,10 @@
           <w:noProof/>
         </w:rPr>
         <w:drawing>
-          <wp:inline distT="0" distB="0" distL="0" distR="0" wp14:anchorId="41AEF6A0" wp14:editId="703838A1">
+          <wp:inline distT="0" distB="0" distL="0" distR="0">
             <wp:extent cx="13258800" cy="4433411"/>
             <wp:effectExtent l="0" t="0" r="0" b="0"/>
-            <wp:docPr id="18" name="Picture 18" descr="Complete reference atlas views"/>
+            <wp:docPr id="24" name="Picture 24" descr="Complete reference atlas views"/>
             <wp:cNvGraphicFramePr>
               <a:graphicFrameLocks xmlns:a="http://schemas.openxmlformats.org/drawingml/2006/main" noChangeAspect="1"/>
             </wp:cNvGraphicFramePr>
@@ -7381,7 +8139,7 @@
                     <pic:cNvPicPr/>
                   </pic:nvPicPr>
                   <pic:blipFill>
-                    <a:blip r:embed="rId37"/>
+                    <a:blip r:embed="rId50"/>
                     <a:stretch>
                       <a:fillRect/>
                     </a:stretch>
@@ -7405,8 +8163,8 @@
     <w:p>
       <w:pPr>
         <w:sectPr>
-          <w:headerReference w:type="default" r:id="rId38"/>
-          <w:footerReference w:type="default" r:id="rId39"/>
+          <w:headerReference w:type="default" r:id="rId51"/>
+          <w:footerReference w:type="default" r:id="rId52"/>
           <w:pgSz w:w="23810" w:h="16838"/>
           <w:pgMar w:top="1368" w:right="1008" w:bottom="1008" w:left="1008" w:header="360" w:footer="432" w:gutter="0"/>
           <w:cols w:space="720"/>
@@ -7417,7 +8175,10 @@
     <w:p>
       <w:r>
         <w:lastRenderedPageBreak/>
-        <w:t>Use the 3D companion from Video for acquired-field volume, surface or coronal-stack displays. Confirm spacing and choose a backend appropriate to the data. Disable the PSC overlay to review anatomy alone; adjust the Doppler cutoff carefully so faint acquired support is not mistaken for absent tissue. Surfaces and gap/stagger/depth settings are presentation choices.</w:t>
+        <w:t xml:space="preserve">Use the 3D </w:t>
+      </w:r>
+      <w:r>
+        <w:t>companion from Video for acquired-field volume, surface or coronal-stack displays. Confirm spacing and choose a backend appropriate to the data. Disable the PSC overlay to review anatomy alone; adjust the Doppler cutoff carefully so faint acquired support is not mistaken for absent tissue. Surfaces and gap/stagger/depth settings are presentation choices.</w:t>
       </w:r>
     </w:p>
     <w:p>
@@ -7428,8 +8189,8 @@
     <w:p>
       <w:pPr>
         <w:sectPr>
-          <w:headerReference w:type="default" r:id="rId40"/>
-          <w:footerReference w:type="default" r:id="rId41"/>
+          <w:headerReference w:type="default" r:id="rId53"/>
+          <w:footerReference w:type="default" r:id="rId54"/>
           <w:pgSz w:w="11906" w:h="16838"/>
           <w:pgMar w:top="1368" w:right="1008" w:bottom="1008" w:left="1008" w:header="360" w:footer="432" w:gutter="0"/>
           <w:cols w:space="720"/>
@@ -7441,7 +8202,7 @@
       <w:pPr>
         <w:pStyle w:val="Heading1"/>
       </w:pPr>
-      <w:bookmarkStart w:id="33" w:name="_Toc242991811"/>
+      <w:bookmarkStart w:id="37" w:name="_Toc243479485"/>
       <w:r>
         <w:rPr>
           <w:b w:val="0"/>
@@ -7449,14 +8210,14 @@
         <w:lastRenderedPageBreak/>
         <w:t>16 Compute functional connectivity</w:t>
       </w:r>
-      <w:bookmarkEnd w:id="33"/>
+      <w:bookmarkEnd w:id="37"/>
     </w:p>
     <w:p>
       <w:pPr>
         <w:pStyle w:val="FigureCaption"/>
       </w:pPr>
       <w:r>
-        <w:t>Figure 8. Region connectivity matrix</w:t>
+        <w:t>Figure 10. Region connectivity matrix</w:t>
       </w:r>
     </w:p>
     <w:p>
@@ -7469,10 +8230,10 @@
           <w:noProof/>
         </w:rPr>
         <w:drawing>
-          <wp:inline distT="0" distB="0" distL="0" distR="0" wp14:anchorId="37E176E5" wp14:editId="5F9AF326">
+          <wp:inline distT="0" distB="0" distL="0" distR="0">
             <wp:extent cx="9464040" cy="6309360"/>
             <wp:effectExtent l="0" t="0" r="0" b="0"/>
-            <wp:docPr id="21" name="Picture 21" descr="Region connectivity matrix"/>
+            <wp:docPr id="27" name="Picture 27" descr="Region connectivity matrix"/>
             <wp:cNvGraphicFramePr>
               <a:graphicFrameLocks xmlns:a="http://schemas.openxmlformats.org/drawingml/2006/main" noChangeAspect="1"/>
             </wp:cNvGraphicFramePr>
@@ -7484,7 +8245,7 @@
                     <pic:cNvPicPr/>
                   </pic:nvPicPr>
                   <pic:blipFill>
-                    <a:blip r:embed="rId42"/>
+                    <a:blip r:embed="rId55"/>
                     <a:stretch>
                       <a:fillRect/>
                     </a:stretch>
@@ -7508,8 +8269,8 @@
     <w:p>
       <w:pPr>
         <w:sectPr>
-          <w:headerReference w:type="default" r:id="rId43"/>
-          <w:footerReference w:type="default" r:id="rId44"/>
+          <w:headerReference w:type="default" r:id="rId56"/>
+          <w:footerReference w:type="default" r:id="rId57"/>
           <w:pgSz w:w="23810" w:h="16838"/>
           <w:pgMar w:top="1368" w:right="1008" w:bottom="1008" w:left="1008" w:header="360" w:footer="432" w:gutter="0"/>
           <w:cols w:space="720"/>
@@ -7524,7 +8285,10 @@
       </w:pPr>
       <w:r>
         <w:lastRenderedPageBreak/>
-        <w:t xml:space="preserve">1. Open </w:t>
+        <w:t xml:space="preserve">1. </w:t>
+      </w:r>
+      <w:r>
+        <w:t xml:space="preserve">Open </w:t>
       </w:r>
       <w:r>
         <w:rPr>
@@ -7542,7 +8306,10 @@
         <w:ind w:left="317" w:hanging="259"/>
       </w:pPr>
       <w:r>
-        <w:t>2. Load matching integer atlas regions or supported segmentation output. A colored histology picture alone does not define ROI membership.</w:t>
+        <w:t xml:space="preserve">2. </w:t>
+      </w:r>
+      <w:r>
+        <w:t>Load matching integer atlas regions or supported segmentation output. A colored histology picture alone does not define ROI membership.</w:t>
       </w:r>
     </w:p>
     <w:p>
@@ -7551,7 +8318,10 @@
         <w:ind w:left="317" w:hanging="259"/>
       </w:pPr>
       <w:r>
-        <w:t>3. Inspect label alignment, acquired coverage and voxel counts.</w:t>
+        <w:t xml:space="preserve">3. </w:t>
+      </w:r>
+      <w:r>
+        <w:t>Inspect label alignment, acquired coverage and voxel counts.</w:t>
       </w:r>
     </w:p>
     <w:p>
@@ -7560,7 +8330,10 @@
         <w:ind w:left="317" w:hanging="259"/>
       </w:pPr>
       <w:r>
-        <w:t xml:space="preserve">4. Choose merged </w:t>
+        <w:t xml:space="preserve">4. </w:t>
+      </w:r>
+      <w:r>
+        <w:t xml:space="preserve">Choose merged </w:t>
       </w:r>
       <w:r>
         <w:rPr>
@@ -7578,7 +8351,10 @@
         <w:ind w:left="317" w:hanging="259"/>
       </w:pPr>
       <w:r>
-        <w:t>5. Select the scan, period and local time interval. Verify TR and usable duration.</w:t>
+        <w:t xml:space="preserve">5. </w:t>
+      </w:r>
+      <w:r>
+        <w:t>Select the scan, period and local time interval. Verify TR and usable duration.</w:t>
       </w:r>
     </w:p>
     <w:p>
@@ -7587,7 +8363,10 @@
         <w:ind w:left="317" w:hanging="259"/>
       </w:pPr>
       <w:r>
-        <w:t xml:space="preserve">6. Press </w:t>
+        <w:t xml:space="preserve">6. </w:t>
+      </w:r>
+      <w:r>
+        <w:t xml:space="preserve">Press </w:t>
       </w:r>
       <w:r>
         <w:rPr>
@@ -7605,7 +8384,13 @@
         <w:ind w:left="317" w:hanging="259"/>
       </w:pPr>
       <w:r>
-        <w:t>7. Review traces, matrix values, missing regions and graph settings before exporting.</w:t>
+        <w:t xml:space="preserve">7. </w:t>
+      </w:r>
+      <w:r>
+        <w:t xml:space="preserve">Review traces, matrix values, missing regions and graph </w:t>
+      </w:r>
+      <w:r>
+        <w:t>settings before exporting.</w:t>
       </w:r>
     </w:p>
     <w:p>
@@ -7623,7 +8408,7 @@
         <w:pStyle w:val="Heading1"/>
         <w:pageBreakBefore/>
       </w:pPr>
-      <w:bookmarkStart w:id="34" w:name="_Toc242991812"/>
+      <w:bookmarkStart w:id="38" w:name="_Toc243479486"/>
       <w:r>
         <w:rPr>
           <w:b w:val="0"/>
@@ -7631,7 +8416,7 @@
         <w:lastRenderedPageBreak/>
         <w:t>17 Import ROI results into Group Analysis</w:t>
       </w:r>
-      <w:bookmarkEnd w:id="34"/>
+      <w:bookmarkEnd w:id="38"/>
     </w:p>
     <w:p>
       <w:pPr>
@@ -7639,7 +8424,10 @@
         <w:ind w:left="317" w:hanging="259"/>
       </w:pPr>
       <w:r>
-        <w:t xml:space="preserve">1. Open </w:t>
+        <w:t xml:space="preserve">1. </w:t>
+      </w:r>
+      <w:r>
+        <w:t xml:space="preserve">Open </w:t>
       </w:r>
       <w:r>
         <w:rPr>
@@ -7657,7 +8445,10 @@
         <w:ind w:left="317" w:hanging="259"/>
       </w:pPr>
       <w:r>
-        <w:t xml:space="preserve">2. Click </w:t>
+        <w:t xml:space="preserve">2. </w:t>
+      </w:r>
+      <w:r>
+        <w:t xml:space="preserve">Click </w:t>
       </w:r>
       <w:r>
         <w:rPr>
@@ -7675,7 +8466,10 @@
         <w:ind w:left="317" w:hanging="259"/>
       </w:pPr>
       <w:r>
-        <w:t>3. Verify animal, group, condition, role and PairID against the experimental record. Resolve unassigned rows.</w:t>
+        <w:t xml:space="preserve">3. </w:t>
+      </w:r>
+      <w:r>
+        <w:t>Verify animal, group, condition, role and PairID against the experimental record. Resolve unassigned rows.</w:t>
       </w:r>
     </w:p>
     <w:p>
@@ -7684,7 +8478,10 @@
         <w:ind w:left="317" w:hanging="259"/>
       </w:pPr>
       <w:r>
-        <w:t>4. Choose the metric and interval, then inspect the time-course preview.</w:t>
+        <w:t xml:space="preserve">4. </w:t>
+      </w:r>
+      <w:r>
+        <w:t>Choose the metric and interval, then inspect the time-course preview.</w:t>
       </w:r>
     </w:p>
     <w:p>
@@ -7693,7 +8490,10 @@
         <w:ind w:left="317" w:hanging="259"/>
       </w:pPr>
       <w:r>
-        <w:t xml:space="preserve">5. Switch to </w:t>
+        <w:t xml:space="preserve">5. </w:t>
+      </w:r>
+      <w:r>
+        <w:t xml:space="preserve">Switch to </w:t>
       </w:r>
       <w:r>
         <w:rPr>
@@ -7711,25 +8511,31 @@
         <w:ind w:left="317" w:hanging="259"/>
       </w:pPr>
       <w:r>
-        <w:t>6. Review counts, exclusions and multiplicity settings, then export tables and figures with their parameter record.</w:t>
+        <w:t xml:space="preserve">6. </w:t>
+      </w:r>
+      <w:r>
+        <w:t>Review counts, exclusions and multiplicity settings, then export tables and figures with their parameter record.</w:t>
       </w:r>
     </w:p>
     <w:p>
       <w:pPr>
         <w:pStyle w:val="Heading2"/>
       </w:pPr>
-      <w:bookmarkStart w:id="35" w:name="_Toc242991813"/>
+      <w:bookmarkStart w:id="39" w:name="_Toc243479487"/>
       <w:r>
         <w:rPr>
           <w:b w:val="0"/>
         </w:rPr>
         <w:t>Choose a metric and biological unit</w:t>
       </w:r>
-      <w:bookmarkEnd w:id="35"/>
-    </w:p>
-    <w:p>
-      <w:r>
-        <w:t>A fixed-interval mean describes a prespecified interval. A maximum-plateau endpoint searches complete windows for the largest mean and should be treated as exploratory unless prespecified independently. Keep search width and duration consistent across comparisons.</w:t>
+      <w:bookmarkEnd w:id="39"/>
+    </w:p>
+    <w:p>
+      <w:r>
+        <w:t xml:space="preserve">A fixed-interval mean describes a prespecified interval. A maximum-plateau endpoint searches complete windows for the largest mean and should be treated as exploratory unless prespecified independently. Keep search width and duration </w:t>
+      </w:r>
+      <w:r>
+        <w:t>consistent across comparisons.</w:t>
       </w:r>
     </w:p>
     <w:p>
@@ -7751,7 +8557,7 @@
         <w:pStyle w:val="Heading1"/>
         <w:pageBreakBefore/>
       </w:pPr>
-      <w:bookmarkStart w:id="36" w:name="_Toc242991814"/>
+      <w:bookmarkStart w:id="40" w:name="_Toc243479488"/>
       <w:r>
         <w:rPr>
           <w:b w:val="0"/>
@@ -7759,7 +8565,7 @@
         <w:lastRenderedPageBreak/>
         <w:t>18 Use Standardized Analysis</w:t>
       </w:r>
-      <w:bookmarkEnd w:id="36"/>
+      <w:bookmarkEnd w:id="40"/>
     </w:p>
     <w:p>
       <w:pPr>
@@ -7767,7 +8573,10 @@
         <w:ind w:left="317" w:hanging="259"/>
       </w:pPr>
       <w:r>
-        <w:t xml:space="preserve">1. Open </w:t>
+        <w:t xml:space="preserve">1. </w:t>
+      </w:r>
+      <w:r>
+        <w:t xml:space="preserve">Open </w:t>
       </w:r>
       <w:r>
         <w:rPr>
@@ -7785,7 +8594,10 @@
         <w:ind w:left="317" w:hanging="259"/>
       </w:pPr>
       <w:r>
-        <w:t>2. Review every checked step, its order and parameters. Click a row to edit its values; use the Run checkbox to include/exclude it.</w:t>
+        <w:t xml:space="preserve">2. </w:t>
+      </w:r>
+      <w:r>
+        <w:t>Review every checked step, its order and parameters. Click a row to edit its values; use the Run checkbox to include/exclude it.</w:t>
       </w:r>
     </w:p>
     <w:p>
@@ -7794,7 +8606,10 @@
         <w:ind w:left="317" w:hanging="259"/>
       </w:pPr>
       <w:r>
-        <w:t>3. Set baseline/signal windows, reduction factors and filter cutoffs for the actual recording.</w:t>
+        <w:t xml:space="preserve">3. </w:t>
+      </w:r>
+      <w:r>
+        <w:t>Set baseline/signal windows, reduction factors and filter cutoffs for the actual recording.</w:t>
       </w:r>
     </w:p>
     <w:p>
@@ -7803,7 +8618,10 @@
         <w:ind w:left="317" w:hanging="259"/>
       </w:pPr>
       <w:r>
-        <w:t>4. Run the workflow and complete its interactive review stages. Some steps wait for a viewer to close.</w:t>
+        <w:t xml:space="preserve">4. </w:t>
+      </w:r>
+      <w:r>
+        <w:t>Run the workflow and complete its interactive review stages. Some steps wait for a viewer to close.</w:t>
       </w:r>
     </w:p>
     <w:p>
@@ -7812,7 +8630,10 @@
         <w:ind w:left="317" w:hanging="259"/>
       </w:pPr>
       <w:r>
-        <w:t>5. Review final QC and outputs, and save the actual settings before processing more animals.</w:t>
+        <w:t xml:space="preserve">5. </w:t>
+      </w:r>
+      <w:r>
+        <w:t>Review final QC and outputs, and save the actual settings before processing more animals.</w:t>
       </w:r>
     </w:p>
     <w:p>
@@ -7830,7 +8651,7 @@
         <w:pStyle w:val="Heading1"/>
         <w:pageBreakBefore/>
       </w:pPr>
-      <w:bookmarkStart w:id="37" w:name="_Toc242991815"/>
+      <w:bookmarkStart w:id="41" w:name="_Toc243479489"/>
       <w:r>
         <w:rPr>
           <w:b w:val="0"/>
@@ -7838,7 +8659,7 @@
         <w:lastRenderedPageBreak/>
         <w:t>19 Save export and reproduce</w:t>
       </w:r>
-      <w:bookmarkEnd w:id="37"/>
+      <w:bookmarkEnd w:id="41"/>
     </w:p>
     <w:p>
       <w:r>
@@ -7854,14 +8675,14 @@
       <w:pPr>
         <w:pStyle w:val="Heading2"/>
       </w:pPr>
-      <w:bookmarkStart w:id="38" w:name="_Toc242991816"/>
+      <w:bookmarkStart w:id="42" w:name="_Toc243479490"/>
       <w:r>
         <w:rPr>
           <w:b w:val="0"/>
         </w:rPr>
         <w:t>Final review checklist</w:t>
       </w:r>
-      <w:bookmarkEnd w:id="38"/>
+      <w:bookmarkEnd w:id="42"/>
     </w:p>
     <w:p>
       <w:pPr>
@@ -7869,7 +8690,10 @@
         <w:ind w:left="317" w:hanging="259"/>
       </w:pPr>
       <w:r>
-        <w:t>1. Active dataset and original provenance are correct.</w:t>
+        <w:t xml:space="preserve">1. </w:t>
+      </w:r>
+      <w:r>
+        <w:t>Active dataset and original provenance are correct.</w:t>
       </w:r>
     </w:p>
     <w:p>
@@ -7878,7 +8702,10 @@
         <w:ind w:left="317" w:hanging="259"/>
       </w:pPr>
       <w:r>
-        <w:t>2. Timing, TR, event windows and physical geometry are documented.</w:t>
+        <w:t xml:space="preserve">2. </w:t>
+      </w:r>
+      <w:r>
+        <w:t>Timing, TR, event windows and physical geometry are documented.</w:t>
       </w:r>
     </w:p>
     <w:p>
@@ -7887,7 +8714,10 @@
         <w:ind w:left="317" w:hanging="259"/>
       </w:pPr>
       <w:r>
-        <w:t>3. QC decisions and component/filter choices have supporting evidence.</w:t>
+        <w:t xml:space="preserve">3. </w:t>
+      </w:r>
+      <w:r>
+        <w:t>QC decisions and component/filter choices have supporting evidence.</w:t>
       </w:r>
     </w:p>
     <w:p>
@@ -7896,7 +8726,10 @@
         <w:ind w:left="317" w:hanging="259"/>
       </w:pPr>
       <w:r>
-        <w:t>4. Baseline, mask, registration and ROI support match the endpoint.</w:t>
+        <w:t xml:space="preserve">4. </w:t>
+      </w:r>
+      <w:r>
+        <w:t>Baseline, mask, registration and ROI support match the endpoint.</w:t>
       </w:r>
     </w:p>
     <w:p>
@@ -7905,7 +8738,10 @@
         <w:ind w:left="317" w:hanging="259"/>
       </w:pPr>
       <w:r>
-        <w:t>5. Independent animal count, pairing and test match the study design.</w:t>
+        <w:t xml:space="preserve">5. </w:t>
+      </w:r>
+      <w:r>
+        <w:t>Independent animal count, pairing and test match the study design.</w:t>
       </w:r>
     </w:p>
     <w:p>
@@ -7914,7 +8750,10 @@
         <w:ind w:left="317" w:hanging="259"/>
       </w:pPr>
       <w:r>
-        <w:t>6. Saved files, notes and sidecars can be reopened by another user.</w:t>
+        <w:t xml:space="preserve">6. </w:t>
+      </w:r>
+      <w:r>
+        <w:t>Saved files, notes and sidecars can be reopened by another user.</w:t>
       </w:r>
     </w:p>
     <w:p>
@@ -7922,7 +8761,7 @@
         <w:pStyle w:val="Heading1"/>
         <w:pageBreakBefore/>
       </w:pPr>
-      <w:bookmarkStart w:id="39" w:name="_Toc242991817"/>
+      <w:bookmarkStart w:id="43" w:name="_Toc243479491"/>
       <w:r>
         <w:rPr>
           <w:b w:val="0"/>
@@ -7930,7 +8769,7 @@
         <w:lastRenderedPageBreak/>
         <w:t>20 Troubleshoot common problems</w:t>
       </w:r>
-      <w:bookmarkEnd w:id="39"/>
+      <w:bookmarkEnd w:id="43"/>
     </w:p>
     <w:p>
       <w:pPr>
@@ -8521,7 +9360,10 @@
               <w:jc w:val="left"/>
             </w:pPr>
             <w:r>
-              <w:t>Duplicate ensemble representations or ROIs counted as independent animals</w:t>
+              <w:t xml:space="preserve">Duplicate ensemble representations or ROIs counted as independent </w:t>
+            </w:r>
+            <w:r>
+              <w:t>animals</w:t>
             </w:r>
           </w:p>
         </w:tc>
@@ -8596,7 +9438,10 @@
     </w:p>
     <w:p>
       <w:r>
-        <w:t>Record the active script path, source file, dimensions, TR, exact action and complete MATLAB error when reporting a problem. A screen image is useful together with those details. Reproduce on a preserved original before changing several options at once.</w:t>
+        <w:t xml:space="preserve">Record the active script path, source file, dimensions, TR, exact action and complete MATLAB error when reporting a problem. A screen image is </w:t>
+      </w:r>
+      <w:r>
+        <w:t>useful together with those details. Reproduce on a preserved original before changing several options at once.</w:t>
       </w:r>
     </w:p>
     <w:p>
@@ -8604,7 +9449,7 @@
         <w:pStyle w:val="Heading1"/>
         <w:pageBreakBefore/>
       </w:pPr>
-      <w:bookmarkStart w:id="40" w:name="_Toc242991818"/>
+      <w:bookmarkStart w:id="44" w:name="_Toc243479492"/>
       <w:r>
         <w:rPr>
           <w:b w:val="0"/>
@@ -8612,7 +9457,7 @@
         <w:lastRenderedPageBreak/>
         <w:t>21 Essential terms and further reading</w:t>
       </w:r>
-      <w:bookmarkEnd w:id="40"/>
+      <w:bookmarkEnd w:id="44"/>
     </w:p>
     <w:p>
       <w:pPr>
@@ -9069,7 +9914,10 @@
               <w:jc w:val="left"/>
             </w:pPr>
             <w:r>
-              <w:t>Region of interest with defined spatial membership</w:t>
+              <w:t xml:space="preserve">Region of </w:t>
+            </w:r>
+            <w:r>
+              <w:t>interest with defined spatial membership</w:t>
             </w:r>
           </w:p>
         </w:tc>
@@ -9317,7 +10165,10 @@
               <w:jc w:val="left"/>
             </w:pPr>
             <w:r>
-              <w:t>Standard error of the mean across independent included observations</w:t>
+              <w:t xml:space="preserve">Standard error of the mean across </w:t>
+            </w:r>
+            <w:r>
+              <w:t>independent included observations</w:t>
             </w:r>
           </w:p>
         </w:tc>
@@ -9417,14 +10268,14 @@
       <w:pPr>
         <w:pStyle w:val="Heading2"/>
       </w:pPr>
-      <w:bookmarkStart w:id="41" w:name="_Toc242991819"/>
+      <w:bookmarkStart w:id="45" w:name="_Toc243479493"/>
       <w:r>
         <w:rPr>
           <w:b w:val="0"/>
         </w:rPr>
         <w:t>Acknowledgments</w:t>
       </w:r>
-      <w:bookmarkEnd w:id="41"/>
+      <w:bookmarkEnd w:id="45"/>
     </w:p>
     <w:p>
       <w:r>
@@ -9436,7 +10287,7 @@
         <w:pStyle w:val="Heading1"/>
         <w:pageBreakBefore/>
       </w:pPr>
-      <w:bookmarkStart w:id="42" w:name="_Toc242991820"/>
+      <w:bookmarkStart w:id="46" w:name="_Toc243479494"/>
       <w:r>
         <w:rPr>
           <w:b w:val="0"/>
@@ -9444,11 +10295,24 @@
         <w:lastRenderedPageBreak/>
         <w:t>Acknowledgments and responsibility</w:t>
       </w:r>
-      <w:bookmarkEnd w:id="42"/>
-    </w:p>
-    <w:p>
-      <w:r>
-        <w:t>ConfUSIus provides a complementary Python-based approach to fUSI analysis. deConfUSIon emphasizes a connected MATLAB GUI workflow for researchers who do not write code. Thanks are due to ConfUSIus developers Samuel Le Meur-Diebolt and Felipe Cybis Pereira, and José María Martínez de Paz from Émilie Macé’s laboratory, for discussions. The projects are independently developed.</w:t>
+      <w:bookmarkEnd w:id="46"/>
+    </w:p>
+    <w:p>
+      <w:r>
+        <w:t>We acknowledge Dimokratis Karamanlis and all LightSuite coauthors for the original framework, methods and resources. Cite their preprint alongside deConfUSIon and the relevant atlas references. It was posted on 14 October 2026 and had not been peer reviewed. These integration screenshots do not reproduce paper figures.</w:t>
+      </w:r>
+    </w:p>
+    <w:p>
+      <w:r>
+        <w:t>Karamanlis D, Xie Y, Foucher CG, Alappat M, Masood A, Dimitropoulou I, Pivron LAF, Martínez de Paz JM, Macé E, Gaspari S, El-Boustani S. LightSuite: scalable atlas registration and cell detection across the central nervous system. bioRxiv (2026). doi:10.64898/2026.10.13.757638. https://doi.org/10.64898/2026.10.13.757638</w:t>
+      </w:r>
+    </w:p>
+    <w:p>
+      <w:r>
+        <w:t xml:space="preserve">ConfUSIus provides a complementary Python-based approach to fUSI analysis. deConfUSIon emphasizes a connected MATLAB GUI workflow for researchers who do not write </w:t>
+      </w:r>
+      <w:r>
+        <w:t>code. Thanks are due to ConfUSIus developers Samuel Le Meur-Diebolt and Felipe Cybis Pereira, and José María Martínez de Paz from Émilie Macé’s laboratory, for discussions. The projects are independently developed.</w:t>
       </w:r>
     </w:p>
     <w:p>
@@ -9457,8 +10321,8 @@
       </w:r>
     </w:p>
     <w:sectPr>
-      <w:headerReference w:type="default" r:id="rId45"/>
-      <w:footerReference w:type="default" r:id="rId46"/>
+      <w:headerReference w:type="default" r:id="rId58"/>
+      <w:footerReference w:type="default" r:id="rId59"/>
       <w:pgSz w:w="11906" w:h="16838"/>
       <w:pgMar w:top="1368" w:right="1008" w:bottom="1008" w:left="1008" w:header="360" w:footer="432" w:gutter="0"/>
       <w:cols w:space="720"/>
@@ -9503,7 +10367,7 @@
       <w:rPr>
         <w:sz w:val="16"/>
       </w:rPr>
-      <w:t xml:space="preserve">Practical manual | 15 October 2026 | </w:t>
+      <w:t xml:space="preserve">Practical manual | 21 October 2026 | </w:t>
     </w:r>
     <w:r>
       <w:fldChar w:fldCharType="begin"/>
@@ -9537,7 +10401,7 @@
       <w:rPr>
         <w:sz w:val="16"/>
       </w:rPr>
-      <w:t xml:space="preserve">Practical manual | 15 October 2026 | </w:t>
+      <w:t xml:space="preserve">Practical manual | 21 October 2026 | </w:t>
     </w:r>
     <w:r>
       <w:fldChar w:fldCharType="begin"/>
@@ -9571,7 +10435,7 @@
       <w:rPr>
         <w:sz w:val="16"/>
       </w:rPr>
-      <w:t xml:space="preserve">Practical manual | 15 October 2026 | </w:t>
+      <w:t xml:space="preserve">Practical manual | 21 October 2026 | </w:t>
     </w:r>
     <w:r>
       <w:fldChar w:fldCharType="begin"/>
@@ -9605,7 +10469,7 @@
       <w:rPr>
         <w:sz w:val="16"/>
       </w:rPr>
-      <w:t xml:space="preserve">Practical manual | 15 October 2026 | </w:t>
+      <w:t xml:space="preserve">Practical manual | 21 October 2026 | </w:t>
     </w:r>
     <w:r>
       <w:fldChar w:fldCharType="begin"/>
@@ -9620,7 +10484,7 @@
       <w:rPr>
         <w:noProof/>
       </w:rPr>
-      <w:t>27</w:t>
+      <w:t>26</w:t>
     </w:r>
     <w:r>
       <w:fldChar w:fldCharType="end"/>
@@ -9639,7 +10503,7 @@
       <w:rPr>
         <w:sz w:val="16"/>
       </w:rPr>
-      <w:t xml:space="preserve">Practical manual | 15 October 2026 | </w:t>
+      <w:t xml:space="preserve">Practical manual | 21 October 2026 | </w:t>
     </w:r>
     <w:r>
       <w:fldChar w:fldCharType="begin"/>
@@ -9654,7 +10518,7 @@
       <w:rPr>
         <w:noProof/>
       </w:rPr>
-      <w:t>28</w:t>
+      <w:t>27</w:t>
     </w:r>
     <w:r>
       <w:fldChar w:fldCharType="end"/>
@@ -9673,7 +10537,7 @@
       <w:rPr>
         <w:sz w:val="16"/>
       </w:rPr>
-      <w:t xml:space="preserve">Practical manual | 15 October 2026 | </w:t>
+      <w:t xml:space="preserve">Practical manual | 21 October 2026 | </w:t>
     </w:r>
     <w:r>
       <w:fldChar w:fldCharType="begin"/>
@@ -9688,7 +10552,7 @@
       <w:rPr>
         <w:noProof/>
       </w:rPr>
-      <w:t>29</w:t>
+      <w:t>28</w:t>
     </w:r>
     <w:r>
       <w:fldChar w:fldCharType="end"/>
@@ -9707,7 +10571,7 @@
       <w:rPr>
         <w:sz w:val="16"/>
       </w:rPr>
-      <w:t xml:space="preserve">Practical manual | 15 October 2026 | </w:t>
+      <w:t xml:space="preserve">Practical manual | 21 October 2026 | </w:t>
     </w:r>
     <w:r>
       <w:fldChar w:fldCharType="begin"/>
@@ -9722,7 +10586,143 @@
       <w:rPr>
         <w:noProof/>
       </w:rPr>
-      <w:t>30</w:t>
+      <w:t>29</w:t>
+    </w:r>
+    <w:r>
+      <w:fldChar w:fldCharType="end"/>
+    </w:r>
+  </w:p>
+</w:ftr>
+</file>
+
+<file path=word/footer16.xml><?xml version="1.0" encoding="utf-8"?>
+<w:ftr xmlns:wpc="http://schemas.microsoft.com/office/word/2010/wordprocessingCanvas" xmlns:cx="http://schemas.microsoft.com/office/drawing/2014/chartex" xmlns:cx1="http://schemas.microsoft.com/office/drawing/2015/9/8/chartex" xmlns:cx2="http://schemas.microsoft.com/office/drawing/2015/10/21/chartex" xmlns:cx3="http://schemas.microsoft.com/office/drawing/2016/5/9/chartex" xmlns:cx4="http://schemas.microsoft.com/office/drawing/2016/5/10/chartex" xmlns:cx5="http://schemas.microsoft.com/office/drawing/2016/5/11/chartex" xmlns:cx6="http://schemas.microsoft.com/office/drawing/2016/5/12/chartex" xmlns:cx7="http://schemas.microsoft.com/office/drawing/2016/5/13/chartex" xmlns:cx8="http://schemas.microsoft.com/office/drawing/2016/5/14/chartex" xmlns:mc="http://schemas.openxmlformats.org/markup-compatibility/2006" xmlns:aink="http://schemas.microsoft.com/office/drawing/2016/ink" xmlns:am3d="http://schemas.microsoft.com/office/drawing/2017/model3d" xmlns:o="urn:schemas-microsoft-com:office:office" xmlns:oel="http://schemas.microsoft.com/office/2019/extlst" xmlns:r="http://schemas.openxmlformats.org/officeDocument/2006/relationships" xmlns:m="http://schemas.openxmlformats.org/officeDocument/2006/math" xmlns:v="urn:schemas-microsoft-com:vml" xmlns:wp14="http://schemas.microsoft.com/office/word/2010/wordprocessingDrawing" xmlns:wp="http://schemas.openxmlformats.org/drawingml/2006/wordprocessingDrawing" xmlns:w10="urn:schemas-microsoft-com:office:word" xmlns:w="http://schemas.openxmlformats.org/wordprocessingml/2006/main" xmlns:w14="http://schemas.microsoft.com/office/word/2010/wordml" xmlns:w15="http://schemas.microsoft.com/office/word/2012/wordml" xmlns:w16cex="http://schemas.microsoft.com/office/word/2018/wordml/cex" xmlns:w16cid="http://schemas.microsoft.com/office/word/2016/wordml/cid" xmlns:w16="http://schemas.microsoft.com/office/word/2018/wordml" xmlns:w16sdtdh="http://schemas.microsoft.com/office/word/2020/wordml/sdtdatahash" xmlns:w16se="http://schemas.microsoft.com/office/word/2015/wordml/symex" xmlns:wpg="http://schemas.microsoft.com/office/word/2010/wordprocessingGroup" xmlns:wpi="http://schemas.microsoft.com/office/word/2010/wordprocessingInk" xmlns:wne="http://schemas.microsoft.com/office/word/2006/wordml" xmlns:wps="http://schemas.microsoft.com/office/word/2010/wordprocessingShape" mc:Ignorable="w14 w15 w16se w16cid w16 w16cex w16sdtdh wp14">
+  <w:p>
+    <w:pPr>
+      <w:jc w:val="right"/>
+    </w:pPr>
+    <w:r>
+      <w:rPr>
+        <w:sz w:val="16"/>
+      </w:rPr>
+      <w:t xml:space="preserve">Practical manual | 21 October 2026 | </w:t>
+    </w:r>
+    <w:r>
+      <w:fldChar w:fldCharType="begin"/>
+    </w:r>
+    <w:r>
+      <w:instrText xml:space="preserve"> PAGE </w:instrText>
+    </w:r>
+    <w:r>
+      <w:fldChar w:fldCharType="separate"/>
+    </w:r>
+    <w:r>
+      <w:rPr>
+        <w:noProof/>
+      </w:rPr>
+      <w:t>32</w:t>
+    </w:r>
+    <w:r>
+      <w:fldChar w:fldCharType="end"/>
+    </w:r>
+  </w:p>
+</w:ftr>
+</file>
+
+<file path=word/footer17.xml><?xml version="1.0" encoding="utf-8"?>
+<w:ftr xmlns:wpc="http://schemas.microsoft.com/office/word/2010/wordprocessingCanvas" xmlns:cx="http://schemas.microsoft.com/office/drawing/2014/chartex" xmlns:cx1="http://schemas.microsoft.com/office/drawing/2015/9/8/chartex" xmlns:cx2="http://schemas.microsoft.com/office/drawing/2015/10/21/chartex" xmlns:cx3="http://schemas.microsoft.com/office/drawing/2016/5/9/chartex" xmlns:cx4="http://schemas.microsoft.com/office/drawing/2016/5/10/chartex" xmlns:cx5="http://schemas.microsoft.com/office/drawing/2016/5/11/chartex" xmlns:cx6="http://schemas.microsoft.com/office/drawing/2016/5/12/chartex" xmlns:cx7="http://schemas.microsoft.com/office/drawing/2016/5/13/chartex" xmlns:cx8="http://schemas.microsoft.com/office/drawing/2016/5/14/chartex" xmlns:mc="http://schemas.openxmlformats.org/markup-compatibility/2006" xmlns:aink="http://schemas.microsoft.com/office/drawing/2016/ink" xmlns:am3d="http://schemas.microsoft.com/office/drawing/2017/model3d" xmlns:o="urn:schemas-microsoft-com:office:office" xmlns:oel="http://schemas.microsoft.com/office/2019/extlst" xmlns:r="http://schemas.openxmlformats.org/officeDocument/2006/relationships" xmlns:m="http://schemas.openxmlformats.org/officeDocument/2006/math" xmlns:v="urn:schemas-microsoft-com:vml" xmlns:wp14="http://schemas.microsoft.com/office/word/2010/wordprocessingDrawing" xmlns:wp="http://schemas.openxmlformats.org/drawingml/2006/wordprocessingDrawing" xmlns:w10="urn:schemas-microsoft-com:office:word" xmlns:w="http://schemas.openxmlformats.org/wordprocessingml/2006/main" xmlns:w14="http://schemas.microsoft.com/office/word/2010/wordml" xmlns:w15="http://schemas.microsoft.com/office/word/2012/wordml" xmlns:w16cex="http://schemas.microsoft.com/office/word/2018/wordml/cex" xmlns:w16cid="http://schemas.microsoft.com/office/word/2016/wordml/cid" xmlns:w16="http://schemas.microsoft.com/office/word/2018/wordml" xmlns:w16sdtdh="http://schemas.microsoft.com/office/word/2020/wordml/sdtdatahash" xmlns:w16se="http://schemas.microsoft.com/office/word/2015/wordml/symex" xmlns:wpg="http://schemas.microsoft.com/office/word/2010/wordprocessingGroup" xmlns:wpi="http://schemas.microsoft.com/office/word/2010/wordprocessingInk" xmlns:wne="http://schemas.microsoft.com/office/word/2006/wordml" xmlns:wps="http://schemas.microsoft.com/office/word/2010/wordprocessingShape" mc:Ignorable="w14 w15 w16se w16cid w16 w16cex w16sdtdh wp14">
+  <w:p>
+    <w:pPr>
+      <w:jc w:val="right"/>
+    </w:pPr>
+    <w:r>
+      <w:rPr>
+        <w:sz w:val="16"/>
+      </w:rPr>
+      <w:t xml:space="preserve">Practical manual | 21 October 2026 | </w:t>
+    </w:r>
+    <w:r>
+      <w:fldChar w:fldCharType="begin"/>
+    </w:r>
+    <w:r>
+      <w:instrText xml:space="preserve"> PAGE </w:instrText>
+    </w:r>
+    <w:r>
+      <w:fldChar w:fldCharType="separate"/>
+    </w:r>
+    <w:r>
+      <w:rPr>
+        <w:noProof/>
+      </w:rPr>
+      <w:t>33</w:t>
+    </w:r>
+    <w:r>
+      <w:fldChar w:fldCharType="end"/>
+    </w:r>
+  </w:p>
+</w:ftr>
+</file>
+
+<file path=word/footer18.xml><?xml version="1.0" encoding="utf-8"?>
+<w:ftr xmlns:wpc="http://schemas.microsoft.com/office/word/2010/wordprocessingCanvas" xmlns:cx="http://schemas.microsoft.com/office/drawing/2014/chartex" xmlns:cx1="http://schemas.microsoft.com/office/drawing/2015/9/8/chartex" xmlns:cx2="http://schemas.microsoft.com/office/drawing/2015/10/21/chartex" xmlns:cx3="http://schemas.microsoft.com/office/drawing/2016/5/9/chartex" xmlns:cx4="http://schemas.microsoft.com/office/drawing/2016/5/10/chartex" xmlns:cx5="http://schemas.microsoft.com/office/drawing/2016/5/11/chartex" xmlns:cx6="http://schemas.microsoft.com/office/drawing/2016/5/12/chartex" xmlns:cx7="http://schemas.microsoft.com/office/drawing/2016/5/13/chartex" xmlns:cx8="http://schemas.microsoft.com/office/drawing/2016/5/14/chartex" xmlns:mc="http://schemas.openxmlformats.org/markup-compatibility/2006" xmlns:aink="http://schemas.microsoft.com/office/drawing/2016/ink" xmlns:am3d="http://schemas.microsoft.com/office/drawing/2017/model3d" xmlns:o="urn:schemas-microsoft-com:office:office" xmlns:oel="http://schemas.microsoft.com/office/2019/extlst" xmlns:r="http://schemas.openxmlformats.org/officeDocument/2006/relationships" xmlns:m="http://schemas.openxmlformats.org/officeDocument/2006/math" xmlns:v="urn:schemas-microsoft-com:vml" xmlns:wp14="http://schemas.microsoft.com/office/word/2010/wordprocessingDrawing" xmlns:wp="http://schemas.openxmlformats.org/drawingml/2006/wordprocessingDrawing" xmlns:w10="urn:schemas-microsoft-com:office:word" xmlns:w="http://schemas.openxmlformats.org/wordprocessingml/2006/main" xmlns:w14="http://schemas.microsoft.com/office/word/2010/wordml" xmlns:w15="http://schemas.microsoft.com/office/word/2012/wordml" xmlns:w16cex="http://schemas.microsoft.com/office/word/2018/wordml/cex" xmlns:w16cid="http://schemas.microsoft.com/office/word/2016/wordml/cid" xmlns:w16="http://schemas.microsoft.com/office/word/2018/wordml" xmlns:w16sdtdh="http://schemas.microsoft.com/office/word/2020/wordml/sdtdatahash" xmlns:w16se="http://schemas.microsoft.com/office/word/2015/wordml/symex" xmlns:wpg="http://schemas.microsoft.com/office/word/2010/wordprocessingGroup" xmlns:wpi="http://schemas.microsoft.com/office/word/2010/wordprocessingInk" xmlns:wne="http://schemas.microsoft.com/office/word/2006/wordml" xmlns:wps="http://schemas.microsoft.com/office/word/2010/wordprocessingShape" mc:Ignorable="w14 w15 w16se w16cid w16 w16cex w16sdtdh wp14">
+  <w:p>
+    <w:pPr>
+      <w:jc w:val="right"/>
+    </w:pPr>
+    <w:r>
+      <w:rPr>
+        <w:sz w:val="16"/>
+      </w:rPr>
+      <w:t xml:space="preserve">Practical manual | 21 October 2026 | </w:t>
+    </w:r>
+    <w:r>
+      <w:fldChar w:fldCharType="begin"/>
+    </w:r>
+    <w:r>
+      <w:instrText xml:space="preserve"> PAGE </w:instrText>
+    </w:r>
+    <w:r>
+      <w:fldChar w:fldCharType="separate"/>
+    </w:r>
+    <w:r>
+      <w:rPr>
+        <w:noProof/>
+      </w:rPr>
+      <w:t>34</w:t>
+    </w:r>
+    <w:r>
+      <w:fldChar w:fldCharType="end"/>
+    </w:r>
+  </w:p>
+</w:ftr>
+</file>
+
+<file path=word/footer19.xml><?xml version="1.0" encoding="utf-8"?>
+<w:ftr xmlns:wpc="http://schemas.microsoft.com/office/word/2010/wordprocessingCanvas" xmlns:cx="http://schemas.microsoft.com/office/drawing/2014/chartex" xmlns:cx1="http://schemas.microsoft.com/office/drawing/2015/9/8/chartex" xmlns:cx2="http://schemas.microsoft.com/office/drawing/2015/10/21/chartex" xmlns:cx3="http://schemas.microsoft.com/office/drawing/2016/5/9/chartex" xmlns:cx4="http://schemas.microsoft.com/office/drawing/2016/5/10/chartex" xmlns:cx5="http://schemas.microsoft.com/office/drawing/2016/5/11/chartex" xmlns:cx6="http://schemas.microsoft.com/office/drawing/2016/5/12/chartex" xmlns:cx7="http://schemas.microsoft.com/office/drawing/2016/5/13/chartex" xmlns:cx8="http://schemas.microsoft.com/office/drawing/2016/5/14/chartex" xmlns:mc="http://schemas.openxmlformats.org/markup-compatibility/2006" xmlns:aink="http://schemas.microsoft.com/office/drawing/2016/ink" xmlns:am3d="http://schemas.microsoft.com/office/drawing/2017/model3d" xmlns:o="urn:schemas-microsoft-com:office:office" xmlns:oel="http://schemas.microsoft.com/office/2019/extlst" xmlns:r="http://schemas.openxmlformats.org/officeDocument/2006/relationships" xmlns:m="http://schemas.openxmlformats.org/officeDocument/2006/math" xmlns:v="urn:schemas-microsoft-com:vml" xmlns:wp14="http://schemas.microsoft.com/office/word/2010/wordprocessingDrawing" xmlns:wp="http://schemas.openxmlformats.org/drawingml/2006/wordprocessingDrawing" xmlns:w10="urn:schemas-microsoft-com:office:word" xmlns:w="http://schemas.openxmlformats.org/wordprocessingml/2006/main" xmlns:w14="http://schemas.microsoft.com/office/word/2010/wordml" xmlns:w15="http://schemas.microsoft.com/office/word/2012/wordml" xmlns:w16cex="http://schemas.microsoft.com/office/word/2018/wordml/cex" xmlns:w16cid="http://schemas.microsoft.com/office/word/2016/wordml/cid" xmlns:w16="http://schemas.microsoft.com/office/word/2018/wordml" xmlns:w16sdtdh="http://schemas.microsoft.com/office/word/2020/wordml/sdtdatahash" xmlns:w16se="http://schemas.microsoft.com/office/word/2015/wordml/symex" xmlns:wpg="http://schemas.microsoft.com/office/word/2010/wordprocessingGroup" xmlns:wpi="http://schemas.microsoft.com/office/word/2010/wordprocessingInk" xmlns:wne="http://schemas.microsoft.com/office/word/2006/wordml" xmlns:wps="http://schemas.microsoft.com/office/word/2010/wordprocessingShape" mc:Ignorable="w14 w15 w16se w16cid w16 w16cex w16sdtdh wp14">
+  <w:p>
+    <w:pPr>
+      <w:jc w:val="right"/>
+    </w:pPr>
+    <w:r>
+      <w:rPr>
+        <w:sz w:val="16"/>
+      </w:rPr>
+      <w:t xml:space="preserve">Practical manual | 21 October 2026 | </w:t>
+    </w:r>
+    <w:r>
+      <w:fldChar w:fldCharType="begin"/>
+    </w:r>
+    <w:r>
+      <w:instrText xml:space="preserve"> PAGE </w:instrText>
+    </w:r>
+    <w:r>
+      <w:fldChar w:fldCharType="separate"/>
+    </w:r>
+    <w:r>
+      <w:rPr>
+        <w:noProof/>
+      </w:rPr>
+      <w:t>35</w:t>
     </w:r>
     <w:r>
       <w:fldChar w:fldCharType="end"/>
@@ -9741,7 +10741,7 @@
       <w:rPr>
         <w:sz w:val="16"/>
       </w:rPr>
-      <w:t xml:space="preserve">Practical manual | 15 October 2026 | </w:t>
+      <w:t xml:space="preserve">Practical manual | 21 October 2026 | </w:t>
     </w:r>
     <w:r>
       <w:fldChar w:fldCharType="begin"/>
@@ -9775,7 +10775,7 @@
       <w:rPr>
         <w:sz w:val="16"/>
       </w:rPr>
-      <w:t xml:space="preserve">Practical manual | 15 October 2026 | </w:t>
+      <w:t xml:space="preserve">Practical manual | 21 October 2026 | </w:t>
     </w:r>
     <w:r>
       <w:fldChar w:fldCharType="begin"/>
@@ -9809,7 +10809,7 @@
       <w:rPr>
         <w:sz w:val="16"/>
       </w:rPr>
-      <w:t xml:space="preserve">Practical manual | 15 October 2026 | </w:t>
+      <w:t xml:space="preserve">Practical manual | 21 October 2026 | </w:t>
     </w:r>
     <w:r>
       <w:fldChar w:fldCharType="begin"/>
@@ -9843,7 +10843,7 @@
       <w:rPr>
         <w:sz w:val="16"/>
       </w:rPr>
-      <w:t xml:space="preserve">Practical manual | 15 October 2026 | </w:t>
+      <w:t xml:space="preserve">Practical manual | 21 October 2026 | </w:t>
     </w:r>
     <w:r>
       <w:fldChar w:fldCharType="begin"/>
@@ -9877,7 +10877,7 @@
       <w:rPr>
         <w:sz w:val="16"/>
       </w:rPr>
-      <w:t xml:space="preserve">Practical manual | 15 October 2026 | </w:t>
+      <w:t xml:space="preserve">Practical manual | 21 October 2026 | </w:t>
     </w:r>
     <w:r>
       <w:fldChar w:fldCharType="begin"/>
@@ -9911,7 +10911,7 @@
       <w:rPr>
         <w:sz w:val="16"/>
       </w:rPr>
-      <w:t xml:space="preserve">Practical manual | 15 October 2026 | </w:t>
+      <w:t xml:space="preserve">Practical manual | 21 October 2026 | </w:t>
     </w:r>
     <w:r>
       <w:fldChar w:fldCharType="begin"/>
@@ -9945,7 +10945,7 @@
       <w:rPr>
         <w:sz w:val="16"/>
       </w:rPr>
-      <w:t xml:space="preserve">Practical manual | 15 October 2026 | </w:t>
+      <w:t xml:space="preserve">Practical manual | 21 October 2026 | </w:t>
     </w:r>
     <w:r>
       <w:fldChar w:fldCharType="begin"/>
@@ -9979,7 +10979,7 @@
       <w:rPr>
         <w:sz w:val="16"/>
       </w:rPr>
-      <w:t xml:space="preserve">Practical manual | 15 October 2026 | </w:t>
+      <w:t xml:space="preserve">Practical manual | 21 October 2026 | </w:t>
     </w:r>
     <w:r>
       <w:fldChar w:fldCharType="begin"/>
@@ -10057,7 +11057,7 @@
               <w:sz w:val="18"/>
             </w:rPr>
             <w:drawing>
-              <wp:inline distT="0" distB="0" distL="0" distR="0" wp14:anchorId="286F1700" wp14:editId="48D22567">
+              <wp:inline distT="0" distB="0" distL="0" distR="0">
                 <wp:extent cx="283464" cy="283464"/>
                 <wp:effectExtent l="0" t="0" r="0" b="0"/>
                 <wp:docPr id="1" name="Picture 1"/>
@@ -10183,7 +11183,7 @@
               <w:sz w:val="18"/>
             </w:rPr>
             <w:drawing>
-              <wp:inline distT="0" distB="0" distL="0" distR="0" wp14:anchorId="01AF6800" wp14:editId="41358704">
+              <wp:inline distT="0" distB="0" distL="0" distR="0">
                 <wp:extent cx="283464" cy="283464"/>
                 <wp:effectExtent l="0" t="0" r="0" b="0"/>
                 <wp:docPr id="16" name="Picture 16"/>
@@ -10259,7 +11259,13 @@
             <w:rPr>
               <w:sz w:val="18"/>
             </w:rPr>
-            <w:t>MPI for Biological</w:t>
+            <w:t xml:space="preserve">MPI for </w:t>
+          </w:r>
+          <w:r>
+            <w:rPr>
+              <w:sz w:val="18"/>
+            </w:rPr>
+            <w:t>Biological</w:t>
           </w:r>
           <w:r>
             <w:rPr>
@@ -10309,7 +11315,7 @@
               <w:sz w:val="18"/>
             </w:rPr>
             <w:drawing>
-              <wp:inline distT="0" distB="0" distL="0" distR="0" wp14:anchorId="3D897514" wp14:editId="5D5D5BD4">
+              <wp:inline distT="0" distB="0" distL="0" distR="0">
                 <wp:extent cx="283464" cy="283464"/>
                 <wp:effectExtent l="0" t="0" r="0" b="0"/>
                 <wp:docPr id="17" name="Picture 17"/>
@@ -10435,7 +11441,7 @@
               <w:sz w:val="18"/>
             </w:rPr>
             <w:drawing>
-              <wp:inline distT="0" distB="0" distL="0" distR="0" wp14:anchorId="6198AC81" wp14:editId="391EBE8F">
+              <wp:inline distT="0" distB="0" distL="0" distR="0">
                 <wp:extent cx="283464" cy="283464"/>
                 <wp:effectExtent l="0" t="0" r="0" b="0"/>
                 <wp:docPr id="19" name="Picture 19"/>
@@ -10561,7 +11567,7 @@
               <w:sz w:val="18"/>
             </w:rPr>
             <w:drawing>
-              <wp:inline distT="0" distB="0" distL="0" distR="0" wp14:anchorId="6B814ACA" wp14:editId="5A1F153A">
+              <wp:inline distT="0" distB="0" distL="0" distR="0">
                 <wp:extent cx="283464" cy="283464"/>
                 <wp:effectExtent l="0" t="0" r="0" b="0"/>
                 <wp:docPr id="20" name="Picture 20"/>
@@ -10687,7 +11693,7 @@
               <w:sz w:val="18"/>
             </w:rPr>
             <w:drawing>
-              <wp:inline distT="0" distB="0" distL="0" distR="0" wp14:anchorId="757E36FF" wp14:editId="0610C82E">
+              <wp:inline distT="0" distB="0" distL="0" distR="0">
                 <wp:extent cx="283464" cy="283464"/>
                 <wp:effectExtent l="0" t="0" r="0" b="0"/>
                 <wp:docPr id="22" name="Picture 22"/>
@@ -10813,10 +11819,514 @@
               <w:sz w:val="18"/>
             </w:rPr>
             <w:drawing>
-              <wp:inline distT="0" distB="0" distL="0" distR="0" wp14:anchorId="4CDC43C8" wp14:editId="39213CE7">
+              <wp:inline distT="0" distB="0" distL="0" distR="0">
                 <wp:extent cx="283464" cy="283464"/>
                 <wp:effectExtent l="0" t="0" r="0" b="0"/>
                 <wp:docPr id="23" name="Picture 23"/>
+                <wp:cNvGraphicFramePr>
+                  <a:graphicFrameLocks xmlns:a="http://schemas.openxmlformats.org/drawingml/2006/main" noChangeAspect="1"/>
+                </wp:cNvGraphicFramePr>
+                <a:graphic xmlns:a="http://schemas.openxmlformats.org/drawingml/2006/main">
+                  <a:graphicData uri="http://schemas.openxmlformats.org/drawingml/2006/picture">
+                    <pic:pic xmlns:pic="http://schemas.openxmlformats.org/drawingml/2006/picture">
+                      <pic:nvPicPr>
+                        <pic:cNvPr id="0" name="brand_left_ppt.png"/>
+                        <pic:cNvPicPr/>
+                      </pic:nvPicPr>
+                      <pic:blipFill>
+                        <a:blip r:embed="rId1"/>
+                        <a:stretch>
+                          <a:fillRect/>
+                        </a:stretch>
+                      </pic:blipFill>
+                      <pic:spPr>
+                        <a:xfrm>
+                          <a:off x="0" y="0"/>
+                          <a:ext cx="283464" cy="283464"/>
+                        </a:xfrm>
+                        <a:prstGeom prst="rect">
+                          <a:avLst/>
+                        </a:prstGeom>
+                      </pic:spPr>
+                    </pic:pic>
+                  </a:graphicData>
+                </a:graphic>
+              </wp:inline>
+            </w:drawing>
+          </w:r>
+          <w:r>
+            <w:rPr>
+              <w:b/>
+              <w:sz w:val="18"/>
+            </w:rPr>
+            <w:t xml:space="preserve"> deConfUSIon</w:t>
+          </w:r>
+        </w:p>
+      </w:tc>
+      <w:tc>
+        <w:tcPr>
+          <w:tcW w:w="3758" w:type="dxa"/>
+          <w:vAlign w:val="center"/>
+        </w:tcPr>
+        <w:p>
+          <w:pPr>
+            <w:spacing w:after="0" w:line="240" w:lineRule="auto"/>
+            <w:jc w:val="center"/>
+          </w:pPr>
+          <w:r>
+            <w:rPr>
+              <w:sz w:val="18"/>
+            </w:rPr>
+            <w:t>by Soner Caner Cagun</w:t>
+          </w:r>
+        </w:p>
+      </w:tc>
+      <w:tc>
+        <w:tcPr>
+          <w:tcW w:w="3264" w:type="dxa"/>
+          <w:vAlign w:val="center"/>
+        </w:tcPr>
+        <w:p>
+          <w:pPr>
+            <w:spacing w:after="0" w:line="240" w:lineRule="auto"/>
+            <w:jc w:val="right"/>
+          </w:pPr>
+          <w:r>
+            <w:rPr>
+              <w:sz w:val="18"/>
+            </w:rPr>
+            <w:t>MPI for Biological</w:t>
+          </w:r>
+          <w:r>
+            <w:rPr>
+              <w:sz w:val="18"/>
+            </w:rPr>
+            <w:br/>
+            <w:t>Cybernetics</w:t>
+          </w:r>
+        </w:p>
+      </w:tc>
+    </w:tr>
+  </w:tbl>
+  <w:p>
+    <w:pPr>
+      <w:spacing w:after="0"/>
+    </w:pPr>
+  </w:p>
+</w:hdr>
+</file>
+
+<file path=word/header16.xml><?xml version="1.0" encoding="utf-8"?>
+<w:hdr xmlns:wpc="http://schemas.microsoft.com/office/word/2010/wordprocessingCanvas" xmlns:cx="http://schemas.microsoft.com/office/drawing/2014/chartex" xmlns:cx1="http://schemas.microsoft.com/office/drawing/2015/9/8/chartex" xmlns:cx2="http://schemas.microsoft.com/office/drawing/2015/10/21/chartex" xmlns:cx3="http://schemas.microsoft.com/office/drawing/2016/5/9/chartex" xmlns:cx4="http://schemas.microsoft.com/office/drawing/2016/5/10/chartex" xmlns:cx5="http://schemas.microsoft.com/office/drawing/2016/5/11/chartex" xmlns:cx6="http://schemas.microsoft.com/office/drawing/2016/5/12/chartex" xmlns:cx7="http://schemas.microsoft.com/office/drawing/2016/5/13/chartex" xmlns:cx8="http://schemas.microsoft.com/office/drawing/2016/5/14/chartex" xmlns:mc="http://schemas.openxmlformats.org/markup-compatibility/2006" xmlns:aink="http://schemas.microsoft.com/office/drawing/2016/ink" xmlns:am3d="http://schemas.microsoft.com/office/drawing/2017/model3d" xmlns:o="urn:schemas-microsoft-com:office:office" xmlns:oel="http://schemas.microsoft.com/office/2019/extlst" xmlns:r="http://schemas.openxmlformats.org/officeDocument/2006/relationships" xmlns:m="http://schemas.openxmlformats.org/officeDocument/2006/math" xmlns:v="urn:schemas-microsoft-com:vml" xmlns:wp14="http://schemas.microsoft.com/office/word/2010/wordprocessingDrawing" xmlns:wp="http://schemas.openxmlformats.org/drawingml/2006/wordprocessingDrawing" xmlns:w10="urn:schemas-microsoft-com:office:word" xmlns:w="http://schemas.openxmlformats.org/wordprocessingml/2006/main" xmlns:w14="http://schemas.microsoft.com/office/word/2010/wordml" xmlns:w15="http://schemas.microsoft.com/office/word/2012/wordml" xmlns:w16cex="http://schemas.microsoft.com/office/word/2018/wordml/cex" xmlns:w16cid="http://schemas.microsoft.com/office/word/2016/wordml/cid" xmlns:w16="http://schemas.microsoft.com/office/word/2018/wordml" xmlns:w16sdtdh="http://schemas.microsoft.com/office/word/2020/wordml/sdtdatahash" xmlns:w16se="http://schemas.microsoft.com/office/word/2015/wordml/symex" xmlns:wpg="http://schemas.microsoft.com/office/word/2010/wordprocessingGroup" xmlns:wpi="http://schemas.microsoft.com/office/word/2010/wordprocessingInk" xmlns:wne="http://schemas.microsoft.com/office/word/2006/wordml" xmlns:wps="http://schemas.microsoft.com/office/word/2010/wordprocessingShape" mc:Ignorable="w14 w15 w16se w16cid w16 w16cex w16sdtdh wp14">
+  <w:tbl>
+    <w:tblPr>
+      <w:tblW w:w="0" w:type="auto"/>
+      <w:tblLayout w:type="fixed"/>
+      <w:tblLook w:val="04A0" w:firstRow="1" w:lastRow="0" w:firstColumn="1" w:lastColumn="0" w:noHBand="0" w:noVBand="1"/>
+    </w:tblPr>
+    <w:tblGrid>
+      <w:gridCol w:w="6320"/>
+      <w:gridCol w:w="8282"/>
+      <w:gridCol w:w="7192"/>
+    </w:tblGrid>
+    <w:tr>
+      <w:tc>
+        <w:tcPr>
+          <w:tcW w:w="6320" w:type="dxa"/>
+          <w:vAlign w:val="center"/>
+        </w:tcPr>
+        <w:p>
+          <w:pPr>
+            <w:spacing w:after="0" w:line="240" w:lineRule="auto"/>
+          </w:pPr>
+          <w:r>
+            <w:rPr>
+              <w:noProof/>
+              <w:sz w:val="18"/>
+            </w:rPr>
+            <w:drawing>
+              <wp:inline distT="0" distB="0" distL="0" distR="0">
+                <wp:extent cx="283464" cy="283464"/>
+                <wp:effectExtent l="0" t="0" r="0" b="0"/>
+                <wp:docPr id="25" name="Picture 25"/>
+                <wp:cNvGraphicFramePr>
+                  <a:graphicFrameLocks xmlns:a="http://schemas.openxmlformats.org/drawingml/2006/main" noChangeAspect="1"/>
+                </wp:cNvGraphicFramePr>
+                <a:graphic xmlns:a="http://schemas.openxmlformats.org/drawingml/2006/main">
+                  <a:graphicData uri="http://schemas.openxmlformats.org/drawingml/2006/picture">
+                    <pic:pic xmlns:pic="http://schemas.openxmlformats.org/drawingml/2006/picture">
+                      <pic:nvPicPr>
+                        <pic:cNvPr id="0" name="brand_left_ppt.png"/>
+                        <pic:cNvPicPr/>
+                      </pic:nvPicPr>
+                      <pic:blipFill>
+                        <a:blip r:embed="rId1"/>
+                        <a:stretch>
+                          <a:fillRect/>
+                        </a:stretch>
+                      </pic:blipFill>
+                      <pic:spPr>
+                        <a:xfrm>
+                          <a:off x="0" y="0"/>
+                          <a:ext cx="283464" cy="283464"/>
+                        </a:xfrm>
+                        <a:prstGeom prst="rect">
+                          <a:avLst/>
+                        </a:prstGeom>
+                      </pic:spPr>
+                    </pic:pic>
+                  </a:graphicData>
+                </a:graphic>
+              </wp:inline>
+            </w:drawing>
+          </w:r>
+          <w:r>
+            <w:rPr>
+              <w:b/>
+              <w:sz w:val="18"/>
+            </w:rPr>
+            <w:t xml:space="preserve"> deConfUSIon</w:t>
+          </w:r>
+        </w:p>
+      </w:tc>
+      <w:tc>
+        <w:tcPr>
+          <w:tcW w:w="8282" w:type="dxa"/>
+          <w:vAlign w:val="center"/>
+        </w:tcPr>
+        <w:p>
+          <w:pPr>
+            <w:spacing w:after="0" w:line="240" w:lineRule="auto"/>
+            <w:jc w:val="center"/>
+          </w:pPr>
+          <w:r>
+            <w:rPr>
+              <w:sz w:val="18"/>
+            </w:rPr>
+            <w:t>by Soner Caner Cagun</w:t>
+          </w:r>
+        </w:p>
+      </w:tc>
+      <w:tc>
+        <w:tcPr>
+          <w:tcW w:w="7192" w:type="dxa"/>
+          <w:vAlign w:val="center"/>
+        </w:tcPr>
+        <w:p>
+          <w:pPr>
+            <w:spacing w:after="0" w:line="240" w:lineRule="auto"/>
+            <w:jc w:val="right"/>
+          </w:pPr>
+          <w:r>
+            <w:rPr>
+              <w:sz w:val="18"/>
+            </w:rPr>
+            <w:t>MPI for Biological</w:t>
+          </w:r>
+          <w:r>
+            <w:rPr>
+              <w:sz w:val="18"/>
+            </w:rPr>
+            <w:br/>
+            <w:t>Cybernetics</w:t>
+          </w:r>
+        </w:p>
+      </w:tc>
+    </w:tr>
+  </w:tbl>
+  <w:p>
+    <w:pPr>
+      <w:spacing w:after="0"/>
+    </w:pPr>
+  </w:p>
+</w:hdr>
+</file>
+
+<file path=word/header17.xml><?xml version="1.0" encoding="utf-8"?>
+<w:hdr xmlns:wpc="http://schemas.microsoft.com/office/word/2010/wordprocessingCanvas" xmlns:cx="http://schemas.microsoft.com/office/drawing/2014/chartex" xmlns:cx1="http://schemas.microsoft.com/office/drawing/2015/9/8/chartex" xmlns:cx2="http://schemas.microsoft.com/office/drawing/2015/10/21/chartex" xmlns:cx3="http://schemas.microsoft.com/office/drawing/2016/5/9/chartex" xmlns:cx4="http://schemas.microsoft.com/office/drawing/2016/5/10/chartex" xmlns:cx5="http://schemas.microsoft.com/office/drawing/2016/5/11/chartex" xmlns:cx6="http://schemas.microsoft.com/office/drawing/2016/5/12/chartex" xmlns:cx7="http://schemas.microsoft.com/office/drawing/2016/5/13/chartex" xmlns:cx8="http://schemas.microsoft.com/office/drawing/2016/5/14/chartex" xmlns:mc="http://schemas.openxmlformats.org/markup-compatibility/2006" xmlns:aink="http://schemas.microsoft.com/office/drawing/2016/ink" xmlns:am3d="http://schemas.microsoft.com/office/drawing/2017/model3d" xmlns:o="urn:schemas-microsoft-com:office:office" xmlns:oel="http://schemas.microsoft.com/office/2019/extlst" xmlns:r="http://schemas.openxmlformats.org/officeDocument/2006/relationships" xmlns:m="http://schemas.openxmlformats.org/officeDocument/2006/math" xmlns:v="urn:schemas-microsoft-com:vml" xmlns:wp14="http://schemas.microsoft.com/office/word/2010/wordprocessingDrawing" xmlns:wp="http://schemas.openxmlformats.org/drawingml/2006/wordprocessingDrawing" xmlns:w10="urn:schemas-microsoft-com:office:word" xmlns:w="http://schemas.openxmlformats.org/wordprocessingml/2006/main" xmlns:w14="http://schemas.microsoft.com/office/word/2010/wordml" xmlns:w15="http://schemas.microsoft.com/office/word/2012/wordml" xmlns:w16cex="http://schemas.microsoft.com/office/word/2018/wordml/cex" xmlns:w16cid="http://schemas.microsoft.com/office/word/2016/wordml/cid" xmlns:w16="http://schemas.microsoft.com/office/word/2018/wordml" xmlns:w16sdtdh="http://schemas.microsoft.com/office/word/2020/wordml/sdtdatahash" xmlns:w16se="http://schemas.microsoft.com/office/word/2015/wordml/symex" xmlns:wpg="http://schemas.microsoft.com/office/word/2010/wordprocessingGroup" xmlns:wpi="http://schemas.microsoft.com/office/word/2010/wordprocessingInk" xmlns:wne="http://schemas.microsoft.com/office/word/2006/wordml" xmlns:wps="http://schemas.microsoft.com/office/word/2010/wordprocessingShape" mc:Ignorable="w14 w15 w16se w16cid w16 w16cex w16sdtdh wp14">
+  <w:tbl>
+    <w:tblPr>
+      <w:tblW w:w="0" w:type="auto"/>
+      <w:tblLayout w:type="fixed"/>
+      <w:tblLook w:val="04A0" w:firstRow="1" w:lastRow="0" w:firstColumn="1" w:lastColumn="0" w:noHBand="0" w:noVBand="1"/>
+    </w:tblPr>
+    <w:tblGrid>
+      <w:gridCol w:w="2868"/>
+      <w:gridCol w:w="3758"/>
+      <w:gridCol w:w="3264"/>
+    </w:tblGrid>
+    <w:tr>
+      <w:tc>
+        <w:tcPr>
+          <w:tcW w:w="2868" w:type="dxa"/>
+          <w:vAlign w:val="center"/>
+        </w:tcPr>
+        <w:p>
+          <w:pPr>
+            <w:spacing w:after="0" w:line="240" w:lineRule="auto"/>
+          </w:pPr>
+          <w:r>
+            <w:rPr>
+              <w:noProof/>
+              <w:sz w:val="18"/>
+            </w:rPr>
+            <w:drawing>
+              <wp:inline distT="0" distB="0" distL="0" distR="0">
+                <wp:extent cx="283464" cy="283464"/>
+                <wp:effectExtent l="0" t="0" r="0" b="0"/>
+                <wp:docPr id="26" name="Picture 26"/>
+                <wp:cNvGraphicFramePr>
+                  <a:graphicFrameLocks xmlns:a="http://schemas.openxmlformats.org/drawingml/2006/main" noChangeAspect="1"/>
+                </wp:cNvGraphicFramePr>
+                <a:graphic xmlns:a="http://schemas.openxmlformats.org/drawingml/2006/main">
+                  <a:graphicData uri="http://schemas.openxmlformats.org/drawingml/2006/picture">
+                    <pic:pic xmlns:pic="http://schemas.openxmlformats.org/drawingml/2006/picture">
+                      <pic:nvPicPr>
+                        <pic:cNvPr id="0" name="brand_left_ppt.png"/>
+                        <pic:cNvPicPr/>
+                      </pic:nvPicPr>
+                      <pic:blipFill>
+                        <a:blip r:embed="rId1"/>
+                        <a:stretch>
+                          <a:fillRect/>
+                        </a:stretch>
+                      </pic:blipFill>
+                      <pic:spPr>
+                        <a:xfrm>
+                          <a:off x="0" y="0"/>
+                          <a:ext cx="283464" cy="283464"/>
+                        </a:xfrm>
+                        <a:prstGeom prst="rect">
+                          <a:avLst/>
+                        </a:prstGeom>
+                      </pic:spPr>
+                    </pic:pic>
+                  </a:graphicData>
+                </a:graphic>
+              </wp:inline>
+            </w:drawing>
+          </w:r>
+          <w:r>
+            <w:rPr>
+              <w:b/>
+              <w:sz w:val="18"/>
+            </w:rPr>
+            <w:t xml:space="preserve"> deConfUSIon</w:t>
+          </w:r>
+        </w:p>
+      </w:tc>
+      <w:tc>
+        <w:tcPr>
+          <w:tcW w:w="3758" w:type="dxa"/>
+          <w:vAlign w:val="center"/>
+        </w:tcPr>
+        <w:p>
+          <w:pPr>
+            <w:spacing w:after="0" w:line="240" w:lineRule="auto"/>
+            <w:jc w:val="center"/>
+          </w:pPr>
+          <w:r>
+            <w:rPr>
+              <w:sz w:val="18"/>
+            </w:rPr>
+            <w:t>by Soner Caner Cagun</w:t>
+          </w:r>
+        </w:p>
+      </w:tc>
+      <w:tc>
+        <w:tcPr>
+          <w:tcW w:w="3264" w:type="dxa"/>
+          <w:vAlign w:val="center"/>
+        </w:tcPr>
+        <w:p>
+          <w:pPr>
+            <w:spacing w:after="0" w:line="240" w:lineRule="auto"/>
+            <w:jc w:val="right"/>
+          </w:pPr>
+          <w:r>
+            <w:rPr>
+              <w:sz w:val="18"/>
+            </w:rPr>
+            <w:t>MPI for Biological</w:t>
+          </w:r>
+          <w:r>
+            <w:rPr>
+              <w:sz w:val="18"/>
+            </w:rPr>
+            <w:br/>
+            <w:t>Cybernetics</w:t>
+          </w:r>
+        </w:p>
+      </w:tc>
+    </w:tr>
+  </w:tbl>
+  <w:p>
+    <w:pPr>
+      <w:spacing w:after="0"/>
+    </w:pPr>
+  </w:p>
+</w:hdr>
+</file>
+
+<file path=word/header18.xml><?xml version="1.0" encoding="utf-8"?>
+<w:hdr xmlns:wpc="http://schemas.microsoft.com/office/word/2010/wordprocessingCanvas" xmlns:cx="http://schemas.microsoft.com/office/drawing/2014/chartex" xmlns:cx1="http://schemas.microsoft.com/office/drawing/2015/9/8/chartex" xmlns:cx2="http://schemas.microsoft.com/office/drawing/2015/10/21/chartex" xmlns:cx3="http://schemas.microsoft.com/office/drawing/2016/5/9/chartex" xmlns:cx4="http://schemas.microsoft.com/office/drawing/2016/5/10/chartex" xmlns:cx5="http://schemas.microsoft.com/office/drawing/2016/5/11/chartex" xmlns:cx6="http://schemas.microsoft.com/office/drawing/2016/5/12/chartex" xmlns:cx7="http://schemas.microsoft.com/office/drawing/2016/5/13/chartex" xmlns:cx8="http://schemas.microsoft.com/office/drawing/2016/5/14/chartex" xmlns:mc="http://schemas.openxmlformats.org/markup-compatibility/2006" xmlns:aink="http://schemas.microsoft.com/office/drawing/2016/ink" xmlns:am3d="http://schemas.microsoft.com/office/drawing/2017/model3d" xmlns:o="urn:schemas-microsoft-com:office:office" xmlns:oel="http://schemas.microsoft.com/office/2019/extlst" xmlns:r="http://schemas.openxmlformats.org/officeDocument/2006/relationships" xmlns:m="http://schemas.openxmlformats.org/officeDocument/2006/math" xmlns:v="urn:schemas-microsoft-com:vml" xmlns:wp14="http://schemas.microsoft.com/office/word/2010/wordprocessingDrawing" xmlns:wp="http://schemas.openxmlformats.org/drawingml/2006/wordprocessingDrawing" xmlns:w10="urn:schemas-microsoft-com:office:word" xmlns:w="http://schemas.openxmlformats.org/wordprocessingml/2006/main" xmlns:w14="http://schemas.microsoft.com/office/word/2010/wordml" xmlns:w15="http://schemas.microsoft.com/office/word/2012/wordml" xmlns:w16cex="http://schemas.microsoft.com/office/word/2018/wordml/cex" xmlns:w16cid="http://schemas.microsoft.com/office/word/2016/wordml/cid" xmlns:w16="http://schemas.microsoft.com/office/word/2018/wordml" xmlns:w16sdtdh="http://schemas.microsoft.com/office/word/2020/wordml/sdtdatahash" xmlns:w16se="http://schemas.microsoft.com/office/word/2015/wordml/symex" xmlns:wpg="http://schemas.microsoft.com/office/word/2010/wordprocessingGroup" xmlns:wpi="http://schemas.microsoft.com/office/word/2010/wordprocessingInk" xmlns:wne="http://schemas.microsoft.com/office/word/2006/wordml" xmlns:wps="http://schemas.microsoft.com/office/word/2010/wordprocessingShape" mc:Ignorable="w14 w15 w16se w16cid w16 w16cex w16sdtdh wp14">
+  <w:tbl>
+    <w:tblPr>
+      <w:tblW w:w="0" w:type="auto"/>
+      <w:tblLayout w:type="fixed"/>
+      <w:tblLook w:val="04A0" w:firstRow="1" w:lastRow="0" w:firstColumn="1" w:lastColumn="0" w:noHBand="0" w:noVBand="1"/>
+    </w:tblPr>
+    <w:tblGrid>
+      <w:gridCol w:w="6320"/>
+      <w:gridCol w:w="8282"/>
+      <w:gridCol w:w="7192"/>
+    </w:tblGrid>
+    <w:tr>
+      <w:tc>
+        <w:tcPr>
+          <w:tcW w:w="6320" w:type="dxa"/>
+          <w:vAlign w:val="center"/>
+        </w:tcPr>
+        <w:p>
+          <w:pPr>
+            <w:spacing w:after="0" w:line="240" w:lineRule="auto"/>
+          </w:pPr>
+          <w:r>
+            <w:rPr>
+              <w:noProof/>
+              <w:sz w:val="18"/>
+            </w:rPr>
+            <w:drawing>
+              <wp:inline distT="0" distB="0" distL="0" distR="0">
+                <wp:extent cx="283464" cy="283464"/>
+                <wp:effectExtent l="0" t="0" r="0" b="0"/>
+                <wp:docPr id="28" name="Picture 28"/>
+                <wp:cNvGraphicFramePr>
+                  <a:graphicFrameLocks xmlns:a="http://schemas.openxmlformats.org/drawingml/2006/main" noChangeAspect="1"/>
+                </wp:cNvGraphicFramePr>
+                <a:graphic xmlns:a="http://schemas.openxmlformats.org/drawingml/2006/main">
+                  <a:graphicData uri="http://schemas.openxmlformats.org/drawingml/2006/picture">
+                    <pic:pic xmlns:pic="http://schemas.openxmlformats.org/drawingml/2006/picture">
+                      <pic:nvPicPr>
+                        <pic:cNvPr id="0" name="brand_left_ppt.png"/>
+                        <pic:cNvPicPr/>
+                      </pic:nvPicPr>
+                      <pic:blipFill>
+                        <a:blip r:embed="rId1"/>
+                        <a:stretch>
+                          <a:fillRect/>
+                        </a:stretch>
+                      </pic:blipFill>
+                      <pic:spPr>
+                        <a:xfrm>
+                          <a:off x="0" y="0"/>
+                          <a:ext cx="283464" cy="283464"/>
+                        </a:xfrm>
+                        <a:prstGeom prst="rect">
+                          <a:avLst/>
+                        </a:prstGeom>
+                      </pic:spPr>
+                    </pic:pic>
+                  </a:graphicData>
+                </a:graphic>
+              </wp:inline>
+            </w:drawing>
+          </w:r>
+          <w:r>
+            <w:rPr>
+              <w:b/>
+              <w:sz w:val="18"/>
+            </w:rPr>
+            <w:t xml:space="preserve"> deConfUSIon</w:t>
+          </w:r>
+        </w:p>
+      </w:tc>
+      <w:tc>
+        <w:tcPr>
+          <w:tcW w:w="8282" w:type="dxa"/>
+          <w:vAlign w:val="center"/>
+        </w:tcPr>
+        <w:p>
+          <w:pPr>
+            <w:spacing w:after="0" w:line="240" w:lineRule="auto"/>
+            <w:jc w:val="center"/>
+          </w:pPr>
+          <w:r>
+            <w:rPr>
+              <w:sz w:val="18"/>
+            </w:rPr>
+            <w:t>by Soner Caner Cagun</w:t>
+          </w:r>
+        </w:p>
+      </w:tc>
+      <w:tc>
+        <w:tcPr>
+          <w:tcW w:w="7192" w:type="dxa"/>
+          <w:vAlign w:val="center"/>
+        </w:tcPr>
+        <w:p>
+          <w:pPr>
+            <w:spacing w:after="0" w:line="240" w:lineRule="auto"/>
+            <w:jc w:val="right"/>
+          </w:pPr>
+          <w:r>
+            <w:rPr>
+              <w:sz w:val="18"/>
+            </w:rPr>
+            <w:t>MPI for Biological</w:t>
+          </w:r>
+          <w:r>
+            <w:rPr>
+              <w:sz w:val="18"/>
+            </w:rPr>
+            <w:br/>
+            <w:t>Cybernetics</w:t>
+          </w:r>
+        </w:p>
+      </w:tc>
+    </w:tr>
+  </w:tbl>
+  <w:p>
+    <w:pPr>
+      <w:spacing w:after="0"/>
+    </w:pPr>
+  </w:p>
+</w:hdr>
+</file>
+
+<file path=word/header19.xml><?xml version="1.0" encoding="utf-8"?>
+<w:hdr xmlns:wpc="http://schemas.microsoft.com/office/word/2010/wordprocessingCanvas" xmlns:cx="http://schemas.microsoft.com/office/drawing/2014/chartex" xmlns:cx1="http://schemas.microsoft.com/office/drawing/2015/9/8/chartex" xmlns:cx2="http://schemas.microsoft.com/office/drawing/2015/10/21/chartex" xmlns:cx3="http://schemas.microsoft.com/office/drawing/2016/5/9/chartex" xmlns:cx4="http://schemas.microsoft.com/office/drawing/2016/5/10/chartex" xmlns:cx5="http://schemas.microsoft.com/office/drawing/2016/5/11/chartex" xmlns:cx6="http://schemas.microsoft.com/office/drawing/2016/5/12/chartex" xmlns:cx7="http://schemas.microsoft.com/office/drawing/2016/5/13/chartex" xmlns:cx8="http://schemas.microsoft.com/office/drawing/2016/5/14/chartex" xmlns:mc="http://schemas.openxmlformats.org/markup-compatibility/2006" xmlns:aink="http://schemas.microsoft.com/office/drawing/2016/ink" xmlns:am3d="http://schemas.microsoft.com/office/drawing/2017/model3d" xmlns:o="urn:schemas-microsoft-com:office:office" xmlns:oel="http://schemas.microsoft.com/office/2019/extlst" xmlns:r="http://schemas.openxmlformats.org/officeDocument/2006/relationships" xmlns:m="http://schemas.openxmlformats.org/officeDocument/2006/math" xmlns:v="urn:schemas-microsoft-com:vml" xmlns:wp14="http://schemas.microsoft.com/office/word/2010/wordprocessingDrawing" xmlns:wp="http://schemas.openxmlformats.org/drawingml/2006/wordprocessingDrawing" xmlns:w10="urn:schemas-microsoft-com:office:word" xmlns:w="http://schemas.openxmlformats.org/wordprocessingml/2006/main" xmlns:w14="http://schemas.microsoft.com/office/word/2010/wordml" xmlns:w15="http://schemas.microsoft.com/office/word/2012/wordml" xmlns:w16cex="http://schemas.microsoft.com/office/word/2018/wordml/cex" xmlns:w16cid="http://schemas.microsoft.com/office/word/2016/wordml/cid" xmlns:w16="http://schemas.microsoft.com/office/word/2018/wordml" xmlns:w16sdtdh="http://schemas.microsoft.com/office/word/2020/wordml/sdtdatahash" xmlns:w16se="http://schemas.microsoft.com/office/word/2015/wordml/symex" xmlns:wpg="http://schemas.microsoft.com/office/word/2010/wordprocessingGroup" xmlns:wpi="http://schemas.microsoft.com/office/word/2010/wordprocessingInk" xmlns:wne="http://schemas.microsoft.com/office/word/2006/wordml" xmlns:wps="http://schemas.microsoft.com/office/word/2010/wordprocessingShape" mc:Ignorable="w14 w15 w16se w16cid w16 w16cex w16sdtdh wp14">
+  <w:tbl>
+    <w:tblPr>
+      <w:tblW w:w="0" w:type="auto"/>
+      <w:tblLayout w:type="fixed"/>
+      <w:tblLook w:val="04A0" w:firstRow="1" w:lastRow="0" w:firstColumn="1" w:lastColumn="0" w:noHBand="0" w:noVBand="1"/>
+    </w:tblPr>
+    <w:tblGrid>
+      <w:gridCol w:w="2868"/>
+      <w:gridCol w:w="3758"/>
+      <w:gridCol w:w="3264"/>
+    </w:tblGrid>
+    <w:tr>
+      <w:tc>
+        <w:tcPr>
+          <w:tcW w:w="2868" w:type="dxa"/>
+          <w:vAlign w:val="center"/>
+        </w:tcPr>
+        <w:p>
+          <w:pPr>
+            <w:spacing w:after="0" w:line="240" w:lineRule="auto"/>
+          </w:pPr>
+          <w:r>
+            <w:rPr>
+              <w:noProof/>
+              <w:sz w:val="18"/>
+            </w:rPr>
+            <w:drawing>
+              <wp:inline distT="0" distB="0" distL="0" distR="0">
+                <wp:extent cx="283464" cy="283464"/>
+                <wp:effectExtent l="0" t="0" r="0" b="0"/>
+                <wp:docPr id="29" name="Picture 29"/>
                 <wp:cNvGraphicFramePr>
                   <a:graphicFrameLocks xmlns:a="http://schemas.openxmlformats.org/drawingml/2006/main" noChangeAspect="1"/>
                 </wp:cNvGraphicFramePr>
@@ -10939,7 +12449,7 @@
               <w:sz w:val="18"/>
             </w:rPr>
             <w:drawing>
-              <wp:inline distT="0" distB="0" distL="0" distR="0" wp14:anchorId="40F1C86B" wp14:editId="16A28F35">
+              <wp:inline distT="0" distB="0" distL="0" distR="0">
                 <wp:extent cx="283464" cy="283464"/>
                 <wp:effectExtent l="0" t="0" r="0" b="0"/>
                 <wp:docPr id="3" name="Picture 3"/>
@@ -11015,7 +12525,13 @@
             <w:rPr>
               <w:sz w:val="18"/>
             </w:rPr>
-            <w:t>MPI for Biological</w:t>
+            <w:t xml:space="preserve">MPI for </w:t>
+          </w:r>
+          <w:r>
+            <w:rPr>
+              <w:sz w:val="18"/>
+            </w:rPr>
+            <w:t>Biological</w:t>
           </w:r>
           <w:r>
             <w:rPr>
@@ -11065,7 +12581,7 @@
               <w:sz w:val="18"/>
             </w:rPr>
             <w:drawing>
-              <wp:inline distT="0" distB="0" distL="0" distR="0" wp14:anchorId="755CB207" wp14:editId="0026A537">
+              <wp:inline distT="0" distB="0" distL="0" distR="0">
                 <wp:extent cx="283464" cy="283464"/>
                 <wp:effectExtent l="0" t="0" r="0" b="0"/>
                 <wp:docPr id="5" name="Picture 5"/>
@@ -11191,7 +12707,7 @@
               <w:sz w:val="18"/>
             </w:rPr>
             <w:drawing>
-              <wp:inline distT="0" distB="0" distL="0" distR="0" wp14:anchorId="659CED65" wp14:editId="504C214C">
+              <wp:inline distT="0" distB="0" distL="0" distR="0">
                 <wp:extent cx="283464" cy="283464"/>
                 <wp:effectExtent l="0" t="0" r="0" b="0"/>
                 <wp:docPr id="7" name="Picture 7"/>
@@ -11317,7 +12833,7 @@
               <w:sz w:val="18"/>
             </w:rPr>
             <w:drawing>
-              <wp:inline distT="0" distB="0" distL="0" distR="0" wp14:anchorId="13A62E2A" wp14:editId="6945B4A8">
+              <wp:inline distT="0" distB="0" distL="0" distR="0">
                 <wp:extent cx="283464" cy="283464"/>
                 <wp:effectExtent l="0" t="0" r="0" b="0"/>
                 <wp:docPr id="8" name="Picture 8"/>
@@ -11443,7 +12959,7 @@
               <w:sz w:val="18"/>
             </w:rPr>
             <w:drawing>
-              <wp:inline distT="0" distB="0" distL="0" distR="0" wp14:anchorId="32308219" wp14:editId="09FBD699">
+              <wp:inline distT="0" distB="0" distL="0" distR="0">
                 <wp:extent cx="283464" cy="283464"/>
                 <wp:effectExtent l="0" t="0" r="0" b="0"/>
                 <wp:docPr id="10" name="Picture 10"/>
@@ -11569,7 +13085,7 @@
               <w:sz w:val="18"/>
             </w:rPr>
             <w:drawing>
-              <wp:inline distT="0" distB="0" distL="0" distR="0" wp14:anchorId="1D645312" wp14:editId="2CD3A8D1">
+              <wp:inline distT="0" distB="0" distL="0" distR="0">
                 <wp:extent cx="283464" cy="283464"/>
                 <wp:effectExtent l="0" t="0" r="0" b="0"/>
                 <wp:docPr id="11" name="Picture 11"/>
@@ -11695,7 +13211,7 @@
               <w:sz w:val="18"/>
             </w:rPr>
             <w:drawing>
-              <wp:inline distT="0" distB="0" distL="0" distR="0" wp14:anchorId="4F001425" wp14:editId="5111AE73">
+              <wp:inline distT="0" distB="0" distL="0" distR="0">
                 <wp:extent cx="283464" cy="283464"/>
                 <wp:effectExtent l="0" t="0" r="0" b="0"/>
                 <wp:docPr id="13" name="Picture 13"/>
@@ -11821,7 +13337,7 @@
               <w:sz w:val="18"/>
             </w:rPr>
             <w:drawing>
-              <wp:inline distT="0" distB="0" distL="0" distR="0" wp14:anchorId="2E5E57E8" wp14:editId="745F28DC">
+              <wp:inline distT="0" distB="0" distL="0" distR="0">
                 <wp:extent cx="283464" cy="283464"/>
                 <wp:effectExtent l="0" t="0" r="0" b="0"/>
                 <wp:docPr id="14" name="Picture 14"/>
@@ -12091,31 +13607,31 @@
       </w:rPr>
     </w:lvl>
   </w:abstractNum>
-  <w:num w:numId="1" w16cid:durableId="606502058">
+  <w:num w:numId="1" w16cid:durableId="149446776">
     <w:abstractNumId w:val="8"/>
   </w:num>
-  <w:num w:numId="2" w16cid:durableId="1205826831">
+  <w:num w:numId="2" w16cid:durableId="647978024">
     <w:abstractNumId w:val="6"/>
   </w:num>
-  <w:num w:numId="3" w16cid:durableId="298531587">
+  <w:num w:numId="3" w16cid:durableId="1465539574">
     <w:abstractNumId w:val="5"/>
   </w:num>
-  <w:num w:numId="4" w16cid:durableId="1103695892">
+  <w:num w:numId="4" w16cid:durableId="884370215">
     <w:abstractNumId w:val="4"/>
   </w:num>
-  <w:num w:numId="5" w16cid:durableId="2064324276">
+  <w:num w:numId="5" w16cid:durableId="801656418">
     <w:abstractNumId w:val="7"/>
   </w:num>
-  <w:num w:numId="6" w16cid:durableId="705183958">
+  <w:num w:numId="6" w16cid:durableId="21176479">
     <w:abstractNumId w:val="3"/>
   </w:num>
-  <w:num w:numId="7" w16cid:durableId="913857195">
+  <w:num w:numId="7" w16cid:durableId="787892669">
     <w:abstractNumId w:val="2"/>
   </w:num>
-  <w:num w:numId="8" w16cid:durableId="135101192">
+  <w:num w:numId="8" w16cid:durableId="1737052453">
     <w:abstractNumId w:val="1"/>
   </w:num>
-  <w:num w:numId="9" w16cid:durableId="609893161">
+  <w:num w:numId="9" w16cid:durableId="1408915746">
     <w:abstractNumId w:val="0"/>
   </w:num>
 </w:numbering>
@@ -23567,7 +25083,7 @@
     <w:autoRedefine/>
     <w:uiPriority w:val="39"/>
     <w:unhideWhenUsed/>
-    <w:rsid w:val="00830336"/>
+    <w:rsid w:val="00D963DB"/>
     <w:pPr>
       <w:spacing w:after="100"/>
     </w:pPr>
@@ -23579,7 +25095,7 @@
     <w:autoRedefine/>
     <w:uiPriority w:val="39"/>
     <w:unhideWhenUsed/>
-    <w:rsid w:val="00830336"/>
+    <w:rsid w:val="00D963DB"/>
     <w:pPr>
       <w:spacing w:after="100"/>
       <w:ind w:left="220"/>
@@ -23590,7 +25106,7 @@
     <w:basedOn w:val="DefaultParagraphFont"/>
     <w:uiPriority w:val="99"/>
     <w:unhideWhenUsed/>
-    <w:rsid w:val="00830336"/>
+    <w:rsid w:val="00D963DB"/>
     <w:rPr>
       <w:color w:val="0000FF" w:themeColor="hyperlink"/>
       <w:u w:val="single"/>

</xml_diff>

<commit_message>
Update group analysis, publication exports and multilingual guides
</commit_message>
<xml_diff>
--- a/docs/deConfUSIon_User_Manual.docx
+++ b/docs/deConfUSIon_User_Manual.docx
@@ -33,7 +33,7 @@
       </w:r>
       <w:r>
         <w:br/>
-        <w:t>21 October 2026</w:t>
+        <w:t>29 October 2026</w:t>
       </w:r>
     </w:p>
     <w:p>
@@ -95,7 +95,7 @@
       <w:r>
         <w:fldChar w:fldCharType="separate"/>
       </w:r>
-      <w:hyperlink w:anchor="_Toc243479451" w:history="1">
+      <w:hyperlink w:anchor="_Toc244186059" w:history="1">
         <w:r>
           <w:rPr>
             <w:rStyle w:val="Hyperlink"/>
@@ -122,7 +122,7 @@
             <w:noProof/>
             <w:webHidden/>
           </w:rPr>
-          <w:instrText xml:space="preserve"> PAGEREF _Toc243479451 \h </w:instrText>
+          <w:instrText xml:space="preserve"> PAGEREF _Toc244186059 \h </w:instrText>
         </w:r>
         <w:r>
           <w:rPr>
@@ -170,7 +170,7 @@
           <w14:ligatures w14:val="standardContextual"/>
         </w:rPr>
       </w:pPr>
-      <w:hyperlink w:anchor="_Toc243479452" w:history="1">
+      <w:hyperlink w:anchor="_Toc244186060" w:history="1">
         <w:r>
           <w:rPr>
             <w:rStyle w:val="Hyperlink"/>
@@ -197,7 +197,7 @@
             <w:noProof/>
             <w:webHidden/>
           </w:rPr>
-          <w:instrText xml:space="preserve"> PAGEREF _Toc243479452 \h </w:instrText>
+          <w:instrText xml:space="preserve"> PAGEREF _Toc244186060 \h </w:instrText>
         </w:r>
         <w:r>
           <w:rPr>
@@ -245,7 +245,7 @@
           <w14:ligatures w14:val="standardContextual"/>
         </w:rPr>
       </w:pPr>
-      <w:hyperlink w:anchor="_Toc243479453" w:history="1">
+      <w:hyperlink w:anchor="_Toc244186061" w:history="1">
         <w:r>
           <w:rPr>
             <w:rStyle w:val="Hyperlink"/>
@@ -272,7 +272,82 @@
             <w:noProof/>
             <w:webHidden/>
           </w:rPr>
-          <w:instrText xml:space="preserve"> PAGEREF _Toc243479453 \h </w:instrText>
+          <w:instrText xml:space="preserve"> PAGEREF _Toc244186061 \h </w:instrText>
+        </w:r>
+        <w:r>
+          <w:rPr>
+            <w:noProof/>
+            <w:webHidden/>
+          </w:rPr>
+        </w:r>
+        <w:r>
+          <w:rPr>
+            <w:noProof/>
+            <w:webHidden/>
+          </w:rPr>
+          <w:fldChar w:fldCharType="separate"/>
+        </w:r>
+        <w:r>
+          <w:rPr>
+            <w:noProof/>
+            <w:webHidden/>
+          </w:rPr>
+          <w:t>5</w:t>
+        </w:r>
+        <w:r>
+          <w:rPr>
+            <w:noProof/>
+            <w:webHidden/>
+          </w:rPr>
+          <w:fldChar w:fldCharType="end"/>
+        </w:r>
+      </w:hyperlink>
+    </w:p>
+    <w:p>
+      <w:pPr>
+        <w:pStyle w:val="TOC2"/>
+        <w:tabs>
+          <w:tab w:val="right" w:leader="dot" w:pos="9880"/>
+        </w:tabs>
+        <w:rPr>
+          <w:rFonts w:asciiTheme="minorHAnsi" w:hAnsiTheme="minorHAnsi"/>
+          <w:noProof/>
+          <w:color w:val="auto"/>
+          <w:kern w:val="2"/>
+          <w:sz w:val="24"/>
+          <w:szCs w:val="24"/>
+          <w:lang w:val="de-DE" w:eastAsia="de-DE"/>
+          <w14:ligatures w14:val="standardContextual"/>
+        </w:rPr>
+      </w:pPr>
+      <w:hyperlink w:anchor="_Toc244186062" w:history="1">
+        <w:r>
+          <w:rPr>
+            <w:rStyle w:val="Hyperlink"/>
+            <w:noProof/>
+          </w:rPr>
+          <w:t>Operating systems and native exports</w:t>
+        </w:r>
+        <w:r>
+          <w:rPr>
+            <w:noProof/>
+            <w:webHidden/>
+          </w:rPr>
+          <w:tab/>
+        </w:r>
+        <w:r>
+          <w:rPr>
+            <w:noProof/>
+            <w:webHidden/>
+          </w:rPr>
+          <w:fldChar w:fldCharType="begin"/>
+        </w:r>
+        <w:r>
+          <w:rPr>
+            <w:noProof/>
+            <w:webHidden/>
+          </w:rPr>
+          <w:instrText xml:space="preserve"> PAGEREF _Toc244186062 \h </w:instrText>
         </w:r>
         <w:r>
           <w:rPr>
@@ -320,7 +395,7 @@
           <w14:ligatures w14:val="standardContextual"/>
         </w:rPr>
       </w:pPr>
-      <w:hyperlink w:anchor="_Toc243479454" w:history="1">
+      <w:hyperlink w:anchor="_Toc244186063" w:history="1">
         <w:r>
           <w:rPr>
             <w:rStyle w:val="Hyperlink"/>
@@ -347,7 +422,7 @@
             <w:noProof/>
             <w:webHidden/>
           </w:rPr>
-          <w:instrText xml:space="preserve"> PAGEREF _Toc243479454 \h </w:instrText>
+          <w:instrText xml:space="preserve"> PAGEREF _Toc244186063 \h </w:instrText>
         </w:r>
         <w:r>
           <w:rPr>
@@ -395,7 +470,7 @@
           <w14:ligatures w14:val="standardContextual"/>
         </w:rPr>
       </w:pPr>
-      <w:hyperlink w:anchor="_Toc243479455" w:history="1">
+      <w:hyperlink w:anchor="_Toc244186064" w:history="1">
         <w:r>
           <w:rPr>
             <w:rStyle w:val="Hyperlink"/>
@@ -422,7 +497,7 @@
             <w:noProof/>
             <w:webHidden/>
           </w:rPr>
-          <w:instrText xml:space="preserve"> PAGEREF _Toc243479455 \h </w:instrText>
+          <w:instrText xml:space="preserve"> PAGEREF _Toc244186064 \h </w:instrText>
         </w:r>
         <w:r>
           <w:rPr>
@@ -470,7 +545,7 @@
           <w14:ligatures w14:val="standardContextual"/>
         </w:rPr>
       </w:pPr>
-      <w:hyperlink w:anchor="_Toc243479456" w:history="1">
+      <w:hyperlink w:anchor="_Toc244186065" w:history="1">
         <w:r>
           <w:rPr>
             <w:rStyle w:val="Hyperlink"/>
@@ -497,7 +572,7 @@
             <w:noProof/>
             <w:webHidden/>
           </w:rPr>
-          <w:instrText xml:space="preserve"> PAGEREF _Toc243479456 \h </w:instrText>
+          <w:instrText xml:space="preserve"> PAGEREF _Toc244186065 \h </w:instrText>
         </w:r>
         <w:r>
           <w:rPr>
@@ -545,7 +620,7 @@
           <w14:ligatures w14:val="standardContextual"/>
         </w:rPr>
       </w:pPr>
-      <w:hyperlink w:anchor="_Toc243479457" w:history="1">
+      <w:hyperlink w:anchor="_Toc244186066" w:history="1">
         <w:r>
           <w:rPr>
             <w:rStyle w:val="Hyperlink"/>
@@ -572,7 +647,7 @@
             <w:noProof/>
             <w:webHidden/>
           </w:rPr>
-          <w:instrText xml:space="preserve"> PAGEREF _Toc243479457 \h </w:instrText>
+          <w:instrText xml:space="preserve"> PAGEREF _Toc244186066 \h </w:instrText>
         </w:r>
         <w:r>
           <w:rPr>
@@ -620,7 +695,7 @@
           <w14:ligatures w14:val="standardContextual"/>
         </w:rPr>
       </w:pPr>
-      <w:hyperlink w:anchor="_Toc243479458" w:history="1">
+      <w:hyperlink w:anchor="_Toc244186067" w:history="1">
         <w:r>
           <w:rPr>
             <w:rStyle w:val="Hyperlink"/>
@@ -647,7 +722,7 @@
             <w:noProof/>
             <w:webHidden/>
           </w:rPr>
-          <w:instrText xml:space="preserve"> PAGEREF _Toc243479458 \h </w:instrText>
+          <w:instrText xml:space="preserve"> PAGEREF _Toc244186067 \h </w:instrText>
         </w:r>
         <w:r>
           <w:rPr>
@@ -695,7 +770,7 @@
           <w14:ligatures w14:val="standardContextual"/>
         </w:rPr>
       </w:pPr>
-      <w:hyperlink w:anchor="_Toc243479459" w:history="1">
+      <w:hyperlink w:anchor="_Toc244186068" w:history="1">
         <w:r>
           <w:rPr>
             <w:rStyle w:val="Hyperlink"/>
@@ -722,7 +797,7 @@
             <w:noProof/>
             <w:webHidden/>
           </w:rPr>
-          <w:instrText xml:space="preserve"> PAGEREF _Toc243479459 \h </w:instrText>
+          <w:instrText xml:space="preserve"> PAGEREF _Toc244186068 \h </w:instrText>
         </w:r>
         <w:r>
           <w:rPr>
@@ -770,7 +845,7 @@
           <w14:ligatures w14:val="standardContextual"/>
         </w:rPr>
       </w:pPr>
-      <w:hyperlink w:anchor="_Toc243479460" w:history="1">
+      <w:hyperlink w:anchor="_Toc244186069" w:history="1">
         <w:r>
           <w:rPr>
             <w:rStyle w:val="Hyperlink"/>
@@ -797,7 +872,7 @@
             <w:noProof/>
             <w:webHidden/>
           </w:rPr>
-          <w:instrText xml:space="preserve"> PAGEREF _Toc243479460 \h </w:instrText>
+          <w:instrText xml:space="preserve"> PAGEREF _Toc244186069 \h </w:instrText>
         </w:r>
         <w:r>
           <w:rPr>
@@ -845,7 +920,7 @@
           <w14:ligatures w14:val="standardContextual"/>
         </w:rPr>
       </w:pPr>
-      <w:hyperlink w:anchor="_Toc243479461" w:history="1">
+      <w:hyperlink w:anchor="_Toc244186070" w:history="1">
         <w:r>
           <w:rPr>
             <w:rStyle w:val="Hyperlink"/>
@@ -872,7 +947,7 @@
             <w:noProof/>
             <w:webHidden/>
           </w:rPr>
-          <w:instrText xml:space="preserve"> PAGEREF _Toc243479461 \h </w:instrText>
+          <w:instrText xml:space="preserve"> PAGEREF _Toc244186070 \h </w:instrText>
         </w:r>
         <w:r>
           <w:rPr>
@@ -920,7 +995,7 @@
           <w14:ligatures w14:val="standardContextual"/>
         </w:rPr>
       </w:pPr>
-      <w:hyperlink w:anchor="_Toc243479462" w:history="1">
+      <w:hyperlink w:anchor="_Toc244186071" w:history="1">
         <w:r>
           <w:rPr>
             <w:rStyle w:val="Hyperlink"/>
@@ -947,7 +1022,7 @@
             <w:noProof/>
             <w:webHidden/>
           </w:rPr>
-          <w:instrText xml:space="preserve"> PAGEREF _Toc243479462 \h </w:instrText>
+          <w:instrText xml:space="preserve"> PAGEREF _Toc244186071 \h </w:instrText>
         </w:r>
         <w:r>
           <w:rPr>
@@ -995,7 +1070,7 @@
           <w14:ligatures w14:val="standardContextual"/>
         </w:rPr>
       </w:pPr>
-      <w:hyperlink w:anchor="_Toc243479463" w:history="1">
+      <w:hyperlink w:anchor="_Toc244186072" w:history="1">
         <w:r>
           <w:rPr>
             <w:rStyle w:val="Hyperlink"/>
@@ -1022,7 +1097,7 @@
             <w:noProof/>
             <w:webHidden/>
           </w:rPr>
-          <w:instrText xml:space="preserve"> PAGEREF _Toc243479463 \h </w:instrText>
+          <w:instrText xml:space="preserve"> PAGEREF _Toc244186072 \h </w:instrText>
         </w:r>
         <w:r>
           <w:rPr>
@@ -1070,7 +1145,7 @@
           <w14:ligatures w14:val="standardContextual"/>
         </w:rPr>
       </w:pPr>
-      <w:hyperlink w:anchor="_Toc243479464" w:history="1">
+      <w:hyperlink w:anchor="_Toc244186073" w:history="1">
         <w:r>
           <w:rPr>
             <w:rStyle w:val="Hyperlink"/>
@@ -1097,7 +1172,7 @@
             <w:noProof/>
             <w:webHidden/>
           </w:rPr>
-          <w:instrText xml:space="preserve"> PAGEREF _Toc243479464 \h </w:instrText>
+          <w:instrText xml:space="preserve"> PAGEREF _Toc244186073 \h </w:instrText>
         </w:r>
         <w:r>
           <w:rPr>
@@ -1145,7 +1220,7 @@
           <w14:ligatures w14:val="standardContextual"/>
         </w:rPr>
       </w:pPr>
-      <w:hyperlink w:anchor="_Toc243479465" w:history="1">
+      <w:hyperlink w:anchor="_Toc244186074" w:history="1">
         <w:r>
           <w:rPr>
             <w:rStyle w:val="Hyperlink"/>
@@ -1172,7 +1247,7 @@
             <w:noProof/>
             <w:webHidden/>
           </w:rPr>
-          <w:instrText xml:space="preserve"> PAGEREF _Toc243479465 \h </w:instrText>
+          <w:instrText xml:space="preserve"> PAGEREF _Toc244186074 \h </w:instrText>
         </w:r>
         <w:r>
           <w:rPr>
@@ -1220,7 +1295,7 @@
           <w14:ligatures w14:val="standardContextual"/>
         </w:rPr>
       </w:pPr>
-      <w:hyperlink w:anchor="_Toc243479466" w:history="1">
+      <w:hyperlink w:anchor="_Toc244186075" w:history="1">
         <w:r>
           <w:rPr>
             <w:rStyle w:val="Hyperlink"/>
@@ -1247,7 +1322,7 @@
             <w:noProof/>
             <w:webHidden/>
           </w:rPr>
-          <w:instrText xml:space="preserve"> PAGEREF _Toc243479466 \h </w:instrText>
+          <w:instrText xml:space="preserve"> PAGEREF _Toc244186075 \h </w:instrText>
         </w:r>
         <w:r>
           <w:rPr>
@@ -1295,7 +1370,7 @@
           <w14:ligatures w14:val="standardContextual"/>
         </w:rPr>
       </w:pPr>
-      <w:hyperlink w:anchor="_Toc243479467" w:history="1">
+      <w:hyperlink w:anchor="_Toc244186076" w:history="1">
         <w:r>
           <w:rPr>
             <w:rStyle w:val="Hyperlink"/>
@@ -1322,7 +1397,7 @@
             <w:noProof/>
             <w:webHidden/>
           </w:rPr>
-          <w:instrText xml:space="preserve"> PAGEREF _Toc243479467 \h </w:instrText>
+          <w:instrText xml:space="preserve"> PAGEREF _Toc244186076 \h </w:instrText>
         </w:r>
         <w:r>
           <w:rPr>
@@ -1370,7 +1445,7 @@
           <w14:ligatures w14:val="standardContextual"/>
         </w:rPr>
       </w:pPr>
-      <w:hyperlink w:anchor="_Toc243479468" w:history="1">
+      <w:hyperlink w:anchor="_Toc244186077" w:history="1">
         <w:r>
           <w:rPr>
             <w:rStyle w:val="Hyperlink"/>
@@ -1397,7 +1472,7 @@
             <w:noProof/>
             <w:webHidden/>
           </w:rPr>
-          <w:instrText xml:space="preserve"> PAGEREF _Toc243479468 \h </w:instrText>
+          <w:instrText xml:space="preserve"> PAGEREF _Toc244186077 \h </w:instrText>
         </w:r>
         <w:r>
           <w:rPr>
@@ -1445,7 +1520,7 @@
           <w14:ligatures w14:val="standardContextual"/>
         </w:rPr>
       </w:pPr>
-      <w:hyperlink w:anchor="_Toc243479469" w:history="1">
+      <w:hyperlink w:anchor="_Toc244186078" w:history="1">
         <w:r>
           <w:rPr>
             <w:rStyle w:val="Hyperlink"/>
@@ -1472,7 +1547,7 @@
             <w:noProof/>
             <w:webHidden/>
           </w:rPr>
-          <w:instrText xml:space="preserve"> PAGEREF _Toc243479469 \h </w:instrText>
+          <w:instrText xml:space="preserve"> PAGEREF _Toc244186078 \h </w:instrText>
         </w:r>
         <w:r>
           <w:rPr>
@@ -1520,7 +1595,7 @@
           <w14:ligatures w14:val="standardContextual"/>
         </w:rPr>
       </w:pPr>
-      <w:hyperlink w:anchor="_Toc243479470" w:history="1">
+      <w:hyperlink w:anchor="_Toc244186079" w:history="1">
         <w:r>
           <w:rPr>
             <w:rStyle w:val="Hyperlink"/>
@@ -1547,7 +1622,7 @@
             <w:noProof/>
             <w:webHidden/>
           </w:rPr>
-          <w:instrText xml:space="preserve"> PAGEREF _Toc243479470 \h </w:instrText>
+          <w:instrText xml:space="preserve"> PAGEREF _Toc244186079 \h </w:instrText>
         </w:r>
         <w:r>
           <w:rPr>
@@ -1595,7 +1670,7 @@
           <w14:ligatures w14:val="standardContextual"/>
         </w:rPr>
       </w:pPr>
-      <w:hyperlink w:anchor="_Toc243479471" w:history="1">
+      <w:hyperlink w:anchor="_Toc244186080" w:history="1">
         <w:r>
           <w:rPr>
             <w:rStyle w:val="Hyperlink"/>
@@ -1622,7 +1697,7 @@
             <w:noProof/>
             <w:webHidden/>
           </w:rPr>
-          <w:instrText xml:space="preserve"> PAGEREF _Toc243479471 \h </w:instrText>
+          <w:instrText xml:space="preserve"> PAGEREF _Toc244186080 \h </w:instrText>
         </w:r>
         <w:r>
           <w:rPr>
@@ -1670,7 +1745,7 @@
           <w14:ligatures w14:val="standardContextual"/>
         </w:rPr>
       </w:pPr>
-      <w:hyperlink w:anchor="_Toc243479472" w:history="1">
+      <w:hyperlink w:anchor="_Toc244186081" w:history="1">
         <w:r>
           <w:rPr>
             <w:rStyle w:val="Hyperlink"/>
@@ -1697,7 +1772,7 @@
             <w:noProof/>
             <w:webHidden/>
           </w:rPr>
-          <w:instrText xml:space="preserve"> PAGEREF _Toc243479472 \h </w:instrText>
+          <w:instrText xml:space="preserve"> PAGEREF _Toc244186081 \h </w:instrText>
         </w:r>
         <w:r>
           <w:rPr>
@@ -1745,7 +1820,7 @@
           <w14:ligatures w14:val="standardContextual"/>
         </w:rPr>
       </w:pPr>
-      <w:hyperlink w:anchor="_Toc243479473" w:history="1">
+      <w:hyperlink w:anchor="_Toc244186082" w:history="1">
         <w:r>
           <w:rPr>
             <w:rStyle w:val="Hyperlink"/>
@@ -1772,7 +1847,7 @@
             <w:noProof/>
             <w:webHidden/>
           </w:rPr>
-          <w:instrText xml:space="preserve"> PAGEREF _Toc243479473 \h </w:instrText>
+          <w:instrText xml:space="preserve"> PAGEREF _Toc244186082 \h </w:instrText>
         </w:r>
         <w:r>
           <w:rPr>
@@ -1820,7 +1895,7 @@
           <w14:ligatures w14:val="standardContextual"/>
         </w:rPr>
       </w:pPr>
-      <w:hyperlink w:anchor="_Toc243479474" w:history="1">
+      <w:hyperlink w:anchor="_Toc244186083" w:history="1">
         <w:r>
           <w:rPr>
             <w:rStyle w:val="Hyperlink"/>
@@ -1847,7 +1922,7 @@
             <w:noProof/>
             <w:webHidden/>
           </w:rPr>
-          <w:instrText xml:space="preserve"> PAGEREF _Toc243479474 \h </w:instrText>
+          <w:instrText xml:space="preserve"> PAGEREF _Toc244186083 \h </w:instrText>
         </w:r>
         <w:r>
           <w:rPr>
@@ -1895,7 +1970,7 @@
           <w14:ligatures w14:val="standardContextual"/>
         </w:rPr>
       </w:pPr>
-      <w:hyperlink w:anchor="_Toc243479475" w:history="1">
+      <w:hyperlink w:anchor="_Toc244186084" w:history="1">
         <w:r>
           <w:rPr>
             <w:rStyle w:val="Hyperlink"/>
@@ -1922,7 +1997,7 @@
             <w:noProof/>
             <w:webHidden/>
           </w:rPr>
-          <w:instrText xml:space="preserve"> PAGEREF _Toc243479475 \h </w:instrText>
+          <w:instrText xml:space="preserve"> PAGEREF _Toc244186084 \h </w:instrText>
         </w:r>
         <w:r>
           <w:rPr>
@@ -1970,7 +2045,7 @@
           <w14:ligatures w14:val="standardContextual"/>
         </w:rPr>
       </w:pPr>
-      <w:hyperlink w:anchor="_Toc243479476" w:history="1">
+      <w:hyperlink w:anchor="_Toc244186085" w:history="1">
         <w:r>
           <w:rPr>
             <w:rStyle w:val="Hyperlink"/>
@@ -1997,7 +2072,7 @@
             <w:noProof/>
             <w:webHidden/>
           </w:rPr>
-          <w:instrText xml:space="preserve"> PAGEREF _Toc243479476 \h </w:instrText>
+          <w:instrText xml:space="preserve"> PAGEREF _Toc244186085 \h </w:instrText>
         </w:r>
         <w:r>
           <w:rPr>
@@ -2045,7 +2120,7 @@
           <w14:ligatures w14:val="standardContextual"/>
         </w:rPr>
       </w:pPr>
-      <w:hyperlink w:anchor="_Toc243479477" w:history="1">
+      <w:hyperlink w:anchor="_Toc244186086" w:history="1">
         <w:r>
           <w:rPr>
             <w:rStyle w:val="Hyperlink"/>
@@ -2072,7 +2147,82 @@
             <w:noProof/>
             <w:webHidden/>
           </w:rPr>
-          <w:instrText xml:space="preserve"> PAGEREF _Toc243479477 \h </w:instrText>
+          <w:instrText xml:space="preserve"> PAGEREF _Toc244186086 \h </w:instrText>
+        </w:r>
+        <w:r>
+          <w:rPr>
+            <w:noProof/>
+            <w:webHidden/>
+          </w:rPr>
+        </w:r>
+        <w:r>
+          <w:rPr>
+            <w:noProof/>
+            <w:webHidden/>
+          </w:rPr>
+          <w:fldChar w:fldCharType="separate"/>
+        </w:r>
+        <w:r>
+          <w:rPr>
+            <w:noProof/>
+            <w:webHidden/>
+          </w:rPr>
+          <w:t>22</w:t>
+        </w:r>
+        <w:r>
+          <w:rPr>
+            <w:noProof/>
+            <w:webHidden/>
+          </w:rPr>
+          <w:fldChar w:fldCharType="end"/>
+        </w:r>
+      </w:hyperlink>
+    </w:p>
+    <w:p>
+      <w:pPr>
+        <w:pStyle w:val="TOC2"/>
+        <w:tabs>
+          <w:tab w:val="right" w:leader="dot" w:pos="9880"/>
+        </w:tabs>
+        <w:rPr>
+          <w:rFonts w:asciiTheme="minorHAnsi" w:hAnsiTheme="minorHAnsi"/>
+          <w:noProof/>
+          <w:color w:val="auto"/>
+          <w:kern w:val="2"/>
+          <w:sz w:val="24"/>
+          <w:szCs w:val="24"/>
+          <w:lang w:val="de-DE" w:eastAsia="de-DE"/>
+          <w14:ligatures w14:val="standardContextual"/>
+        </w:rPr>
+      </w:pPr>
+      <w:hyperlink w:anchor="_Toc244186087" w:history="1">
+        <w:r>
+          <w:rPr>
+            <w:rStyle w:val="Hyperlink"/>
+            <w:noProof/>
+          </w:rPr>
+          <w:t>Rank complete atlas regions across slices</w:t>
+        </w:r>
+        <w:r>
+          <w:rPr>
+            <w:noProof/>
+            <w:webHidden/>
+          </w:rPr>
+          <w:tab/>
+        </w:r>
+        <w:r>
+          <w:rPr>
+            <w:noProof/>
+            <w:webHidden/>
+          </w:rPr>
+          <w:fldChar w:fldCharType="begin"/>
+        </w:r>
+        <w:r>
+          <w:rPr>
+            <w:noProof/>
+            <w:webHidden/>
+          </w:rPr>
+          <w:instrText xml:space="preserve"> PAGEREF _Toc244186087 \h </w:instrText>
         </w:r>
         <w:r>
           <w:rPr>
@@ -2120,7 +2270,7 @@
           <w14:ligatures w14:val="standardContextual"/>
         </w:rPr>
       </w:pPr>
-      <w:hyperlink w:anchor="_Toc243479478" w:history="1">
+      <w:hyperlink w:anchor="_Toc244186088" w:history="1">
         <w:r>
           <w:rPr>
             <w:rStyle w:val="Hyperlink"/>
@@ -2147,7 +2297,7 @@
             <w:noProof/>
             <w:webHidden/>
           </w:rPr>
-          <w:instrText xml:space="preserve"> PAGEREF _Toc243479478 \h </w:instrText>
+          <w:instrText xml:space="preserve"> PAGEREF _Toc244186088 \h </w:instrText>
         </w:r>
         <w:r>
           <w:rPr>
@@ -2167,7 +2317,7 @@
             <w:noProof/>
             <w:webHidden/>
           </w:rPr>
-          <w:t>23</w:t>
+          <w:t>24</w:t>
         </w:r>
         <w:r>
           <w:rPr>
@@ -2195,7 +2345,7 @@
           <w14:ligatures w14:val="standardContextual"/>
         </w:rPr>
       </w:pPr>
-      <w:hyperlink w:anchor="_Toc243479479" w:history="1">
+      <w:hyperlink w:anchor="_Toc244186089" w:history="1">
         <w:r>
           <w:rPr>
             <w:rStyle w:val="Hyperlink"/>
@@ -2222,7 +2372,7 @@
             <w:noProof/>
             <w:webHidden/>
           </w:rPr>
-          <w:instrText xml:space="preserve"> PAGEREF _Toc243479479 \h </w:instrText>
+          <w:instrText xml:space="preserve"> PAGEREF _Toc244186089 \h </w:instrText>
         </w:r>
         <w:r>
           <w:rPr>
@@ -2242,7 +2392,7 @@
             <w:noProof/>
             <w:webHidden/>
           </w:rPr>
-          <w:t>23</w:t>
+          <w:t>24</w:t>
         </w:r>
         <w:r>
           <w:rPr>
@@ -2270,13 +2420,13 @@
           <w14:ligatures w14:val="standardContextual"/>
         </w:rPr>
       </w:pPr>
-      <w:hyperlink w:anchor="_Toc243479480" w:history="1">
+      <w:hyperlink w:anchor="_Toc244186090" w:history="1">
         <w:r>
           <w:rPr>
             <w:rStyle w:val="Hyperlink"/>
             <w:noProof/>
           </w:rPr>
-          <w:t>Register one 2D source plane</w:t>
+          <w:t>Geometric masks for volumetric probe data</w:t>
         </w:r>
         <w:r>
           <w:rPr>
@@ -2297,7 +2447,7 @@
             <w:noProof/>
             <w:webHidden/>
           </w:rPr>
-          <w:instrText xml:space="preserve"> PAGEREF _Toc243479480 \h </w:instrText>
+          <w:instrText xml:space="preserve"> PAGEREF _Toc244186090 \h </w:instrText>
         </w:r>
         <w:r>
           <w:rPr>
@@ -2345,12 +2495,87 @@
           <w14:ligatures w14:val="standardContextual"/>
         </w:rPr>
       </w:pPr>
-      <w:hyperlink w:anchor="_Toc243479481" w:history="1">
+      <w:hyperlink w:anchor="_Toc244186091" w:history="1">
         <w:r>
           <w:rPr>
             <w:rStyle w:val="Hyperlink"/>
             <w:noProof/>
           </w:rPr>
+          <w:t>Register one 2D source plane</w:t>
+        </w:r>
+        <w:r>
+          <w:rPr>
+            <w:noProof/>
+            <w:webHidden/>
+          </w:rPr>
+          <w:tab/>
+        </w:r>
+        <w:r>
+          <w:rPr>
+            <w:noProof/>
+            <w:webHidden/>
+          </w:rPr>
+          <w:fldChar w:fldCharType="begin"/>
+        </w:r>
+        <w:r>
+          <w:rPr>
+            <w:noProof/>
+            <w:webHidden/>
+          </w:rPr>
+          <w:instrText xml:space="preserve"> PAGEREF _Toc244186091 \h </w:instrText>
+        </w:r>
+        <w:r>
+          <w:rPr>
+            <w:noProof/>
+            <w:webHidden/>
+          </w:rPr>
+        </w:r>
+        <w:r>
+          <w:rPr>
+            <w:noProof/>
+            <w:webHidden/>
+          </w:rPr>
+          <w:fldChar w:fldCharType="separate"/>
+        </w:r>
+        <w:r>
+          <w:rPr>
+            <w:noProof/>
+            <w:webHidden/>
+          </w:rPr>
+          <w:t>25</w:t>
+        </w:r>
+        <w:r>
+          <w:rPr>
+            <w:noProof/>
+            <w:webHidden/>
+          </w:rPr>
+          <w:fldChar w:fldCharType="end"/>
+        </w:r>
+      </w:hyperlink>
+    </w:p>
+    <w:p>
+      <w:pPr>
+        <w:pStyle w:val="TOC2"/>
+        <w:tabs>
+          <w:tab w:val="right" w:leader="dot" w:pos="9880"/>
+        </w:tabs>
+        <w:rPr>
+          <w:rFonts w:asciiTheme="minorHAnsi" w:hAnsiTheme="minorHAnsi"/>
+          <w:noProof/>
+          <w:color w:val="auto"/>
+          <w:kern w:val="2"/>
+          <w:sz w:val="24"/>
+          <w:szCs w:val="24"/>
+          <w:lang w:val="de-DE" w:eastAsia="de-DE"/>
+          <w14:ligatures w14:val="standardContextual"/>
+        </w:rPr>
+      </w:pPr>
+      <w:hyperlink w:anchor="_Toc244186092" w:history="1">
+        <w:r>
+          <w:rPr>
+            <w:rStyle w:val="Hyperlink"/>
+            <w:noProof/>
+          </w:rPr>
           <w:t>LightSuite guided atlas registration</w:t>
         </w:r>
         <w:r>
@@ -2372,7 +2597,7 @@
             <w:noProof/>
             <w:webHidden/>
           </w:rPr>
-          <w:instrText xml:space="preserve"> PAGEREF _Toc243479481 \h </w:instrText>
+          <w:instrText xml:space="preserve"> PAGEREF _Toc244186092 \h </w:instrText>
         </w:r>
         <w:r>
           <w:rPr>
@@ -2392,7 +2617,7 @@
             <w:noProof/>
             <w:webHidden/>
           </w:rPr>
-          <w:t>25</w:t>
+          <w:t>26</w:t>
         </w:r>
         <w:r>
           <w:rPr>
@@ -2420,7 +2645,7 @@
           <w14:ligatures w14:val="standardContextual"/>
         </w:rPr>
       </w:pPr>
-      <w:hyperlink w:anchor="_Toc243479482" w:history="1">
+      <w:hyperlink w:anchor="_Toc244186093" w:history="1">
         <w:r>
           <w:rPr>
             <w:rStyle w:val="Hyperlink"/>
@@ -2447,7 +2672,7 @@
             <w:noProof/>
             <w:webHidden/>
           </w:rPr>
-          <w:instrText xml:space="preserve"> PAGEREF _Toc243479482 \h </w:instrText>
+          <w:instrText xml:space="preserve"> PAGEREF _Toc244186093 \h </w:instrText>
         </w:r>
         <w:r>
           <w:rPr>
@@ -2467,7 +2692,7 @@
             <w:noProof/>
             <w:webHidden/>
           </w:rPr>
-          <w:t>31</w:t>
+          <w:t>33</w:t>
         </w:r>
         <w:r>
           <w:rPr>
@@ -2495,7 +2720,7 @@
           <w14:ligatures w14:val="standardContextual"/>
         </w:rPr>
       </w:pPr>
-      <w:hyperlink w:anchor="_Toc243479483" w:history="1">
+      <w:hyperlink w:anchor="_Toc244186094" w:history="1">
         <w:r>
           <w:rPr>
             <w:rStyle w:val="Hyperlink"/>
@@ -2522,7 +2747,7 @@
             <w:noProof/>
             <w:webHidden/>
           </w:rPr>
-          <w:instrText xml:space="preserve"> PAGEREF _Toc243479483 \h </w:instrText>
+          <w:instrText xml:space="preserve"> PAGEREF _Toc244186094 \h </w:instrText>
         </w:r>
         <w:r>
           <w:rPr>
@@ -2542,7 +2767,7 @@
             <w:noProof/>
             <w:webHidden/>
           </w:rPr>
-          <w:t>31</w:t>
+          <w:t>33</w:t>
         </w:r>
         <w:r>
           <w:rPr>
@@ -2570,7 +2795,7 @@
           <w14:ligatures w14:val="standardContextual"/>
         </w:rPr>
       </w:pPr>
-      <w:hyperlink w:anchor="_Toc243479484" w:history="1">
+      <w:hyperlink w:anchor="_Toc244186095" w:history="1">
         <w:r>
           <w:rPr>
             <w:rStyle w:val="Hyperlink"/>
@@ -2597,7 +2822,7 @@
             <w:noProof/>
             <w:webHidden/>
           </w:rPr>
-          <w:instrText xml:space="preserve"> PAGEREF _Toc243479484 \h </w:instrText>
+          <w:instrText xml:space="preserve"> PAGEREF _Toc244186095 \h </w:instrText>
         </w:r>
         <w:r>
           <w:rPr>
@@ -2617,7 +2842,7 @@
             <w:noProof/>
             <w:webHidden/>
           </w:rPr>
-          <w:t>32</w:t>
+          <w:t>34</w:t>
         </w:r>
         <w:r>
           <w:rPr>
@@ -2645,7 +2870,7 @@
           <w14:ligatures w14:val="standardContextual"/>
         </w:rPr>
       </w:pPr>
-      <w:hyperlink w:anchor="_Toc243479485" w:history="1">
+      <w:hyperlink w:anchor="_Toc244186096" w:history="1">
         <w:r>
           <w:rPr>
             <w:rStyle w:val="Hyperlink"/>
@@ -2672,7 +2897,7 @@
             <w:noProof/>
             <w:webHidden/>
           </w:rPr>
-          <w:instrText xml:space="preserve"> PAGEREF _Toc243479485 \h </w:instrText>
+          <w:instrText xml:space="preserve"> PAGEREF _Toc244186096 \h </w:instrText>
         </w:r>
         <w:r>
           <w:rPr>
@@ -2692,7 +2917,7 @@
             <w:noProof/>
             <w:webHidden/>
           </w:rPr>
-          <w:t>34</w:t>
+          <w:t>36</w:t>
         </w:r>
         <w:r>
           <w:rPr>
@@ -2720,7 +2945,7 @@
           <w14:ligatures w14:val="standardContextual"/>
         </w:rPr>
       </w:pPr>
-      <w:hyperlink w:anchor="_Toc243479486" w:history="1">
+      <w:hyperlink w:anchor="_Toc244186097" w:history="1">
         <w:r>
           <w:rPr>
             <w:rStyle w:val="Hyperlink"/>
@@ -2747,7 +2972,7 @@
             <w:noProof/>
             <w:webHidden/>
           </w:rPr>
-          <w:instrText xml:space="preserve"> PAGEREF _Toc243479486 \h </w:instrText>
+          <w:instrText xml:space="preserve"> PAGEREF _Toc244186097 \h </w:instrText>
         </w:r>
         <w:r>
           <w:rPr>
@@ -2767,7 +2992,7 @@
             <w:noProof/>
             <w:webHidden/>
           </w:rPr>
-          <w:t>36</w:t>
+          <w:t>38</w:t>
         </w:r>
         <w:r>
           <w:rPr>
@@ -2795,7 +3020,7 @@
           <w14:ligatures w14:val="standardContextual"/>
         </w:rPr>
       </w:pPr>
-      <w:hyperlink w:anchor="_Toc243479487" w:history="1">
+      <w:hyperlink w:anchor="_Toc244186098" w:history="1">
         <w:r>
           <w:rPr>
             <w:rStyle w:val="Hyperlink"/>
@@ -2822,7 +3047,7 @@
             <w:noProof/>
             <w:webHidden/>
           </w:rPr>
-          <w:instrText xml:space="preserve"> PAGEREF _Toc243479487 \h </w:instrText>
+          <w:instrText xml:space="preserve"> PAGEREF _Toc244186098 \h </w:instrText>
         </w:r>
         <w:r>
           <w:rPr>
@@ -2842,7 +3067,232 @@
             <w:noProof/>
             <w:webHidden/>
           </w:rPr>
-          <w:t>36</w:t>
+          <w:t>38</w:t>
+        </w:r>
+        <w:r>
+          <w:rPr>
+            <w:noProof/>
+            <w:webHidden/>
+          </w:rPr>
+          <w:fldChar w:fldCharType="end"/>
+        </w:r>
+      </w:hyperlink>
+    </w:p>
+    <w:p>
+      <w:pPr>
+        <w:pStyle w:val="TOC2"/>
+        <w:tabs>
+          <w:tab w:val="right" w:leader="dot" w:pos="9880"/>
+        </w:tabs>
+        <w:rPr>
+          <w:rFonts w:asciiTheme="minorHAnsi" w:hAnsiTheme="minorHAnsi"/>
+          <w:noProof/>
+          <w:color w:val="auto"/>
+          <w:kern w:val="2"/>
+          <w:sz w:val="24"/>
+          <w:szCs w:val="24"/>
+          <w:lang w:val="de-DE" w:eastAsia="de-DE"/>
+          <w14:ligatures w14:val="standardContextual"/>
+        </w:rPr>
+      </w:pPr>
+      <w:hyperlink w:anchor="_Toc244186099" w:history="1">
+        <w:r>
+          <w:rPr>
+            <w:rStyle w:val="Hyperlink"/>
+            <w:noProof/>
+          </w:rPr>
+          <w:t>Assign concentrations and display titrations</w:t>
+        </w:r>
+        <w:r>
+          <w:rPr>
+            <w:noProof/>
+            <w:webHidden/>
+          </w:rPr>
+          <w:tab/>
+        </w:r>
+        <w:r>
+          <w:rPr>
+            <w:noProof/>
+            <w:webHidden/>
+          </w:rPr>
+          <w:fldChar w:fldCharType="begin"/>
+        </w:r>
+        <w:r>
+          <w:rPr>
+            <w:noProof/>
+            <w:webHidden/>
+          </w:rPr>
+          <w:instrText xml:space="preserve"> PAGEREF _Toc244186099 \h </w:instrText>
+        </w:r>
+        <w:r>
+          <w:rPr>
+            <w:noProof/>
+            <w:webHidden/>
+          </w:rPr>
+        </w:r>
+        <w:r>
+          <w:rPr>
+            <w:noProof/>
+            <w:webHidden/>
+          </w:rPr>
+          <w:fldChar w:fldCharType="separate"/>
+        </w:r>
+        <w:r>
+          <w:rPr>
+            <w:noProof/>
+            <w:webHidden/>
+          </w:rPr>
+          <w:t>38</w:t>
+        </w:r>
+        <w:r>
+          <w:rPr>
+            <w:noProof/>
+            <w:webHidden/>
+          </w:rPr>
+          <w:fldChar w:fldCharType="end"/>
+        </w:r>
+      </w:hyperlink>
+    </w:p>
+    <w:p>
+      <w:pPr>
+        <w:pStyle w:val="TOC2"/>
+        <w:tabs>
+          <w:tab w:val="right" w:leader="dot" w:pos="9880"/>
+        </w:tabs>
+        <w:rPr>
+          <w:rFonts w:asciiTheme="minorHAnsi" w:hAnsiTheme="minorHAnsi"/>
+          <w:noProof/>
+          <w:color w:val="auto"/>
+          <w:kern w:val="2"/>
+          <w:sz w:val="24"/>
+          <w:szCs w:val="24"/>
+          <w:lang w:val="de-DE" w:eastAsia="de-DE"/>
+          <w14:ligatures w14:val="standardContextual"/>
+        </w:rPr>
+      </w:pPr>
+      <w:hyperlink w:anchor="_Toc244186100" w:history="1">
+        <w:r>
+          <w:rPr>
+            <w:rStyle w:val="Hyperlink"/>
+            <w:noProof/>
+          </w:rPr>
+          <w:t>Select dose comparisons and statistical tests</w:t>
+        </w:r>
+        <w:r>
+          <w:rPr>
+            <w:noProof/>
+            <w:webHidden/>
+          </w:rPr>
+          <w:tab/>
+        </w:r>
+        <w:r>
+          <w:rPr>
+            <w:noProof/>
+            <w:webHidden/>
+          </w:rPr>
+          <w:fldChar w:fldCharType="begin"/>
+        </w:r>
+        <w:r>
+          <w:rPr>
+            <w:noProof/>
+            <w:webHidden/>
+          </w:rPr>
+          <w:instrText xml:space="preserve"> PAGEREF _Toc244186100 \h </w:instrText>
+        </w:r>
+        <w:r>
+          <w:rPr>
+            <w:noProof/>
+            <w:webHidden/>
+          </w:rPr>
+        </w:r>
+        <w:r>
+          <w:rPr>
+            <w:noProof/>
+            <w:webHidden/>
+          </w:rPr>
+          <w:fldChar w:fldCharType="separate"/>
+        </w:r>
+        <w:r>
+          <w:rPr>
+            <w:noProof/>
+            <w:webHidden/>
+          </w:rPr>
+          <w:t>39</w:t>
+        </w:r>
+        <w:r>
+          <w:rPr>
+            <w:noProof/>
+            <w:webHidden/>
+          </w:rPr>
+          <w:fldChar w:fldCharType="end"/>
+        </w:r>
+      </w:hyperlink>
+    </w:p>
+    <w:p>
+      <w:pPr>
+        <w:pStyle w:val="TOC2"/>
+        <w:tabs>
+          <w:tab w:val="right" w:leader="dot" w:pos="9880"/>
+        </w:tabs>
+        <w:rPr>
+          <w:rFonts w:asciiTheme="minorHAnsi" w:hAnsiTheme="minorHAnsi"/>
+          <w:noProof/>
+          <w:color w:val="auto"/>
+          <w:kern w:val="2"/>
+          <w:sz w:val="24"/>
+          <w:szCs w:val="24"/>
+          <w:lang w:val="de-DE" w:eastAsia="de-DE"/>
+          <w14:ligatures w14:val="standardContextual"/>
+        </w:rPr>
+      </w:pPr>
+      <w:hyperlink w:anchor="_Toc244186101" w:history="1">
+        <w:r>
+          <w:rPr>
+            <w:rStyle w:val="Hyperlink"/>
+            <w:noProof/>
+          </w:rPr>
+          <w:t>Preview publication figures before exporting</w:t>
+        </w:r>
+        <w:r>
+          <w:rPr>
+            <w:noProof/>
+            <w:webHidden/>
+          </w:rPr>
+          <w:tab/>
+        </w:r>
+        <w:r>
+          <w:rPr>
+            <w:noProof/>
+            <w:webHidden/>
+          </w:rPr>
+          <w:fldChar w:fldCharType="begin"/>
+        </w:r>
+        <w:r>
+          <w:rPr>
+            <w:noProof/>
+            <w:webHidden/>
+          </w:rPr>
+          <w:instrText xml:space="preserve"> PAGEREF _Toc244186101 \h </w:instrText>
+        </w:r>
+        <w:r>
+          <w:rPr>
+            <w:noProof/>
+            <w:webHidden/>
+          </w:rPr>
+        </w:r>
+        <w:r>
+          <w:rPr>
+            <w:noProof/>
+            <w:webHidden/>
+          </w:rPr>
+          <w:fldChar w:fldCharType="separate"/>
+        </w:r>
+        <w:r>
+          <w:rPr>
+            <w:noProof/>
+            <w:webHidden/>
+          </w:rPr>
+          <w:t>39</w:t>
         </w:r>
         <w:r>
           <w:rPr>
@@ -2870,7 +3320,7 @@
           <w14:ligatures w14:val="standardContextual"/>
         </w:rPr>
       </w:pPr>
-      <w:hyperlink w:anchor="_Toc243479488" w:history="1">
+      <w:hyperlink w:anchor="_Toc244186102" w:history="1">
         <w:r>
           <w:rPr>
             <w:rStyle w:val="Hyperlink"/>
@@ -2897,7 +3347,7 @@
             <w:noProof/>
             <w:webHidden/>
           </w:rPr>
-          <w:instrText xml:space="preserve"> PAGEREF _Toc243479488 \h </w:instrText>
+          <w:instrText xml:space="preserve"> PAGEREF _Toc244186102 \h </w:instrText>
         </w:r>
         <w:r>
           <w:rPr>
@@ -2917,7 +3367,82 @@
             <w:noProof/>
             <w:webHidden/>
           </w:rPr>
-          <w:t>37</w:t>
+          <w:t>41</w:t>
+        </w:r>
+        <w:r>
+          <w:rPr>
+            <w:noProof/>
+            <w:webHidden/>
+          </w:rPr>
+          <w:fldChar w:fldCharType="end"/>
+        </w:r>
+      </w:hyperlink>
+    </w:p>
+    <w:p>
+      <w:pPr>
+        <w:pStyle w:val="TOC2"/>
+        <w:tabs>
+          <w:tab w:val="right" w:leader="dot" w:pos="9880"/>
+        </w:tabs>
+        <w:rPr>
+          <w:rFonts w:asciiTheme="minorHAnsi" w:hAnsiTheme="minorHAnsi"/>
+          <w:noProof/>
+          <w:color w:val="auto"/>
+          <w:kern w:val="2"/>
+          <w:sz w:val="24"/>
+          <w:szCs w:val="24"/>
+          <w:lang w:val="de-DE" w:eastAsia="de-DE"/>
+          <w14:ligatures w14:val="standardContextual"/>
+        </w:rPr>
+      </w:pPr>
+      <w:hyperlink w:anchor="_Toc244186103" w:history="1">
+        <w:r>
+          <w:rPr>
+            <w:rStyle w:val="Hyperlink"/>
+            <w:noProof/>
+          </w:rPr>
+          <w:t>Review the current automated presets</w:t>
+        </w:r>
+        <w:r>
+          <w:rPr>
+            <w:noProof/>
+            <w:webHidden/>
+          </w:rPr>
+          <w:tab/>
+        </w:r>
+        <w:r>
+          <w:rPr>
+            <w:noProof/>
+            <w:webHidden/>
+          </w:rPr>
+          <w:fldChar w:fldCharType="begin"/>
+        </w:r>
+        <w:r>
+          <w:rPr>
+            <w:noProof/>
+            <w:webHidden/>
+          </w:rPr>
+          <w:instrText xml:space="preserve"> PAGEREF _Toc244186103 \h </w:instrText>
+        </w:r>
+        <w:r>
+          <w:rPr>
+            <w:noProof/>
+            <w:webHidden/>
+          </w:rPr>
+        </w:r>
+        <w:r>
+          <w:rPr>
+            <w:noProof/>
+            <w:webHidden/>
+          </w:rPr>
+          <w:fldChar w:fldCharType="separate"/>
+        </w:r>
+        <w:r>
+          <w:rPr>
+            <w:noProof/>
+            <w:webHidden/>
+          </w:rPr>
+          <w:t>41</w:t>
         </w:r>
         <w:r>
           <w:rPr>
@@ -2945,7 +3470,7 @@
           <w14:ligatures w14:val="standardContextual"/>
         </w:rPr>
       </w:pPr>
-      <w:hyperlink w:anchor="_Toc243479489" w:history="1">
+      <w:hyperlink w:anchor="_Toc244186104" w:history="1">
         <w:r>
           <w:rPr>
             <w:rStyle w:val="Hyperlink"/>
@@ -2972,7 +3497,7 @@
             <w:noProof/>
             <w:webHidden/>
           </w:rPr>
-          <w:instrText xml:space="preserve"> PAGEREF _Toc243479489 \h </w:instrText>
+          <w:instrText xml:space="preserve"> PAGEREF _Toc244186104 \h </w:instrText>
         </w:r>
         <w:r>
           <w:rPr>
@@ -2992,7 +3517,7 @@
             <w:noProof/>
             <w:webHidden/>
           </w:rPr>
-          <w:t>38</w:t>
+          <w:t>42</w:t>
         </w:r>
         <w:r>
           <w:rPr>
@@ -3020,7 +3545,7 @@
           <w14:ligatures w14:val="standardContextual"/>
         </w:rPr>
       </w:pPr>
-      <w:hyperlink w:anchor="_Toc243479490" w:history="1">
+      <w:hyperlink w:anchor="_Toc244186105" w:history="1">
         <w:r>
           <w:rPr>
             <w:rStyle w:val="Hyperlink"/>
@@ -3047,7 +3572,7 @@
             <w:noProof/>
             <w:webHidden/>
           </w:rPr>
-          <w:instrText xml:space="preserve"> PAGEREF _Toc243479490 \h </w:instrText>
+          <w:instrText xml:space="preserve"> PAGEREF _Toc244186105 \h </w:instrText>
         </w:r>
         <w:r>
           <w:rPr>
@@ -3067,7 +3592,7 @@
             <w:noProof/>
             <w:webHidden/>
           </w:rPr>
-          <w:t>38</w:t>
+          <w:t>42</w:t>
         </w:r>
         <w:r>
           <w:rPr>
@@ -3095,7 +3620,7 @@
           <w14:ligatures w14:val="standardContextual"/>
         </w:rPr>
       </w:pPr>
-      <w:hyperlink w:anchor="_Toc243479491" w:history="1">
+      <w:hyperlink w:anchor="_Toc244186106" w:history="1">
         <w:r>
           <w:rPr>
             <w:rStyle w:val="Hyperlink"/>
@@ -3122,7 +3647,7 @@
             <w:noProof/>
             <w:webHidden/>
           </w:rPr>
-          <w:instrText xml:space="preserve"> PAGEREF _Toc243479491 \h </w:instrText>
+          <w:instrText xml:space="preserve"> PAGEREF _Toc244186106 \h </w:instrText>
         </w:r>
         <w:r>
           <w:rPr>
@@ -3142,7 +3667,7 @@
             <w:noProof/>
             <w:webHidden/>
           </w:rPr>
-          <w:t>39</w:t>
+          <w:t>43</w:t>
         </w:r>
         <w:r>
           <w:rPr>
@@ -3170,7 +3695,7 @@
           <w14:ligatures w14:val="standardContextual"/>
         </w:rPr>
       </w:pPr>
-      <w:hyperlink w:anchor="_Toc243479492" w:history="1">
+      <w:hyperlink w:anchor="_Toc244186107" w:history="1">
         <w:r>
           <w:rPr>
             <w:rStyle w:val="Hyperlink"/>
@@ -3197,7 +3722,7 @@
             <w:noProof/>
             <w:webHidden/>
           </w:rPr>
-          <w:instrText xml:space="preserve"> PAGEREF _Toc243479492 \h </w:instrText>
+          <w:instrText xml:space="preserve"> PAGEREF _Toc244186107 \h </w:instrText>
         </w:r>
         <w:r>
           <w:rPr>
@@ -3217,7 +3742,7 @@
             <w:noProof/>
             <w:webHidden/>
           </w:rPr>
-          <w:t>40</w:t>
+          <w:t>44</w:t>
         </w:r>
         <w:r>
           <w:rPr>
@@ -3245,7 +3770,7 @@
           <w14:ligatures w14:val="standardContextual"/>
         </w:rPr>
       </w:pPr>
-      <w:hyperlink w:anchor="_Toc243479493" w:history="1">
+      <w:hyperlink w:anchor="_Toc244186108" w:history="1">
         <w:r>
           <w:rPr>
             <w:rStyle w:val="Hyperlink"/>
@@ -3272,7 +3797,7 @@
             <w:noProof/>
             <w:webHidden/>
           </w:rPr>
-          <w:instrText xml:space="preserve"> PAGEREF _Toc243479493 \h </w:instrText>
+          <w:instrText xml:space="preserve"> PAGEREF _Toc244186108 \h </w:instrText>
         </w:r>
         <w:r>
           <w:rPr>
@@ -3292,7 +3817,7 @@
             <w:noProof/>
             <w:webHidden/>
           </w:rPr>
-          <w:t>40</w:t>
+          <w:t>44</w:t>
         </w:r>
         <w:r>
           <w:rPr>
@@ -3320,7 +3845,7 @@
           <w14:ligatures w14:val="standardContextual"/>
         </w:rPr>
       </w:pPr>
-      <w:hyperlink w:anchor="_Toc243479494" w:history="1">
+      <w:hyperlink w:anchor="_Toc244186109" w:history="1">
         <w:r>
           <w:rPr>
             <w:rStyle w:val="Hyperlink"/>
@@ -3347,7 +3872,7 @@
             <w:noProof/>
             <w:webHidden/>
           </w:rPr>
-          <w:instrText xml:space="preserve"> PAGEREF _Toc243479494 \h </w:instrText>
+          <w:instrText xml:space="preserve"> PAGEREF _Toc244186109 \h </w:instrText>
         </w:r>
         <w:r>
           <w:rPr>
@@ -3367,7 +3892,7 @@
             <w:noProof/>
             <w:webHidden/>
           </w:rPr>
-          <w:t>41</w:t>
+          <w:t>45</w:t>
         </w:r>
         <w:r>
           <w:rPr>
@@ -3396,7 +3921,7 @@
     </w:p>
     <w:p>
       <w:r>
-        <w:t>Reference edition 15 October 2026</w:t>
+        <w:t>Reference edition 29 October 2026</w:t>
       </w:r>
     </w:p>
     <w:p>
@@ -3429,7 +3954,7 @@
         <w:pStyle w:val="Heading1"/>
         <w:pageBreakBefore/>
       </w:pPr>
-      <w:bookmarkStart w:id="0" w:name="_Toc243479451"/>
+      <w:bookmarkStart w:id="0" w:name="_Toc244186059"/>
       <w:r>
         <w:rPr>
           <w:b w:val="0"/>
@@ -3443,7 +3968,7 @@
       <w:pPr>
         <w:pStyle w:val="Heading2"/>
       </w:pPr>
-      <w:bookmarkStart w:id="1" w:name="_Toc243479452"/>
+      <w:bookmarkStart w:id="1" w:name="_Toc244186060"/>
       <w:r>
         <w:rPr>
           <w:b w:val="0"/>
@@ -3606,7 +4131,7 @@
       <w:pPr>
         <w:pStyle w:val="Heading2"/>
       </w:pPr>
-      <w:bookmarkStart w:id="2" w:name="_Toc243479453"/>
+      <w:bookmarkStart w:id="2" w:name="_Toc244186061"/>
       <w:r>
         <w:rPr>
           <w:b w:val="0"/>
@@ -3643,10 +4168,33 @@
     </w:p>
     <w:p>
       <w:pPr>
+        <w:pStyle w:val="Heading2"/>
+      </w:pPr>
+      <w:bookmarkStart w:id="3" w:name="b_update_platform_title"/>
+      <w:bookmarkStart w:id="4" w:name="_Toc244186062"/>
+      <w:bookmarkEnd w:id="3"/>
+      <w:r>
+        <w:rPr>
+          <w:b w:val="0"/>
+        </w:rPr>
+        <w:t>Operating systems and native exports</w:t>
+      </w:r>
+      <w:bookmarkEnd w:id="4"/>
+    </w:p>
+    <w:p>
+      <w:r>
+        <w:t xml:space="preserve">Windows with MATLAB R2023b remains the reference installation. Native MATLAB on Linux and macOS is supported by the source; end-to-end validation on those platforms is pending. Use </w:t>
+      </w:r>
+      <w:r>
+        <w:t>the actual mounted data path rather than Windows drive letters. Linux movie exports use Motion JPEG AVI; Windows and macOS use MP4. On macOS and Linux, PPTX requires MATLAB Report Generator, and XLSX export does not use Excel COM styling. Live acquisition remains subject to scanner and hardware-driver support.</w:t>
+      </w:r>
+    </w:p>
+    <w:p>
+      <w:pPr>
         <w:pStyle w:val="Heading1"/>
         <w:pageBreakBefore/>
       </w:pPr>
-      <w:bookmarkStart w:id="3" w:name="_Toc243479454"/>
+      <w:bookmarkStart w:id="5" w:name="_Toc244186063"/>
       <w:r>
         <w:rPr>
           <w:b w:val="0"/>
@@ -3654,7 +4202,7 @@
         <w:lastRenderedPageBreak/>
         <w:t>2 Choose the acquisition route</w:t>
       </w:r>
-      <w:bookmarkEnd w:id="3"/>
+      <w:bookmarkEnd w:id="5"/>
     </w:p>
     <w:p>
       <w:pPr>
@@ -3895,7 +4443,10 @@
               <w:jc w:val="left"/>
             </w:pPr>
             <w:r>
-              <w:t>2D probe with step motor</w:t>
+              <w:t xml:space="preserve">2D </w:t>
+            </w:r>
+            <w:r>
+              <w:t>probe with step motor</w:t>
             </w:r>
           </w:p>
         </w:tc>
@@ -4061,24 +4612,21 @@
       <w:pPr>
         <w:pStyle w:val="Heading2"/>
       </w:pPr>
-      <w:bookmarkStart w:id="4" w:name="_Toc243479455"/>
+      <w:bookmarkStart w:id="6" w:name="_Toc244186064"/>
       <w:r>
         <w:rPr>
           <w:b w:val="0"/>
         </w:rPr>
-        <w:t xml:space="preserve">Keep these </w:t>
-      </w:r>
-      <w:r>
-        <w:rPr>
-          <w:b w:val="0"/>
-        </w:rPr>
-        <w:t>records</w:t>
-      </w:r>
-      <w:bookmarkEnd w:id="4"/>
-    </w:p>
-    <w:p>
-      <w:r>
-        <w:t>Record the original file, animal/session identity, acquisition type, timing, event log, physical voxel spacing and chosen output folder. Save the processing sequence and its parameters. Preserve saved atlas packages and ROI sidecars together.</w:t>
+        <w:t>Keep these records</w:t>
+      </w:r>
+      <w:bookmarkEnd w:id="6"/>
+    </w:p>
+    <w:p>
+      <w:r>
+        <w:t xml:space="preserve">Record the original file, animal/session identity, acquisition type, timing, event log, physical voxel spacing and chosen output folder. Save the processing sequence and its parameters. Preserve saved atlas packages and ROI </w:t>
+      </w:r>
+      <w:r>
+        <w:t>sidecars together.</w:t>
       </w:r>
     </w:p>
     <w:p>
@@ -4097,7 +4645,7 @@
       <w:pPr>
         <w:pStyle w:val="Heading1"/>
       </w:pPr>
-      <w:bookmarkStart w:id="5" w:name="_Toc243479456"/>
+      <w:bookmarkStart w:id="7" w:name="_Toc244186065"/>
       <w:r>
         <w:rPr>
           <w:b w:val="0"/>
@@ -4105,7 +4653,7 @@
         <w:lastRenderedPageBreak/>
         <w:t>3 Load data into Studio</w:t>
       </w:r>
-      <w:bookmarkEnd w:id="5"/>
+      <w:bookmarkEnd w:id="7"/>
     </w:p>
     <w:p>
       <w:pPr>
@@ -4125,7 +4673,7 @@
           <w:noProof/>
         </w:rPr>
         <w:drawing>
-          <wp:inline distT="0" distB="0" distL="0" distR="0">
+          <wp:inline distT="0" distB="0" distL="0" distR="0" wp14:anchorId="15F25000" wp14:editId="0BF3BD56">
             <wp:extent cx="9962147" cy="6309360"/>
             <wp:effectExtent l="0" t="0" r="0" b="0"/>
             <wp:docPr id="2" name="Picture 2" descr="Studio workflow overview"/>
@@ -4204,10 +4752,7 @@
         <w:t xml:space="preserve">2. </w:t>
       </w:r>
       <w:r>
-        <w:t xml:space="preserve">Review the load options. Confirm dimensions, volume/frame </w:t>
-      </w:r>
-      <w:r>
-        <w:t>count, TR and any warning about irregular timestamps.</w:t>
+        <w:t>Review the load options. Confirm dimensions, volume/frame count, TR and any warning about irregular timestamps.</w:t>
       </w:r>
     </w:p>
     <w:p>
@@ -4250,14 +4795,14 @@
       <w:pPr>
         <w:pStyle w:val="Heading2"/>
       </w:pPr>
-      <w:bookmarkStart w:id="6" w:name="_Toc243479457"/>
+      <w:bookmarkStart w:id="8" w:name="_Toc244186066"/>
       <w:r>
         <w:rPr>
           <w:b w:val="0"/>
         </w:rPr>
         <w:t>Loading from a server</w:t>
       </w:r>
-      <w:bookmarkEnd w:id="6"/>
+      <w:bookmarkEnd w:id="8"/>
     </w:p>
     <w:p>
       <w:r>
@@ -4285,7 +4830,7 @@
         <w:pStyle w:val="Heading1"/>
         <w:pageBreakBefore/>
       </w:pPr>
-      <w:bookmarkStart w:id="7" w:name="_Toc243479458"/>
+      <w:bookmarkStart w:id="9" w:name="_Toc244186067"/>
       <w:r>
         <w:rPr>
           <w:b w:val="0"/>
@@ -4293,7 +4838,7 @@
         <w:lastRenderedPageBreak/>
         <w:t>4 A first single-slice 2D analysis</w:t>
       </w:r>
-      <w:bookmarkEnd w:id="7"/>
+      <w:bookmarkEnd w:id="9"/>
     </w:p>
     <w:p>
       <w:pPr>
@@ -4388,28 +4933,28 @@
         <w:t xml:space="preserve">8. </w:t>
       </w:r>
       <w:r>
-        <w:t xml:space="preserve">Continue to FC or Group Analysis with the matching anatomy, </w:t>
-      </w:r>
-      <w:r>
-        <w:t>timing and export files.</w:t>
+        <w:t>Continue to FC or Group Analysis with the matching anatomy, timing and export files.</w:t>
       </w:r>
     </w:p>
     <w:p>
       <w:pPr>
         <w:pStyle w:val="Heading2"/>
       </w:pPr>
-      <w:bookmarkStart w:id="8" w:name="_Toc243479459"/>
+      <w:bookmarkStart w:id="10" w:name="_Toc244186068"/>
       <w:r>
         <w:rPr>
           <w:b w:val="0"/>
         </w:rPr>
         <w:t>Compare branches fairly</w:t>
       </w:r>
-      <w:bookmarkEnd w:id="8"/>
-    </w:p>
-    <w:p>
-      <w:r>
-        <w:t>Use the same anatomical support and baseline when comparing processing choices. Check response amplitude, latency, mean anatomy and motion. A smoother trace or lower variance alone does not show that the processing is better.</w:t>
+      <w:bookmarkEnd w:id="10"/>
+    </w:p>
+    <w:p>
+      <w:r>
+        <w:t xml:space="preserve">Use the same anatomical support and baseline when comparing processing choices. </w:t>
+      </w:r>
+      <w:r>
+        <w:t>Check response amplitude, latency, mean anatomy and motion. A smoother trace or lower variance alone does not show that the processing is better.</w:t>
       </w:r>
     </w:p>
     <w:p>
@@ -4422,7 +4967,7 @@
         <w:pStyle w:val="Heading1"/>
         <w:pageBreakBefore/>
       </w:pPr>
-      <w:bookmarkStart w:id="9" w:name="_Toc243479460"/>
+      <w:bookmarkStart w:id="11" w:name="_Toc244186069"/>
       <w:r>
         <w:rPr>
           <w:b w:val="0"/>
@@ -4430,7 +4975,7 @@
         <w:lastRenderedPageBreak/>
         <w:t>5 Reconstruct a step-motor recording</w:t>
       </w:r>
-      <w:bookmarkEnd w:id="9"/>
+      <w:bookmarkEnd w:id="11"/>
     </w:p>
     <w:p>
       <w:r>
@@ -4522,14 +5067,14 @@
       <w:pPr>
         <w:pStyle w:val="Heading2"/>
       </w:pPr>
-      <w:bookmarkStart w:id="10" w:name="_Toc243479461"/>
+      <w:bookmarkStart w:id="12" w:name="_Toc244186070"/>
       <w:r>
         <w:rPr>
           <w:b w:val="0"/>
         </w:rPr>
         <w:t>Register and analyze source planes</w:t>
       </w:r>
-      <w:bookmarkEnd w:id="10"/>
+      <w:bookmarkEnd w:id="12"/>
     </w:p>
     <w:p>
       <w:r>
@@ -4546,7 +5091,7 @@
         <w:pStyle w:val="Heading1"/>
         <w:pageBreakBefore/>
       </w:pPr>
-      <w:bookmarkStart w:id="11" w:name="_Toc243479462"/>
+      <w:bookmarkStart w:id="13" w:name="_Toc244186071"/>
       <w:r>
         <w:rPr>
           <w:b w:val="0"/>
@@ -4554,7 +5099,7 @@
         <w:lastRenderedPageBreak/>
         <w:t>6 Prepare a volumetric 3D recording</w:t>
       </w:r>
-      <w:bookmarkEnd w:id="11"/>
+      <w:bookmarkEnd w:id="13"/>
     </w:p>
     <w:p>
       <w:pPr>
@@ -4613,10 +5158,7 @@
         <w:t xml:space="preserve">5. </w:t>
       </w:r>
       <w:r>
-        <w:t xml:space="preserve">Compare the corrected mean </w:t>
-      </w:r>
-      <w:r>
-        <w:t>anatomy and raw time course with the input.</w:t>
+        <w:t>Compare the corrected mean anatomy and raw time course with the input.</w:t>
       </w:r>
     </w:p>
     <w:p>
@@ -4659,14 +5201,14 @@
       <w:pPr>
         <w:pStyle w:val="Heading2"/>
       </w:pPr>
-      <w:bookmarkStart w:id="12" w:name="_Toc243479463"/>
+      <w:bookmarkStart w:id="14" w:name="_Toc244186072"/>
       <w:r>
         <w:rPr>
           <w:b w:val="0"/>
         </w:rPr>
         <w:t>Use physical units consistently</w:t>
       </w:r>
-      <w:bookmarkEnd w:id="12"/>
+      <w:bookmarkEnd w:id="14"/>
     </w:p>
     <w:p>
       <w:r>
@@ -4689,7 +5231,7 @@
         <w:pStyle w:val="Heading1"/>
         <w:pageBreakBefore/>
       </w:pPr>
-      <w:bookmarkStart w:id="13" w:name="_Toc243479464"/>
+      <w:bookmarkStart w:id="15" w:name="_Toc244186073"/>
       <w:r>
         <w:rPr>
           <w:b w:val="0"/>
@@ -4697,7 +5239,7 @@
         <w:lastRenderedPageBreak/>
         <w:t>7 Review quality control</w:t>
       </w:r>
-      <w:bookmarkEnd w:id="13"/>
+      <w:bookmarkEnd w:id="15"/>
     </w:p>
     <w:p>
       <w:pPr>
@@ -4717,7 +5259,7 @@
           <w:noProof/>
         </w:rPr>
         <w:drawing>
-          <wp:inline distT="0" distB="0" distL="0" distR="0">
+          <wp:inline distT="0" distB="0" distL="0" distR="0" wp14:anchorId="20B33B99" wp14:editId="17022EA2">
             <wp:extent cx="3429000" cy="2286000"/>
             <wp:effectExtent l="0" t="0" r="0" b="0"/>
             <wp:docPr id="4" name="Picture 4" descr="Frame rejection quality control"/>
@@ -5359,7 +5901,7 @@
         <w:pStyle w:val="Heading1"/>
         <w:pageBreakBefore/>
       </w:pPr>
-      <w:bookmarkStart w:id="14" w:name="_Toc243479465"/>
+      <w:bookmarkStart w:id="16" w:name="_Toc244186074"/>
       <w:r>
         <w:rPr>
           <w:b w:val="0"/>
@@ -5367,7 +5909,7 @@
         <w:lastRenderedPageBreak/>
         <w:t>8 Frame rejection and interpolation</w:t>
       </w:r>
-      <w:bookmarkEnd w:id="14"/>
+      <w:bookmarkEnd w:id="16"/>
     </w:p>
     <w:p>
       <w:pPr>
@@ -5444,21 +5986,15 @@
         <w:pStyle w:val="Heading1"/>
         <w:pageBreakBefore/>
       </w:pPr>
-      <w:bookmarkStart w:id="15" w:name="_Toc243479466"/>
+      <w:bookmarkStart w:id="17" w:name="_Toc244186075"/>
       <w:r>
         <w:rPr>
           <w:b w:val="0"/>
         </w:rPr>
         <w:lastRenderedPageBreak/>
-        <w:t xml:space="preserve">9 </w:t>
-      </w:r>
-      <w:r>
-        <w:rPr>
-          <w:b w:val="0"/>
-        </w:rPr>
-        <w:t>Choose preprocessing deliberately</w:t>
-      </w:r>
-      <w:bookmarkEnd w:id="15"/>
+        <w:t>9 Choose preprocessing deliberately</w:t>
+      </w:r>
+      <w:bookmarkEnd w:id="17"/>
     </w:p>
     <w:p>
       <w:pPr>
@@ -5727,10 +6263,10 @@
               <w:jc w:val="left"/>
             </w:pPr>
             <w:r>
-              <w:t xml:space="preserve">Reduce </w:t>
+              <w:t xml:space="preserve">Reduce noise or very </w:t>
             </w:r>
             <w:r>
-              <w:t>noise or very long movies</w:t>
+              <w:t>long movies</w:t>
             </w:r>
           </w:p>
         </w:tc>
@@ -6180,10 +6716,7 @@
               <w:jc w:val="left"/>
             </w:pPr>
             <w:r>
-              <w:t xml:space="preserve">Model identified confounds or </w:t>
-            </w:r>
-            <w:r>
-              <w:t>experimental predictors</w:t>
+              <w:t>Model identified confounds or experimental predictors</w:t>
             </w:r>
           </w:p>
         </w:tc>
@@ -6231,31 +6764,28 @@
       <w:pPr>
         <w:pStyle w:val="Heading2"/>
       </w:pPr>
-      <w:bookmarkStart w:id="16" w:name="_Toc243479467"/>
+      <w:bookmarkStart w:id="18" w:name="_Toc244186076"/>
       <w:r>
         <w:rPr>
           <w:b w:val="0"/>
         </w:rPr>
-        <w:t xml:space="preserve">Chop and temporal </w:t>
-      </w:r>
-      <w:r>
-        <w:rPr>
-          <w:b w:val="0"/>
-        </w:rPr>
-        <w:t>reduction</w:t>
-      </w:r>
-      <w:bookmarkEnd w:id="16"/>
-    </w:p>
-    <w:p>
-      <w:r>
-        <w:t>Chopping the beginning shifts the time origin. Update event windows and document the removed duration. Averaging blocks of n input frames changes TR to n times the input TR. With a 0.32 s input, blocks of five produce 1.6 s samples; blocks of fifty produce 16 s samples and can hide short events. Choose the factor from the fastest event you need to resolve. Block averaging has limited anti-alias rejection.</w:t>
+        <w:t>Chop and temporal reduction</w:t>
+      </w:r>
+      <w:bookmarkEnd w:id="18"/>
+    </w:p>
+    <w:p>
+      <w:r>
+        <w:t xml:space="preserve">Chopping the </w:t>
+      </w:r>
+      <w:r>
+        <w:t>beginning shifts the time origin. Update event windows and document the removed duration. Averaging blocks of n input frames changes TR to n times the input TR. With a 0.32 s input, blocks of five produce 1.6 s samples; blocks of fifty produce 16 s samples and can hide short events. Choose the factor from the fastest event you need to resolve. Block averaging has limited anti-alias rejection.</w:t>
       </w:r>
     </w:p>
     <w:p>
       <w:pPr>
         <w:pStyle w:val="Heading2"/>
       </w:pPr>
-      <w:bookmarkStart w:id="17" w:name="_Toc243479468"/>
+      <w:bookmarkStart w:id="19" w:name="_Toc244186077"/>
       <w:r>
         <w:rPr>
           <w:b w:val="0"/>
@@ -6263,7 +6793,7 @@
         <w:lastRenderedPageBreak/>
         <w:t>Imregdemons</w:t>
       </w:r>
-      <w:bookmarkEnd w:id="17"/>
+      <w:bookmarkEnd w:id="19"/>
     </w:p>
     <w:p>
       <w:r>
@@ -6274,14 +6804,14 @@
       <w:pPr>
         <w:pStyle w:val="Heading2"/>
       </w:pPr>
-      <w:bookmarkStart w:id="18" w:name="_Toc243479469"/>
+      <w:bookmarkStart w:id="20" w:name="_Toc244186078"/>
       <w:r>
         <w:rPr>
           <w:b w:val="0"/>
         </w:rPr>
         <w:t>Temporal filters and drift</w:t>
       </w:r>
-      <w:bookmarkEnd w:id="18"/>
+      <w:bookmarkEnd w:id="20"/>
     </w:p>
     <w:p>
       <w:r>
@@ -6304,7 +6834,7 @@
       <w:pPr>
         <w:pStyle w:val="Heading1"/>
       </w:pPr>
-      <w:bookmarkStart w:id="19" w:name="_Toc243479470"/>
+      <w:bookmarkStart w:id="21" w:name="_Toc244186079"/>
       <w:r>
         <w:rPr>
           <w:b w:val="0"/>
@@ -6312,7 +6842,7 @@
         <w:lastRenderedPageBreak/>
         <w:t>10 Review PCA ICA and regressors</w:t>
       </w:r>
-      <w:bookmarkEnd w:id="19"/>
+      <w:bookmarkEnd w:id="21"/>
     </w:p>
     <w:p>
       <w:pPr>
@@ -6332,7 +6862,7 @@
           <w:noProof/>
         </w:rPr>
         <w:drawing>
-          <wp:inline distT="0" distB="0" distL="0" distR="0">
+          <wp:inline distT="0" distB="0" distL="0" distR="0" wp14:anchorId="49C3AC5B" wp14:editId="72B7FF0A">
             <wp:extent cx="9464040" cy="6309360"/>
             <wp:effectExtent l="0" t="0" r="0" b="0"/>
             <wp:docPr id="6" name="Picture 6" descr="PCA component review"/>
@@ -6455,14 +6985,14 @@
       <w:pPr>
         <w:pStyle w:val="Heading2"/>
       </w:pPr>
-      <w:bookmarkStart w:id="20" w:name="_Toc243479471"/>
+      <w:bookmarkStart w:id="22" w:name="_Toc244186080"/>
       <w:r>
         <w:rPr>
           <w:b w:val="0"/>
         </w:rPr>
         <w:t>Regressor analysis</w:t>
       </w:r>
-      <w:bookmarkEnd w:id="20"/>
+      <w:bookmarkEnd w:id="22"/>
     </w:p>
     <w:p>
       <w:r>
@@ -6474,7 +7004,7 @@
         <w:pStyle w:val="Heading1"/>
         <w:pageBreakBefore/>
       </w:pPr>
-      <w:bookmarkStart w:id="21" w:name="_Toc243479472"/>
+      <w:bookmarkStart w:id="23" w:name="_Toc244186081"/>
       <w:r>
         <w:rPr>
           <w:b w:val="0"/>
@@ -6482,7 +7012,7 @@
         <w:lastRenderedPageBreak/>
         <w:t>11 Set baseline and signal windows</w:t>
       </w:r>
-      <w:bookmarkEnd w:id="21"/>
+      <w:bookmarkEnd w:id="23"/>
     </w:p>
     <w:p>
       <w:r>
@@ -6858,7 +7388,7 @@
       <w:pPr>
         <w:pStyle w:val="Heading1"/>
       </w:pPr>
-      <w:bookmarkStart w:id="22" w:name="_Toc243479473"/>
+      <w:bookmarkStart w:id="24" w:name="_Toc244186082"/>
       <w:r>
         <w:rPr>
           <w:b w:val="0"/>
@@ -6866,7 +7396,7 @@
         <w:lastRenderedPageBreak/>
         <w:t>12 Use SCM GUI and fixed ROIs</w:t>
       </w:r>
-      <w:bookmarkEnd w:id="22"/>
+      <w:bookmarkEnd w:id="24"/>
     </w:p>
     <w:p>
       <w:pPr>
@@ -6886,7 +7416,7 @@
           <w:noProof/>
         </w:rPr>
         <w:drawing>
-          <wp:inline distT="0" distB="0" distL="0" distR="0">
+          <wp:inline distT="0" distB="0" distL="0" distR="0" wp14:anchorId="17C016A0" wp14:editId="3F30B27F">
             <wp:extent cx="9464040" cy="6309360"/>
             <wp:effectExtent l="0" t="0" r="0" b="0"/>
             <wp:docPr id="9" name="Picture 9" descr="SCM ROI and time course"/>
@@ -7034,14 +7564,14 @@
       <w:pPr>
         <w:pStyle w:val="Heading2"/>
       </w:pPr>
-      <w:bookmarkStart w:id="23" w:name="_Toc243479474"/>
+      <w:bookmarkStart w:id="25" w:name="_Toc244186083"/>
       <w:r>
         <w:rPr>
           <w:b w:val="0"/>
         </w:rPr>
         <w:t>Underlay and atlas context</w:t>
       </w:r>
-      <w:bookmarkEnd w:id="23"/>
+      <w:bookmarkEnd w:id="25"/>
     </w:p>
     <w:p>
       <w:r>
@@ -7091,7 +7621,7 @@
       <w:pPr>
         <w:pStyle w:val="Heading1"/>
       </w:pPr>
-      <w:bookmarkStart w:id="24" w:name="_Toc243479475"/>
+      <w:bookmarkStart w:id="26" w:name="_Toc244186084"/>
       <w:r>
         <w:rPr>
           <w:b w:val="0"/>
@@ -7099,7 +7629,7 @@
         <w:lastRenderedPageBreak/>
         <w:t>13 Draw automatic SCM search masks</w:t>
       </w:r>
-      <w:bookmarkEnd w:id="24"/>
+      <w:bookmarkEnd w:id="26"/>
     </w:p>
     <w:p>
       <w:pPr>
@@ -7122,7 +7652,7 @@
           <w:noProof/>
         </w:rPr>
         <w:drawing>
-          <wp:inline distT="0" distB="0" distL="0" distR="0">
+          <wp:inline distT="0" distB="0" distL="0" distR="0" wp14:anchorId="4A3C78B8" wp14:editId="0CF008BB">
             <wp:extent cx="9464040" cy="6309360"/>
             <wp:effectExtent l="0" t="0" r="0" b="0"/>
             <wp:docPr id="12" name="Picture 12" descr="Target and Control painting"/>
@@ -7277,14 +7807,14 @@
       <w:pPr>
         <w:pStyle w:val="Heading2"/>
       </w:pPr>
-      <w:bookmarkStart w:id="25" w:name="_Toc243479476"/>
+      <w:bookmarkStart w:id="27" w:name="_Toc244186085"/>
       <w:r>
         <w:rPr>
           <w:b w:val="0"/>
         </w:rPr>
         <w:t>Read the painted support</w:t>
       </w:r>
-      <w:bookmarkEnd w:id="25"/>
+      <w:bookmarkEnd w:id="27"/>
     </w:p>
     <w:p>
       <w:r>
@@ -7318,18 +7848,70 @@
       <w:pPr>
         <w:pStyle w:val="Heading2"/>
       </w:pPr>
-      <w:bookmarkStart w:id="26" w:name="_Toc243479477"/>
+      <w:bookmarkStart w:id="28" w:name="_Toc244186086"/>
       <w:r>
         <w:rPr>
           <w:b w:val="0"/>
         </w:rPr>
         <w:t>Review candidates and export</w:t>
       </w:r>
-      <w:bookmarkEnd w:id="26"/>
+      <w:bookmarkEnd w:id="28"/>
     </w:p>
     <w:p>
       <w:r>
         <w:t>Click a candidate row to inspect its outline and time course. Checkboxes select export membership; they do not themselves request a new trace. Keep maxima exploratory unless selection was independent of the measured response. Export the intended per-role bundle, add a note and keep its parameter/audit files and sidecars together. Whole-region mode still honors restrictive paint and bounds.</w:t>
+      </w:r>
+    </w:p>
+    <w:p>
+      <w:pPr>
+        <w:pStyle w:val="Heading2"/>
+      </w:pPr>
+      <w:bookmarkStart w:id="29" w:name="b_update_ranking_title"/>
+      <w:bookmarkStart w:id="30" w:name="_Toc244186087"/>
+      <w:bookmarkEnd w:id="29"/>
+      <w:r>
+        <w:rPr>
+          <w:b w:val="0"/>
+        </w:rPr>
+        <w:t>Rank complete atlas regions across slices</w:t>
+      </w:r>
+      <w:bookmarkEnd w:id="30"/>
+    </w:p>
+    <w:p>
+      <w:r>
+        <w:t>In SCM GUI &gt; Automatic analysis, choose Atlas: rank whole regions across slices. Set the signal interval, acquired slice range and number of top Target and Control regions; 0 includes all regions. This mode uses registered integer region labels from a standard or LightSuite atlas, even when histology or vascular anatomy is displayed.</w:t>
+      </w:r>
+    </w:p>
+    <w:p>
+      <w:r>
+        <w:t xml:space="preserve">Choose separate image sides and the Target side, or combine the sides. Draw midline defines a straight or slanted dividing line across the searched slices; Remove / combine sides removes that </w:t>
+      </w:r>
+      <w:r>
+        <w:lastRenderedPageBreak/>
+        <w:t>boundary. These controls describe displayed image sides, not automatically inferred anatomical laterality. ROI-size, brush and rectangular search restrictions do not apply to this whole-region mode.</w:t>
+      </w:r>
+    </w:p>
+    <w:p>
+      <w:r>
+        <w:t>Rank by the interval mean or by the peak of each regional mean curve, selecting increases, decreases or absolute change. Each regional trace averages one fixed set of eligible voxels across the selected slices. Voxels require a valid baseline and finite samples throughout the signal interval. Minimum usable coverage defaults to 75% and can be set from 75% to 100%; it refers to labelled voxels in the acquired slices, not the complete reference atlas.</w:t>
+      </w:r>
+    </w:p>
+    <w:p>
+      <w:r>
+        <w:t>The review table reports region names, signed signal change, rank, voxel counts, slice span and usable coverage. Click a row to preview its slice, atlas-shaped outline and trace. Mark / export boxes initially remain unchecked. Dashed outlines are temporary previews; solid outlines identify checked regions. Edit Role to reassign Target or Control, and use Clear selection to unmark results.</w:t>
+      </w:r>
+    </w:p>
+    <w:p>
+      <w:r>
+        <w:t>Pair same region on opposite side previews the matching atlas region using the same scan, signal and baseline windows, and slice range. Checking a Target retains its matching Control; unchecking releases that automatic selection unless the Control was selected independently. Missing coverage is reported rather than replaced with an unrelated region. Matching Controls remain available below the Control top-N cutoff. This display and selection pairing does not choose a statistical test.</w:t>
+      </w:r>
+    </w:p>
+    <w:p>
+      <w:r>
+        <w:t xml:space="preserve">Export tables + curves saves CSV summaries and time </w:t>
+      </w:r>
+      <w:r>
+        <w:t>courses plus a MAT audit with settings, atlas/source provenance, omitted regions and fixed voxel indices. Standard checked-ROI TXT and bundle exports retain selected regions and edited roles. Attached scans are ranked separately using scan-relative times; short scans are reported without shortening the requested interval. Ranking is exploratory and does not establish statistical significance.</w:t>
       </w:r>
     </w:p>
     <w:p>
@@ -7337,7 +7919,7 @@
         <w:pStyle w:val="Heading1"/>
         <w:pageBreakBefore/>
       </w:pPr>
-      <w:bookmarkStart w:id="27" w:name="_Toc243479478"/>
+      <w:bookmarkStart w:id="31" w:name="_Toc244186088"/>
       <w:r>
         <w:rPr>
           <w:b w:val="0"/>
@@ -7345,24 +7927,53 @@
         <w:lastRenderedPageBreak/>
         <w:t>14 Prepare masks and atlas registration</w:t>
       </w:r>
-      <w:bookmarkEnd w:id="27"/>
+      <w:bookmarkEnd w:id="31"/>
     </w:p>
     <w:p>
       <w:pPr>
         <w:pStyle w:val="Heading2"/>
       </w:pPr>
-      <w:bookmarkStart w:id="28" w:name="_Toc243479479"/>
+      <w:bookmarkStart w:id="32" w:name="_Toc244186089"/>
       <w:r>
         <w:rPr>
           <w:b w:val="0"/>
         </w:rPr>
         <w:t>Mask Editor</w:t>
       </w:r>
-      <w:bookmarkEnd w:id="28"/>
+      <w:bookmarkEnd w:id="32"/>
     </w:p>
     <w:p>
       <w:r>
         <w:t>Select the intended mask target before drawing: the anatomy/brain target and functional overlay target can serve different purposes. Confirm include/exclude convention, inspect the kept/excluded preview and save the required mask objects. A display mask and atlas search membership are not interchangeable.</w:t>
+      </w:r>
+    </w:p>
+    <w:p>
+      <w:pPr>
+        <w:pStyle w:val="Heading2"/>
+      </w:pPr>
+      <w:bookmarkStart w:id="33" w:name="b_update_mask_title"/>
+      <w:bookmarkStart w:id="34" w:name="_Toc244186090"/>
+      <w:bookmarkEnd w:id="33"/>
+      <w:r>
+        <w:rPr>
+          <w:b w:val="0"/>
+        </w:rPr>
+        <w:t xml:space="preserve">Geometric </w:t>
+      </w:r>
+      <w:r>
+        <w:rPr>
+          <w:b w:val="0"/>
+        </w:rPr>
+        <w:t>masks for volumetric probe data</w:t>
+      </w:r>
+      <w:bookmarkEnd w:id="34"/>
+    </w:p>
+    <w:p>
+      <w:r>
+        <w:t>In Mask Editor, Auto: Rectangular (3D probe) proposes straight-edged coverage; Auto: Ellipse (rounded) proposes an oval, and Anatomical (intensity) follows the Doppler envelope. Review and resize the preview before applying it. Overlay masks default to Follow slice size, fitting each slice separately; turn this off for one fixed box. Underlay masks default to fixed geometry. Smooth: All slices processes each plane independently, whereas Current slice limits the operation. Empty slices remain empty and an ex</w:t>
+      </w:r>
+      <w:r>
+        <w:t>isting brain mask restricts overlay smoothing. Apply mask updates the editor; SAVE UNDERLAY / OVERLAY / BOTH saves the result.</w:t>
       </w:r>
     </w:p>
     <w:p>
@@ -7381,7 +7992,7 @@
       <w:pPr>
         <w:pStyle w:val="Heading2"/>
       </w:pPr>
-      <w:bookmarkStart w:id="29" w:name="_Toc243479480"/>
+      <w:bookmarkStart w:id="35" w:name="_Toc244186091"/>
       <w:r>
         <w:rPr>
           <w:b w:val="0"/>
@@ -7389,7 +8000,7 @@
         <w:lastRenderedPageBreak/>
         <w:t>Register one 2D source plane</w:t>
       </w:r>
-      <w:bookmarkEnd w:id="29"/>
+      <w:bookmarkEnd w:id="35"/>
     </w:p>
     <w:p>
       <w:pPr>
@@ -7409,7 +8020,7 @@
           <w:noProof/>
         </w:rPr>
         <w:drawing>
-          <wp:inline distT="0" distB="0" distL="0" distR="0">
+          <wp:inline distT="0" distB="0" distL="0" distR="0" wp14:anchorId="6F8BB843" wp14:editId="5E28C35F">
             <wp:extent cx="9464040" cy="6309360"/>
             <wp:effectExtent l="0" t="0" r="0" b="0"/>
             <wp:docPr id="15" name="Picture 15" descr="Coronal registration controls"/>
@@ -7491,10 +8102,7 @@
         <w:t xml:space="preserve">3. </w:t>
       </w:r>
       <w:r>
-        <w:t xml:space="preserve">Select the </w:t>
-      </w:r>
-      <w:r>
-        <w:t>matching atlas plane and adjust alignment using several landmarks.</w:t>
+        <w:t>Select the matching atlas plane and adjust alignment using several landmarks.</w:t>
       </w:r>
     </w:p>
     <w:p>
@@ -7544,23 +8152,26 @@
     </w:p>
     <w:p>
       <w:r>
-        <w:t>For a motor stack repeat the source-plane mapping and preserve the combined session. For a true 3D probe use the 3D registration route and inspect coronal, sagittal and axial cuts. Verify spacing, permutation and acquired coverage before accepting it. A visually plausible slice is insufficient evidence of a correct whole-volume transform.</w:t>
+        <w:t xml:space="preserve">For a motor stack repeat the </w:t>
+      </w:r>
+      <w:r>
+        <w:t>source-plane mapping and preserve the combined session. For a true 3D probe use the 3D registration route and inspect coronal, sagittal and axial cuts. Verify spacing, permutation and acquired coverage before accepting it. A visually plausible slice is insufficient evidence of a correct whole-volume transform.</w:t>
       </w:r>
     </w:p>
     <w:p>
       <w:pPr>
         <w:pStyle w:val="Heading2"/>
       </w:pPr>
-      <w:bookmarkStart w:id="30" w:name="b_lightsuite_guide"/>
-      <w:bookmarkStart w:id="31" w:name="_Toc243479481"/>
-      <w:bookmarkEnd w:id="30"/>
+      <w:bookmarkStart w:id="36" w:name="b_lightsuite_guide"/>
+      <w:bookmarkStart w:id="37" w:name="_Toc244186092"/>
+      <w:bookmarkEnd w:id="36"/>
       <w:r>
         <w:rPr>
           <w:b w:val="0"/>
         </w:rPr>
         <w:t>LightSuite guided atlas registration</w:t>
       </w:r>
-      <w:bookmarkEnd w:id="31"/>
+      <w:bookmarkEnd w:id="37"/>
     </w:p>
     <w:p>
       <w:r>
@@ -7628,7 +8239,10 @@
         <w:t xml:space="preserve">4. </w:t>
       </w:r>
       <w:r>
-        <w:t>4 Fit registration: affine and B-spline fitting report stage and iteration progress. fUS defaults are a 1.6 mm B-spline grid and landmark weight 0.1.</w:t>
+        <w:t xml:space="preserve">4 Fit registration: affine and B-spline fitting report stage and iteration </w:t>
+      </w:r>
+      <w:r>
+        <w:t>progress. fUS defaults are a 1.6 mm B-spline grid and landmark weight 0.1.</w:t>
       </w:r>
     </w:p>
     <w:p>
@@ -7675,8 +8289,8 @@
         <w:lastRenderedPageBreak/>
         <w:t>Guided LightSuite workspace</w:t>
       </w:r>
-      <w:bookmarkStart w:id="32" w:name="b_lightsuite_guided_workspace"/>
-      <w:bookmarkEnd w:id="32"/>
+      <w:bookmarkStart w:id="38" w:name="b_lightsuite_guided_workspace"/>
+      <w:bookmarkEnd w:id="38"/>
     </w:p>
     <w:p>
       <w:pPr>
@@ -7688,7 +8302,7 @@
           <w:noProof/>
         </w:rPr>
         <w:drawing>
-          <wp:inline distT="0" distB="0" distL="0" distR="0">
+          <wp:inline distT="0" distB="0" distL="0" distR="0" wp14:anchorId="5CDBF60A" wp14:editId="7D7AD85D">
             <wp:extent cx="8310994" cy="6309359"/>
             <wp:effectExtent l="0" t="0" r="0" b="0"/>
             <wp:docPr id="18" name="Picture 18" descr="Guided LightSuite workspace"/>
@@ -7726,10 +8340,7 @@
     </w:p>
     <w:p>
       <w:r>
-        <w:t xml:space="preserve">Actual guided workspace with anonymized example identifiers. Coloured numbered </w:t>
-      </w:r>
-      <w:r>
-        <w:t>buttons perform analysis; the current step is emphasized. Green controls save results and blue Help controls open instructions. This is an interface example, not an accepted registration.</w:t>
+        <w:t>Actual guided workspace with anonymized example identifiers. Coloured numbered buttons perform analysis; the current step is emphasized. Green controls save results and blue Help controls open instructions. This is an interface example, not an accepted registration.</w:t>
       </w:r>
     </w:p>
     <w:p>
@@ -7748,11 +8359,51 @@
       <w:pPr>
         <w:pStyle w:val="Heading3"/>
       </w:pPr>
+      <w:bookmarkStart w:id="39" w:name="b_update_ls_setup_title"/>
+      <w:bookmarkEnd w:id="39"/>
       <w:r>
         <w:rPr>
           <w:b w:val="0"/>
         </w:rPr>
         <w:lastRenderedPageBreak/>
+        <w:t xml:space="preserve">Check </w:t>
+      </w:r>
+      <w:r>
+        <w:rPr>
+          <w:b w:val="0"/>
+        </w:rPr>
+        <w:t>dependencies and recording geometry</w:t>
+      </w:r>
+    </w:p>
+    <w:p>
+      <w:r>
+        <w:t>Use Dependencies &gt; Install / complete setup to install the supported Windows open-source dependencies outside the toolbox in deConfUSIon_ExternalTools. The installer preserves upstream licenses and does not install licensed MATLAB products or change the global MATLAB path. LightSuite requires MATLAB R2022b or newer and its reported toolboxes; the documented deConfUSIon reference remains R2023b. CZI import additionally requires BioformatsImage and OME Bio-Formats; TIFF does not. Cortical flatmaps are not ena</w:t>
+      </w:r>
+      <w:r>
+        <w:t>bled by this adapter.</w:t>
+      </w:r>
+    </w:p>
+    <w:p>
+      <w:r>
+        <w:t>The Recording field can use the active Studio dataset, including its current in-memory processing result. Check that the input is Doppler anatomy rather than a percentage-change movie. Spacing is read from supported metadata and verified beamformer profiles; the status identifies its source. Unsupported headers require measured millimetres along the original array dimensions. Numerical magnitude alone never defines units. Confirm the signed orientation onto AP, DV and ML; closing orientation confirmation ca</w:t>
+      </w:r>
+      <w:r>
+        <w:t>ncels that step.</w:t>
+      </w:r>
+    </w:p>
+    <w:p>
+      <w:r>
+        <w:t>Load edited underlay... opens the recording's Visualization folder and accepts a Mask Editor MAT bundle on the same native grid. It changes the anatomy shown for landmark placement; fitting retains the original anatomical template and native coordinates. Mask Editor standard is the default landmark contrast. Sample contrast, atlas contrast and atlas opacity affect only the display. Complete or cancel pending point pairs before saving.</w:t>
+      </w:r>
+    </w:p>
+    <w:p>
+      <w:pPr>
+        <w:pStyle w:val="Heading3"/>
+      </w:pPr>
+      <w:r>
+        <w:rPr>
+          <w:b w:val="0"/>
+        </w:rPr>
         <w:t>Choose and edit reliable landmarks</w:t>
       </w:r>
     </w:p>
@@ -7773,7 +8424,11 @@
     </w:p>
     <w:p>
       <w:r>
-        <w:t>BUSY identifies the operation; READY means the editor accepts input. UNSAVED CHANGES and PENDING POINT differ from SAVED with a timestamp. Important Command Window messages have bold stage labels, time, animal, scan and file path. Marker edits do not recalculate image enhancement.</w:t>
+        <w:t xml:space="preserve">BUSY identifies the operation; READY means the editor accepts input. UNSAVED CHANGES and PENDING POINT differ from SAVED with a timestamp. Important Command Window messages have </w:t>
+      </w:r>
+      <w:r>
+        <w:lastRenderedPageBreak/>
+        <w:t>bold stage labels, time, animal, scan and file path. Marker edits do not recalculate image enhancement.</w:t>
       </w:r>
     </w:p>
     <w:p>
@@ -7796,8 +8451,8 @@
         <w:lastRenderedPageBreak/>
         <w:t>Landmark editor with save and activity indicators</w:t>
       </w:r>
-      <w:bookmarkStart w:id="33" w:name="b_lightsuite_landmark_editor"/>
-      <w:bookmarkEnd w:id="33"/>
+      <w:bookmarkStart w:id="40" w:name="b_lightsuite_landmark_editor"/>
+      <w:bookmarkEnd w:id="40"/>
     </w:p>
     <w:p>
       <w:pPr>
@@ -7809,7 +8464,7 @@
           <w:noProof/>
         </w:rPr>
         <w:drawing>
-          <wp:inline distT="0" distB="0" distL="0" distR="0">
+          <wp:inline distT="0" distB="0" distL="0" distR="0" wp14:anchorId="6CCB55DA" wp14:editId="4FA985F4">
             <wp:extent cx="8555271" cy="6309359"/>
             <wp:effectExtent l="0" t="0" r="0" b="0"/>
             <wp:docPr id="21" name="Picture 21" descr="Landmark editor with save and activity indicators"/>
@@ -7847,10 +8502,7 @@
     </w:p>
     <w:p>
       <w:r>
-        <w:t xml:space="preserve">Actual paired editor with acquired </w:t>
-      </w:r>
-      <w:r>
-        <w:t>Doppler anatomy and the published vascular reference. Identifiers are anonymized; no matched points or registration acceptance are implied. The header, save badge, activity line and green Save + continue button identify the current task.</w:t>
+        <w:t>Actual paired editor with acquired Doppler anatomy and the published vascular reference. Identifiers are anonymized; no matched points or registration acceptance are implied. The header, save badge, activity line and green Save + continue button identify the current task.</w:t>
       </w:r>
     </w:p>
     <w:p>
@@ -7879,10 +8531,7 @@
     </w:p>
     <w:p>
       <w:r>
-        <w:t xml:space="preserve">In SCM or Video choose Underlay &gt; LOAD ATLAS &gt; LightSuite folder and select the project. Normal folder loads </w:t>
-      </w:r>
-      <w:r>
-        <w:t>standard registrations; Single file remains available. Atlas underlay offers Vascular, Histology and Regions when installed and exported, preserving native functional data and anatomical region context.</w:t>
+        <w:t>In SCM or Video choose Underlay &gt; LOAD ATLAS &gt; LightSuite folder and select the project. Normal folder loads standard registrations; Single file remains available. Atlas underlay offers Vascular, Histology and Regions when installed and exported, preserving native functional data and anatomical region context.</w:t>
       </w:r>
     </w:p>
     <w:p>
@@ -7899,16 +8548,51 @@
       <w:pPr>
         <w:pStyle w:val="Heading3"/>
       </w:pPr>
+      <w:bookmarkStart w:id="41" w:name="b_update_ls_versions_title"/>
+      <w:bookmarkEnd w:id="41"/>
       <w:r>
         <w:rPr>
           <w:b w:val="0"/>
         </w:rPr>
+        <w:t>Re-register and load the exact saved version</w:t>
+      </w:r>
+    </w:p>
+    <w:p>
+      <w:r>
+        <w:t>Use Open existing project &gt; Re-register (new version) to save another fit in a timestamped Registration_yyyyMMdd_HHmmss_SSS subfolder while preserving the previous fit. Edit copied landmarks retains editable pairs; Recheck orientation starts orientation confirmation without carrying pairs into a changed coordinate system. Fitted projects open read-only. Review and accept the new fit, then load that exact revision in SCM. Selecting a parent with multiple complete revisions opens a version chooser; an incompl</w:t>
+      </w:r>
+      <w:r>
+        <w:t>ete revision is not offered.</w:t>
+      </w:r>
+    </w:p>
+    <w:p>
+      <w:r>
+        <w:t>Inspect affine and nonlinear overlays in coronal, horizontal and sagittal views, including unused anatomy, acquired boundaries and laterality. Review saved landmark residuals and the AP/DV/ML span of the point set. A small inverse round-trip error or many landmarks does not prove anatomical accuracy. If numerical acceptance fails, Rebuild inverse + recheck prepares a separate candidate; it replaces the existing inverse only if the unchanged checks pass.</w:t>
+      </w:r>
+    </w:p>
+    <w:p>
+      <w:r>
+        <w:t>SCM starts with Show atlas outside acquired field unchecked. Enable it to inspect the full reference; the dashed box separates acquired tissue from reference-only anatomy. Recorded anatomy is available when the native mask bundle includes the original template. Changing the background, affine/nonlinear stage or display extent does not create functional coverage or change native ROI coordinates. Keep the full registration package and use matching grids when loading regions into SCM, Video, Mask Editor or the</w:t>
+      </w:r>
+      <w:r>
+        <w:t xml:space="preserve"> volume viewer.</w:t>
+      </w:r>
+    </w:p>
+    <w:p>
+      <w:pPr>
+        <w:pStyle w:val="Heading3"/>
+      </w:pPr>
+      <w:r>
+        <w:rPr>
+          <w:b w:val="0"/>
+        </w:rPr>
+        <w:lastRenderedPageBreak/>
         <w:t>Method scope and interpretation</w:t>
       </w:r>
     </w:p>
     <w:p>
       <w:r>
-        <w:t>Native outputs require the exact original recording grid. Cropping, resampling, reorientation or another scan needs appropriate registration. Fitted projects open read-only; use Revise fit in new project to change landmarks while preserving the previous fit. Numerical inverse checks do not replace anatomical review.</w:t>
+        <w:t>Native outputs require the original recording grid. Cropping, resampling, reorientation or another scan requires an appropriate registration. Use versioned re-registration to revise a fit without overwriting it. Numerical inverse checks complement, rather than replace, anatomical review.</w:t>
       </w:r>
     </w:p>
     <w:p>
@@ -7929,10 +8613,7 @@
     </w:p>
     <w:p>
       <w:r>
-        <w:t xml:space="preserve">We acknowledge Dimokratis Karamanlis and all LightSuite coauthors for the original framework, methods and resources. Cite their preprint alongside deConfUSIon and the relevant atlas </w:t>
-      </w:r>
-      <w:r>
-        <w:t>references. It was posted on 14 October 2026 and had not been peer reviewed. These integration screenshots do not reproduce paper figures.</w:t>
+        <w:t>We acknowledge Dimokratis Karamanlis and all LightSuite coauthors for the original framework, methods and resources. Cite their preprint alongside deConfUSIon and the relevant atlas references. It was posted on 14 October 2026 and had not been peer reviewed. These integration screenshots do not reproduce paper figures.</w:t>
       </w:r>
     </w:p>
     <w:p>
@@ -7948,7 +8629,6 @@
     </w:p>
     <w:p>
       <w:r>
-        <w:lastRenderedPageBreak/>
         <w:t>Brunner et al. (2021). Whole-brain functional ultrasound imaging in awake head-fixed mice. Nature Protocols 16, 3547-3571. doi:10.1038/s41596-021-00548-8. LightSuite resources: Zenodo 21338217 (CC BY 4.0).</w:t>
       </w:r>
     </w:p>
@@ -7980,7 +8660,7 @@
         <w:pStyle w:val="Heading1"/>
         <w:pageBreakBefore/>
       </w:pPr>
-      <w:bookmarkStart w:id="34" w:name="_Toc243479482"/>
+      <w:bookmarkStart w:id="42" w:name="_Toc244186093"/>
       <w:r>
         <w:rPr>
           <w:b w:val="0"/>
@@ -7988,24 +8668,27 @@
         <w:lastRenderedPageBreak/>
         <w:t>15 Inspect movies and the 3D model</w:t>
       </w:r>
-      <w:bookmarkEnd w:id="34"/>
+      <w:bookmarkEnd w:id="42"/>
     </w:p>
     <w:p>
       <w:pPr>
         <w:pStyle w:val="Heading2"/>
       </w:pPr>
-      <w:bookmarkStart w:id="35" w:name="_Toc243479483"/>
+      <w:bookmarkStart w:id="43" w:name="_Toc244186094"/>
       <w:r>
         <w:rPr>
           <w:b w:val="0"/>
         </w:rPr>
         <w:t>Time Course Viewer and Video GUI</w:t>
       </w:r>
-      <w:bookmarkEnd w:id="35"/>
-    </w:p>
-    <w:p>
-      <w:r>
-        <w:t>The Time-Course Viewer helps inspect the active movie and ROI traces. Start raw intensity display with neutral contrast and inspect representative frames. Video GUI combines the functional movie/PSC view with underlay and atlas context. Set frame/time, sign, percentage range and opacity deliberately.</w:t>
+      <w:bookmarkEnd w:id="43"/>
+    </w:p>
+    <w:p>
+      <w:r>
+        <w:t xml:space="preserve">The Time-Course Viewer helps inspect the active movie and ROI </w:t>
+      </w:r>
+      <w:r>
+        <w:t>traces. Start raw intensity display with neutral contrast and inspect representative frames. Video GUI combines the functional movie/PSC view with underlay and atlas context. Set frame/time, sign, percentage range and opacity deliberately.</w:t>
       </w:r>
     </w:p>
     <w:p>
@@ -8050,10 +8733,7 @@
         <w:t xml:space="preserve">3. </w:t>
       </w:r>
       <w:r>
-        <w:t xml:space="preserve">Check alignment and native/atlas coordinates before </w:t>
-      </w:r>
-      <w:r>
-        <w:t>placing ROIs.</w:t>
+        <w:t>Check alignment and native/atlas coordinates before placing ROIs.</w:t>
       </w:r>
     </w:p>
     <w:p>
@@ -8065,7 +8745,10 @@
         <w:t xml:space="preserve">4. </w:t>
       </w:r>
       <w:r>
-        <w:t>Use consistent display settings when comparing recordings.</w:t>
+        <w:t xml:space="preserve">Use consistent display settings when </w:t>
+      </w:r>
+      <w:r>
+        <w:t>comparing recordings.</w:t>
       </w:r>
     </w:p>
     <w:p>
@@ -8096,7 +8779,7 @@
       <w:pPr>
         <w:pStyle w:val="Heading2"/>
       </w:pPr>
-      <w:bookmarkStart w:id="36" w:name="_Toc243479484"/>
+      <w:bookmarkStart w:id="44" w:name="_Toc244186095"/>
       <w:r>
         <w:rPr>
           <w:b w:val="0"/>
@@ -8104,7 +8787,7 @@
         <w:lastRenderedPageBreak/>
         <w:t>Volumetric display</w:t>
       </w:r>
-      <w:bookmarkEnd w:id="36"/>
+      <w:bookmarkEnd w:id="44"/>
     </w:p>
     <w:p>
       <w:pPr>
@@ -8124,7 +8807,7 @@
           <w:noProof/>
         </w:rPr>
         <w:drawing>
-          <wp:inline distT="0" distB="0" distL="0" distR="0">
+          <wp:inline distT="0" distB="0" distL="0" distR="0" wp14:anchorId="3584C1ED" wp14:editId="4110643C">
             <wp:extent cx="13258800" cy="4433411"/>
             <wp:effectExtent l="0" t="0" r="0" b="0"/>
             <wp:docPr id="24" name="Picture 24" descr="Complete reference atlas views"/>
@@ -8175,10 +8858,7 @@
     <w:p>
       <w:r>
         <w:lastRenderedPageBreak/>
-        <w:t xml:space="preserve">Use the 3D </w:t>
-      </w:r>
-      <w:r>
-        <w:t>companion from Video for acquired-field volume, surface or coronal-stack displays. Confirm spacing and choose a backend appropriate to the data. Disable the PSC overlay to review anatomy alone; adjust the Doppler cutoff carefully so faint acquired support is not mistaken for absent tissue. Surfaces and gap/stagger/depth settings are presentation choices.</w:t>
+        <w:t>Use the 3D companion from Video for acquired-field volume, surface or coronal-stack displays. Confirm spacing and choose a backend appropriate to the data. Disable the PSC overlay to review anatomy alone; adjust the Doppler cutoff carefully so faint acquired support is not mistaken for absent tissue. Surfaces and gap/stagger/depth settings are presentation choices.</w:t>
       </w:r>
     </w:p>
     <w:p>
@@ -8202,7 +8882,7 @@
       <w:pPr>
         <w:pStyle w:val="Heading1"/>
       </w:pPr>
-      <w:bookmarkStart w:id="37" w:name="_Toc243479485"/>
+      <w:bookmarkStart w:id="45" w:name="_Toc244186096"/>
       <w:r>
         <w:rPr>
           <w:b w:val="0"/>
@@ -8210,7 +8890,7 @@
         <w:lastRenderedPageBreak/>
         <w:t>16 Compute functional connectivity</w:t>
       </w:r>
-      <w:bookmarkEnd w:id="37"/>
+      <w:bookmarkEnd w:id="45"/>
     </w:p>
     <w:p>
       <w:pPr>
@@ -8230,7 +8910,7 @@
           <w:noProof/>
         </w:rPr>
         <w:drawing>
-          <wp:inline distT="0" distB="0" distL="0" distR="0">
+          <wp:inline distT="0" distB="0" distL="0" distR="0" wp14:anchorId="2CE2220C" wp14:editId="7A40EE70">
             <wp:extent cx="9464040" cy="6309360"/>
             <wp:effectExtent l="0" t="0" r="0" b="0"/>
             <wp:docPr id="27" name="Picture 27" descr="Region connectivity matrix"/>
@@ -8387,10 +9067,7 @@
         <w:t xml:space="preserve">7. </w:t>
       </w:r>
       <w:r>
-        <w:t xml:space="preserve">Review traces, matrix values, missing regions and graph </w:t>
-      </w:r>
-      <w:r>
-        <w:t>settings before exporting.</w:t>
+        <w:t>Review traces, matrix values, missing regions and graph settings before exporting.</w:t>
       </w:r>
     </w:p>
     <w:p>
@@ -8408,7 +9085,7 @@
         <w:pStyle w:val="Heading1"/>
         <w:pageBreakBefore/>
       </w:pPr>
-      <w:bookmarkStart w:id="38" w:name="_Toc243479486"/>
+      <w:bookmarkStart w:id="46" w:name="_Toc244186097"/>
       <w:r>
         <w:rPr>
           <w:b w:val="0"/>
@@ -8416,7 +9093,7 @@
         <w:lastRenderedPageBreak/>
         <w:t>17 Import ROI results into Group Analysis</w:t>
       </w:r>
-      <w:bookmarkEnd w:id="38"/>
+      <w:bookmarkEnd w:id="46"/>
     </w:p>
     <w:p>
       <w:pPr>
@@ -8521,21 +9198,21 @@
       <w:pPr>
         <w:pStyle w:val="Heading2"/>
       </w:pPr>
-      <w:bookmarkStart w:id="39" w:name="_Toc243479487"/>
+      <w:bookmarkStart w:id="47" w:name="_Toc244186098"/>
       <w:r>
         <w:rPr>
           <w:b w:val="0"/>
         </w:rPr>
         <w:t>Choose a metric and biological unit</w:t>
       </w:r>
-      <w:bookmarkEnd w:id="39"/>
-    </w:p>
-    <w:p>
-      <w:r>
-        <w:t xml:space="preserve">A fixed-interval mean describes a prespecified interval. A maximum-plateau endpoint searches complete windows for the largest mean and should be treated as exploratory unless prespecified independently. Keep search width and duration </w:t>
-      </w:r>
-      <w:r>
-        <w:t>consistent across comparisons.</w:t>
+      <w:bookmarkEnd w:id="47"/>
+    </w:p>
+    <w:p>
+      <w:r>
+        <w:t xml:space="preserve">A </w:t>
+      </w:r>
+      <w:r>
+        <w:t>fixed-interval mean describes a prespecified interval. A maximum-plateau endpoint searches complete windows for the largest mean and should be treated as exploratory unless prespecified independently. Keep search width and duration consistent across comparisons.</w:t>
       </w:r>
     </w:p>
     <w:p>
@@ -8554,10 +9231,124 @@
     </w:p>
     <w:p>
       <w:pPr>
+        <w:pStyle w:val="Heading2"/>
+      </w:pPr>
+      <w:bookmarkStart w:id="48" w:name="b_update_group_titration_title"/>
+      <w:bookmarkStart w:id="49" w:name="_Toc244186099"/>
+      <w:bookmarkEnd w:id="48"/>
+      <w:r>
+        <w:rPr>
+          <w:b w:val="0"/>
+        </w:rPr>
+        <w:t>Assign concentrations and display titrations</w:t>
+      </w:r>
+      <w:bookmarkEnd w:id="49"/>
+    </w:p>
+    <w:p>
+      <w:r>
+        <w:t>In Group Analysis &gt; ROI Preview, choose Titration in the Bottom dropdown, then Assign doses.... Select the animal/scan rows for a dose, choose a concentration from the fixed 1/2/5 series between 1 pM and 10 µM, and click Assign selected. Individual Concentration cells also use dropdowns. Custom typed doses are unavailable; legacy off-list assignments remain visible until replaced or cleared.</w:t>
+      </w:r>
+    </w:p>
+    <w:p>
+      <w:r>
+        <w:t>Choose the source Group for aCSF; Auto recognizes aCSF, Vehicle and Control. Control rows do not need a dose. Source Group and Condition labels remain unchanged, while the plotted control category is aCSF. If the control Group has several Conditions, select one explicitly. The plot places aCSF first, followed by ascending doses with equal spacing by default; log spacing is optional. Unassigned treatment rows are reported and omitted.</w:t>
+      </w:r>
+    </w:p>
+    <w:p>
+      <w:r>
+        <w:t xml:space="preserve">Each titration dot is the animal mean of unique source scans within that category, and group means weight animals equally. Selected aCSF scans are pooled within animal irrespective of any older concentration assignment. Treatment Group and Condition combinations stay separate. Several </w:t>
+      </w:r>
+      <w:r>
+        <w:lastRenderedPageBreak/>
+        <w:t>ROIs or repeated scans do not become independent animals. Titration mode does not fit a dose-response model or run the generic pooled ROI test and Group-by-Condition outlier screening.</w:t>
+      </w:r>
+    </w:p>
+    <w:p>
+      <w:r>
+        <w:t>Error bars default to None; choose SEM or SD in Assign doses... when needed. The Legend checkbox shows or hides the live legend in the upper-right corner. Point edges match their fill colors. Save List / Load List retains assignments, selected comparisons and display choices. Correct Animal ID values before connecting repeated animals; connecting lines change the display and do not select paired statistics.</w:t>
+      </w:r>
+    </w:p>
+    <w:p>
+      <w:pPr>
+        <w:pStyle w:val="Heading2"/>
+      </w:pPr>
+      <w:bookmarkStart w:id="50" w:name="b_update_group_comparison_title"/>
+      <w:bookmarkStart w:id="51" w:name="_Toc244186100"/>
+      <w:bookmarkEnd w:id="50"/>
+      <w:r>
+        <w:rPr>
+          <w:b w:val="0"/>
+        </w:rPr>
+        <w:t>Select dose comparisons and statistical tests</w:t>
+      </w:r>
+      <w:bookmarkEnd w:id="51"/>
+    </w:p>
+    <w:p>
+      <w:r>
+        <w:t>Comparisons... supports dose-versus-aCSF tests, adjacent doses and any pair of displayed categories. On first use, all dose-versus-aCSF comparisons are selected. The default is an unpaired, equal-variance Student t-test with the one-tailed alternative dose &gt; aCSF. Student vs aCSF restores those defaults for an older list. Test and Tail update checked rows; individual comparisons can instead use Welch, paired or two-sided tests.</w:t>
+      </w:r>
+    </w:p>
+    <w:p>
+      <w:r>
+        <w:t>Tests use the animal means shown by the dots. Paired tests run only when explicitly selected and match Animal IDs. Independent tests retain their independence assumption and report overlapping animal IDs rather than silently changing the test. Review sample counts, unavailable results and the experimental design. Saved selections are retained, including intentionally clearing every comparison.</w:t>
+      </w:r>
+    </w:p>
+    <w:p>
+      <w:r>
+        <w:t>Annotations show stars and rounded p-values together by default; for example, 0.00776 appears as ** p = 0.008. Calculations and result tables retain full precision. Star thresholds use the unrounded p-value: *** for p ≤ 0.001, ** for p ≤ 0.01 and * for p ≤ 0.05. Extra digits near these thresholds prevent inconsistent labels. Stars-only display is available. Unadjusted p-values are the default; Holm and Bonferroni apply to the selected comparison family and adjusted values are labelled p_adj. Hiding annotati</w:t>
+      </w:r>
+      <w:r>
+        <w:t>ons does not change that family.</w:t>
+      </w:r>
+    </w:p>
+    <w:p>
+      <w:pPr>
+        <w:pStyle w:val="Heading2"/>
+      </w:pPr>
+      <w:bookmarkStart w:id="52" w:name="b_update_group_export_title"/>
+      <w:bookmarkStart w:id="53" w:name="_Toc244186101"/>
+      <w:bookmarkEnd w:id="52"/>
+      <w:r>
+        <w:rPr>
+          <w:b w:val="0"/>
+        </w:rPr>
+        <w:t>Preview publication figures before exporting</w:t>
+      </w:r>
+      <w:bookmarkEnd w:id="53"/>
+    </w:p>
+    <w:p>
+      <w:r>
+        <w:t xml:space="preserve">Export </w:t>
+      </w:r>
+      <w:r>
+        <w:t>Top..., Export Bottom... and Export Both... open publication previews for time courses, ordinary group comparisons and titrations. Compare Compact (85 × 75 mm), Square (90 × 90 mm) and Wide (140 × 90 mm) layouts. Choose Light or Dark; the initial scheme follows the visible ROI Preview. Axis labels, tick labels and p-values share the publication font size, and axis strokes use a consistent thickness. Marker sizes are scaled for the physical figure dimensions.</w:t>
+      </w:r>
+    </w:p>
+    <w:p>
+      <w:r>
+        <w:t xml:space="preserve">Click and drag a p-value label or bracket to move them together before saving. Reset p-value positions restores automatic placement. Positions are retained when switching layouts and used in </w:t>
+      </w:r>
+      <w:r>
+        <w:lastRenderedPageBreak/>
+        <w:t>the exported figure. The manually selected y minimum and maximum remain exact; comparison brackets have a separate annotation area above the data.</w:t>
+      </w:r>
+    </w:p>
+    <w:p>
+      <w:r>
+        <w:t>Show legend toggles the export legend, and Legend position places it above the plot or in an inside corner. The default export position is above the plot. Corner placement may overlap data, so inspect the preview after moving it. Preview and saved output use the same rendering path, including the chosen theme and legend settings.</w:t>
+      </w:r>
+    </w:p>
+    <w:p>
+      <w:r>
+        <w:t>Choose PNG at 600 dpi, vector PDF, or both, then continue to the export folder. Excel export includes source assignments, animal means, dose summaries, selected comparisons, raw and adjusted p-values, and included animal IDs. Reported confidence intervals are pointwise, not simultaneous intervals for the whole family. Retain the saved list and parameter record with the figures.</w:t>
+      </w:r>
+    </w:p>
+    <w:p>
+      <w:pPr>
         <w:pStyle w:val="Heading1"/>
         <w:pageBreakBefore/>
       </w:pPr>
-      <w:bookmarkStart w:id="40" w:name="_Toc243479488"/>
+      <w:bookmarkStart w:id="54" w:name="_Toc244186102"/>
       <w:r>
         <w:rPr>
           <w:b w:val="0"/>
@@ -8565,7 +9356,7 @@
         <w:lastRenderedPageBreak/>
         <w:t>18 Use Standardized Analysis</w:t>
       </w:r>
-      <w:bookmarkEnd w:id="40"/>
+      <w:bookmarkEnd w:id="54"/>
     </w:p>
     <w:p>
       <w:pPr>
@@ -8648,18 +9439,54 @@
     </w:p>
     <w:p>
       <w:pPr>
+        <w:pStyle w:val="Heading2"/>
+      </w:pPr>
+      <w:bookmarkStart w:id="55" w:name="b_update_presets_title"/>
+      <w:bookmarkStart w:id="56" w:name="_Toc244186103"/>
+      <w:bookmarkEnd w:id="55"/>
+      <w:r>
+        <w:rPr>
+          <w:b w:val="0"/>
+        </w:rPr>
+        <w:t>Review the current automated presets</w:t>
+      </w:r>
+      <w:bookmarkEnd w:id="56"/>
+    </w:p>
+    <w:p>
+      <w:r>
+        <w:t>H | Awake fast injections runs Frame Rejection at 3 sigma with interpolation on the original time grid, automatic PC1 removal across slices with voxel means restored, median blocks of 50 followed by Imregdemons, and SCM GUI. SCM starts positive-only at 0–50%, alpha modulation 5–10%, baseline 30–60 s and signal 700–900 s. Frame QC is saved without opening preview windows.</w:t>
+      </w:r>
+    </w:p>
+    <w:p>
+      <w:r>
+        <w:t>I | Low-pass / Reject / Imreg50 runs a 0.01 Hz, order-2, zero-phase Butterworth low-pass filter with voxel means preserved, Frame Rejection at 3 sigma with interpolation, then median blocks of 50 and Imregdemons. It does not automatically open SCM. J | Reject / PC1-5 / Imreg50 / SCM uses the H sequence but removes PCs 1–5 and opens SCM with a 7–14 min signal interval.</w:t>
+      </w:r>
+    </w:p>
+    <w:p>
+      <w:r>
+        <w:t>These presets automatically choose the registration mode for 2D, step-motor or 3D inputs. Median blocks of 50 multiply analyzed TR by 50. A timing check precedes processing; review every step, filter cutoff, component choice and event window for the current acquisition. Defaults are editable starting points and do not establish biological suitability. Reopen Standardized Analysis after replacing source files.</w:t>
+      </w:r>
+    </w:p>
+    <w:p>
+      <w:pPr>
         <w:pStyle w:val="Heading1"/>
         <w:pageBreakBefore/>
       </w:pPr>
-      <w:bookmarkStart w:id="41" w:name="_Toc243479489"/>
+      <w:bookmarkStart w:id="57" w:name="_Toc244186104"/>
       <w:r>
         <w:rPr>
           <w:b w:val="0"/>
         </w:rPr>
         <w:lastRenderedPageBreak/>
-        <w:t>19 Save export and reproduce</w:t>
-      </w:r>
-      <w:bookmarkEnd w:id="41"/>
+        <w:t xml:space="preserve">19 Save export and </w:t>
+      </w:r>
+      <w:r>
+        <w:rPr>
+          <w:b w:val="0"/>
+        </w:rPr>
+        <w:t>reproduce</w:t>
+      </w:r>
+      <w:bookmarkEnd w:id="57"/>
     </w:p>
     <w:p>
       <w:r>
@@ -8675,14 +9502,14 @@
       <w:pPr>
         <w:pStyle w:val="Heading2"/>
       </w:pPr>
-      <w:bookmarkStart w:id="42" w:name="_Toc243479490"/>
+      <w:bookmarkStart w:id="58" w:name="_Toc244186105"/>
       <w:r>
         <w:rPr>
           <w:b w:val="0"/>
         </w:rPr>
         <w:t>Final review checklist</w:t>
       </w:r>
-      <w:bookmarkEnd w:id="42"/>
+      <w:bookmarkEnd w:id="58"/>
     </w:p>
     <w:p>
       <w:pPr>
@@ -8761,7 +9588,7 @@
         <w:pStyle w:val="Heading1"/>
         <w:pageBreakBefore/>
       </w:pPr>
-      <w:bookmarkStart w:id="43" w:name="_Toc243479491"/>
+      <w:bookmarkStart w:id="59" w:name="_Toc244186106"/>
       <w:r>
         <w:rPr>
           <w:b w:val="0"/>
@@ -8769,7 +9596,7 @@
         <w:lastRenderedPageBreak/>
         <w:t>20 Troubleshoot common problems</w:t>
       </w:r>
-      <w:bookmarkEnd w:id="43"/>
+      <w:bookmarkEnd w:id="59"/>
     </w:p>
     <w:p>
       <w:pPr>
@@ -9360,10 +10187,7 @@
               <w:jc w:val="left"/>
             </w:pPr>
             <w:r>
-              <w:t xml:space="preserve">Duplicate ensemble representations or ROIs counted as independent </w:t>
-            </w:r>
-            <w:r>
-              <w:t>animals</w:t>
+              <w:t>Duplicate ensemble representations or ROIs counted as independent animals</w:t>
             </w:r>
           </w:p>
         </w:tc>
@@ -9438,10 +10262,10 @@
     </w:p>
     <w:p>
       <w:r>
-        <w:t xml:space="preserve">Record the active script path, source file, dimensions, TR, exact action and complete MATLAB error when reporting a problem. A screen image is </w:t>
-      </w:r>
-      <w:r>
-        <w:t>useful together with those details. Reproduce on a preserved original before changing several options at once.</w:t>
+        <w:t xml:space="preserve">Record the active script path, source file, dimensions, TR, exact action and complete MATLAB error when </w:t>
+      </w:r>
+      <w:r>
+        <w:t>reporting a problem. A screen image is useful together with those details. Reproduce on a preserved original before changing several options at once.</w:t>
       </w:r>
     </w:p>
     <w:p>
@@ -9449,7 +10273,7 @@
         <w:pStyle w:val="Heading1"/>
         <w:pageBreakBefore/>
       </w:pPr>
-      <w:bookmarkStart w:id="44" w:name="_Toc243479492"/>
+      <w:bookmarkStart w:id="60" w:name="_Toc244186107"/>
       <w:r>
         <w:rPr>
           <w:b w:val="0"/>
@@ -9457,7 +10281,7 @@
         <w:lastRenderedPageBreak/>
         <w:t>21 Essential terms and further reading</w:t>
       </w:r>
-      <w:bookmarkEnd w:id="44"/>
+      <w:bookmarkEnd w:id="60"/>
     </w:p>
     <w:p>
       <w:pPr>
@@ -9852,7 +10676,10 @@
               <w:jc w:val="left"/>
             </w:pPr>
             <w:r>
-              <w:t>Signal-change map and its associated viewer</w:t>
+              <w:t xml:space="preserve">Signal-change map and its </w:t>
+            </w:r>
+            <w:r>
+              <w:t>associated viewer</w:t>
             </w:r>
           </w:p>
         </w:tc>
@@ -9914,10 +10741,7 @@
               <w:jc w:val="left"/>
             </w:pPr>
             <w:r>
-              <w:t xml:space="preserve">Region of </w:t>
-            </w:r>
-            <w:r>
-              <w:t>interest with defined spatial membership</w:t>
+              <w:t>Region of interest with defined spatial membership</w:t>
             </w:r>
           </w:p>
         </w:tc>
@@ -10165,10 +10989,7 @@
               <w:jc w:val="left"/>
             </w:pPr>
             <w:r>
-              <w:t xml:space="preserve">Standard error of the mean across </w:t>
-            </w:r>
-            <w:r>
-              <w:t>independent included observations</w:t>
+              <w:t>Standard error of the mean across independent included observations</w:t>
             </w:r>
           </w:p>
         </w:tc>
@@ -10268,14 +11089,14 @@
       <w:pPr>
         <w:pStyle w:val="Heading2"/>
       </w:pPr>
-      <w:bookmarkStart w:id="45" w:name="_Toc243479493"/>
+      <w:bookmarkStart w:id="61" w:name="_Toc244186108"/>
       <w:r>
         <w:rPr>
           <w:b w:val="0"/>
         </w:rPr>
         <w:t>Acknowledgments</w:t>
       </w:r>
-      <w:bookmarkEnd w:id="45"/>
+      <w:bookmarkEnd w:id="61"/>
     </w:p>
     <w:p>
       <w:r>
@@ -10287,7 +11108,7 @@
         <w:pStyle w:val="Heading1"/>
         <w:pageBreakBefore/>
       </w:pPr>
-      <w:bookmarkStart w:id="46" w:name="_Toc243479494"/>
+      <w:bookmarkStart w:id="62" w:name="_Toc244186109"/>
       <w:r>
         <w:rPr>
           <w:b w:val="0"/>
@@ -10295,11 +11116,14 @@
         <w:lastRenderedPageBreak/>
         <w:t>Acknowledgments and responsibility</w:t>
       </w:r>
-      <w:bookmarkEnd w:id="46"/>
-    </w:p>
-    <w:p>
-      <w:r>
-        <w:t>We acknowledge Dimokratis Karamanlis and all LightSuite coauthors for the original framework, methods and resources. Cite their preprint alongside deConfUSIon and the relevant atlas references. It was posted on 14 October 2026 and had not been peer reviewed. These integration screenshots do not reproduce paper figures.</w:t>
+      <w:bookmarkEnd w:id="62"/>
+    </w:p>
+    <w:p>
+      <w:r>
+        <w:t xml:space="preserve">We acknowledge Dimokratis Karamanlis and all LightSuite coauthors for the original framework, methods and resources. Cite their preprint alongside </w:t>
+      </w:r>
+      <w:r>
+        <w:t>deConfUSIon and the relevant atlas references. It was posted on 14 October 2026 and had not been peer reviewed. These integration screenshots do not reproduce paper figures.</w:t>
       </w:r>
     </w:p>
     <w:p>
@@ -10309,10 +11133,7 @@
     </w:p>
     <w:p>
       <w:r>
-        <w:t xml:space="preserve">ConfUSIus provides a complementary Python-based approach to fUSI analysis. deConfUSIon emphasizes a connected MATLAB GUI workflow for researchers who do not write </w:t>
-      </w:r>
-      <w:r>
-        <w:t>code. Thanks are due to ConfUSIus developers Samuel Le Meur-Diebolt and Felipe Cybis Pereira, and José María Martínez de Paz from Émilie Macé’s laboratory, for discussions. The projects are independently developed.</w:t>
+        <w:t>ConfUSIus provides a complementary Python-based approach to fUSI analysis. deConfUSIon emphasizes a connected MATLAB GUI workflow for researchers who do not write code. Thanks are due to ConfUSIus developers Samuel Le Meur-Diebolt and Felipe Cybis Pereira, and José María Martínez de Paz from Émilie Macé’s laboratory, for discussions. The projects are independently developed.</w:t>
       </w:r>
     </w:p>
     <w:p>
@@ -10367,7 +11188,7 @@
       <w:rPr>
         <w:sz w:val="16"/>
       </w:rPr>
-      <w:t xml:space="preserve">Practical manual | 21 October 2026 | </w:t>
+      <w:t xml:space="preserve">Practical manual | 29 October 2026 | </w:t>
     </w:r>
     <w:r>
       <w:fldChar w:fldCharType="begin"/>
@@ -10401,7 +11222,7 @@
       <w:rPr>
         <w:sz w:val="16"/>
       </w:rPr>
-      <w:t xml:space="preserve">Practical manual | 21 October 2026 | </w:t>
+      <w:t xml:space="preserve">Practical manual | 29 October 2026 | </w:t>
     </w:r>
     <w:r>
       <w:fldChar w:fldCharType="begin"/>
@@ -10416,7 +11237,7 @@
       <w:rPr>
         <w:noProof/>
       </w:rPr>
-      <w:t>24</w:t>
+      <w:t>25</w:t>
     </w:r>
     <w:r>
       <w:fldChar w:fldCharType="end"/>
@@ -10435,7 +11256,7 @@
       <w:rPr>
         <w:sz w:val="16"/>
       </w:rPr>
-      <w:t xml:space="preserve">Practical manual | 21 October 2026 | </w:t>
+      <w:t xml:space="preserve">Practical manual | 29 October 2026 | </w:t>
     </w:r>
     <w:r>
       <w:fldChar w:fldCharType="begin"/>
@@ -10450,7 +11271,7 @@
       <w:rPr>
         <w:noProof/>
       </w:rPr>
-      <w:t>25</w:t>
+      <w:t>26</w:t>
     </w:r>
     <w:r>
       <w:fldChar w:fldCharType="end"/>
@@ -10469,7 +11290,7 @@
       <w:rPr>
         <w:sz w:val="16"/>
       </w:rPr>
-      <w:t xml:space="preserve">Practical manual | 21 October 2026 | </w:t>
+      <w:t xml:space="preserve">Practical manual | 29 October 2026 | </w:t>
     </w:r>
     <w:r>
       <w:fldChar w:fldCharType="begin"/>
@@ -10484,7 +11305,7 @@
       <w:rPr>
         <w:noProof/>
       </w:rPr>
-      <w:t>26</w:t>
+      <w:t>27</w:t>
     </w:r>
     <w:r>
       <w:fldChar w:fldCharType="end"/>
@@ -10503,7 +11324,7 @@
       <w:rPr>
         <w:sz w:val="16"/>
       </w:rPr>
-      <w:t xml:space="preserve">Practical manual | 21 October 2026 | </w:t>
+      <w:t xml:space="preserve">Practical manual | 29 October 2026 | </w:t>
     </w:r>
     <w:r>
       <w:fldChar w:fldCharType="begin"/>
@@ -10518,7 +11339,7 @@
       <w:rPr>
         <w:noProof/>
       </w:rPr>
-      <w:t>27</w:t>
+      <w:t>28</w:t>
     </w:r>
     <w:r>
       <w:fldChar w:fldCharType="end"/>
@@ -10537,7 +11358,7 @@
       <w:rPr>
         <w:sz w:val="16"/>
       </w:rPr>
-      <w:t xml:space="preserve">Practical manual | 21 October 2026 | </w:t>
+      <w:t xml:space="preserve">Practical manual | 29 October 2026 | </w:t>
     </w:r>
     <w:r>
       <w:fldChar w:fldCharType="begin"/>
@@ -10552,7 +11373,7 @@
       <w:rPr>
         <w:noProof/>
       </w:rPr>
-      <w:t>28</w:t>
+      <w:t>30</w:t>
     </w:r>
     <w:r>
       <w:fldChar w:fldCharType="end"/>
@@ -10571,7 +11392,7 @@
       <w:rPr>
         <w:sz w:val="16"/>
       </w:rPr>
-      <w:t xml:space="preserve">Practical manual | 21 October 2026 | </w:t>
+      <w:t xml:space="preserve">Practical manual | 29 October 2026 | </w:t>
     </w:r>
     <w:r>
       <w:fldChar w:fldCharType="begin"/>
@@ -10586,7 +11407,7 @@
       <w:rPr>
         <w:noProof/>
       </w:rPr>
-      <w:t>29</w:t>
+      <w:t>31</w:t>
     </w:r>
     <w:r>
       <w:fldChar w:fldCharType="end"/>
@@ -10605,7 +11426,7 @@
       <w:rPr>
         <w:sz w:val="16"/>
       </w:rPr>
-      <w:t xml:space="preserve">Practical manual | 21 October 2026 | </w:t>
+      <w:t xml:space="preserve">Practical manual | 29 October 2026 | </w:t>
     </w:r>
     <w:r>
       <w:fldChar w:fldCharType="begin"/>
@@ -10620,7 +11441,7 @@
       <w:rPr>
         <w:noProof/>
       </w:rPr>
-      <w:t>32</w:t>
+      <w:t>34</w:t>
     </w:r>
     <w:r>
       <w:fldChar w:fldCharType="end"/>
@@ -10639,7 +11460,7 @@
       <w:rPr>
         <w:sz w:val="16"/>
       </w:rPr>
-      <w:t xml:space="preserve">Practical manual | 21 October 2026 | </w:t>
+      <w:t xml:space="preserve">Practical manual | 29 October 2026 | </w:t>
     </w:r>
     <w:r>
       <w:fldChar w:fldCharType="begin"/>
@@ -10654,7 +11475,7 @@
       <w:rPr>
         <w:noProof/>
       </w:rPr>
-      <w:t>33</w:t>
+      <w:t>35</w:t>
     </w:r>
     <w:r>
       <w:fldChar w:fldCharType="end"/>
@@ -10673,7 +11494,7 @@
       <w:rPr>
         <w:sz w:val="16"/>
       </w:rPr>
-      <w:t xml:space="preserve">Practical manual | 21 October 2026 | </w:t>
+      <w:t xml:space="preserve">Practical manual | 29 October 2026 | </w:t>
     </w:r>
     <w:r>
       <w:fldChar w:fldCharType="begin"/>
@@ -10688,7 +11509,7 @@
       <w:rPr>
         <w:noProof/>
       </w:rPr>
-      <w:t>34</w:t>
+      <w:t>36</w:t>
     </w:r>
     <w:r>
       <w:fldChar w:fldCharType="end"/>
@@ -10707,7 +11528,7 @@
       <w:rPr>
         <w:sz w:val="16"/>
       </w:rPr>
-      <w:t xml:space="preserve">Practical manual | 21 October 2026 | </w:t>
+      <w:t xml:space="preserve">Practical manual | 29 October 2026 | </w:t>
     </w:r>
     <w:r>
       <w:fldChar w:fldCharType="begin"/>
@@ -10722,7 +11543,7 @@
       <w:rPr>
         <w:noProof/>
       </w:rPr>
-      <w:t>35</w:t>
+      <w:t>37</w:t>
     </w:r>
     <w:r>
       <w:fldChar w:fldCharType="end"/>
@@ -10741,7 +11562,7 @@
       <w:rPr>
         <w:sz w:val="16"/>
       </w:rPr>
-      <w:t xml:space="preserve">Practical manual | 21 October 2026 | </w:t>
+      <w:t xml:space="preserve">Practical manual | 29 October 2026 | </w:t>
     </w:r>
     <w:r>
       <w:fldChar w:fldCharType="begin"/>
@@ -10775,7 +11596,7 @@
       <w:rPr>
         <w:sz w:val="16"/>
       </w:rPr>
-      <w:t xml:space="preserve">Practical manual | 21 October 2026 | </w:t>
+      <w:t xml:space="preserve">Practical manual | 29 October 2026 | </w:t>
     </w:r>
     <w:r>
       <w:fldChar w:fldCharType="begin"/>
@@ -10809,7 +11630,7 @@
       <w:rPr>
         <w:sz w:val="16"/>
       </w:rPr>
-      <w:t xml:space="preserve">Practical manual | 21 October 2026 | </w:t>
+      <w:t xml:space="preserve">Practical manual | 29 October 2026 | </w:t>
     </w:r>
     <w:r>
       <w:fldChar w:fldCharType="begin"/>
@@ -10843,7 +11664,7 @@
       <w:rPr>
         <w:sz w:val="16"/>
       </w:rPr>
-      <w:t xml:space="preserve">Practical manual | 21 October 2026 | </w:t>
+      <w:t xml:space="preserve">Practical manual | 29 October 2026 | </w:t>
     </w:r>
     <w:r>
       <w:fldChar w:fldCharType="begin"/>
@@ -10877,7 +11698,7 @@
       <w:rPr>
         <w:sz w:val="16"/>
       </w:rPr>
-      <w:t xml:space="preserve">Practical manual | 21 October 2026 | </w:t>
+      <w:t xml:space="preserve">Practical manual | 29 October 2026 | </w:t>
     </w:r>
     <w:r>
       <w:fldChar w:fldCharType="begin"/>
@@ -10911,7 +11732,7 @@
       <w:rPr>
         <w:sz w:val="16"/>
       </w:rPr>
-      <w:t xml:space="preserve">Practical manual | 21 October 2026 | </w:t>
+      <w:t xml:space="preserve">Practical manual | 29 October 2026 | </w:t>
     </w:r>
     <w:r>
       <w:fldChar w:fldCharType="begin"/>
@@ -10945,7 +11766,7 @@
       <w:rPr>
         <w:sz w:val="16"/>
       </w:rPr>
-      <w:t xml:space="preserve">Practical manual | 21 October 2026 | </w:t>
+      <w:t xml:space="preserve">Practical manual | 29 October 2026 | </w:t>
     </w:r>
     <w:r>
       <w:fldChar w:fldCharType="begin"/>
@@ -10979,7 +11800,7 @@
       <w:rPr>
         <w:sz w:val="16"/>
       </w:rPr>
-      <w:t xml:space="preserve">Practical manual | 21 October 2026 | </w:t>
+      <w:t xml:space="preserve">Practical manual | 29 October 2026 | </w:t>
     </w:r>
     <w:r>
       <w:fldChar w:fldCharType="begin"/>
@@ -11057,7 +11878,7 @@
               <w:sz w:val="18"/>
             </w:rPr>
             <w:drawing>
-              <wp:inline distT="0" distB="0" distL="0" distR="0">
+              <wp:inline distT="0" distB="0" distL="0" distR="0" wp14:anchorId="2A665A21" wp14:editId="339C730A">
                 <wp:extent cx="283464" cy="283464"/>
                 <wp:effectExtent l="0" t="0" r="0" b="0"/>
                 <wp:docPr id="1" name="Picture 1"/>
@@ -11183,7 +12004,7 @@
               <w:sz w:val="18"/>
             </w:rPr>
             <w:drawing>
-              <wp:inline distT="0" distB="0" distL="0" distR="0">
+              <wp:inline distT="0" distB="0" distL="0" distR="0" wp14:anchorId="6AA31A2F" wp14:editId="0E306D8C">
                 <wp:extent cx="283464" cy="283464"/>
                 <wp:effectExtent l="0" t="0" r="0" b="0"/>
                 <wp:docPr id="16" name="Picture 16"/>
@@ -11259,13 +12080,7 @@
             <w:rPr>
               <w:sz w:val="18"/>
             </w:rPr>
-            <w:t xml:space="preserve">MPI for </w:t>
-          </w:r>
-          <w:r>
-            <w:rPr>
-              <w:sz w:val="18"/>
-            </w:rPr>
-            <w:t>Biological</w:t>
+            <w:t>MPI for Biological</w:t>
           </w:r>
           <w:r>
             <w:rPr>
@@ -11315,7 +12130,7 @@
               <w:sz w:val="18"/>
             </w:rPr>
             <w:drawing>
-              <wp:inline distT="0" distB="0" distL="0" distR="0">
+              <wp:inline distT="0" distB="0" distL="0" distR="0" wp14:anchorId="72E7399F" wp14:editId="2B9A7795">
                 <wp:extent cx="283464" cy="283464"/>
                 <wp:effectExtent l="0" t="0" r="0" b="0"/>
                 <wp:docPr id="17" name="Picture 17"/>
@@ -11441,7 +12256,7 @@
               <w:sz w:val="18"/>
             </w:rPr>
             <w:drawing>
-              <wp:inline distT="0" distB="0" distL="0" distR="0">
+              <wp:inline distT="0" distB="0" distL="0" distR="0" wp14:anchorId="5FEA5B7B" wp14:editId="3CC45B0B">
                 <wp:extent cx="283464" cy="283464"/>
                 <wp:effectExtent l="0" t="0" r="0" b="0"/>
                 <wp:docPr id="19" name="Picture 19"/>
@@ -11567,7 +12382,7 @@
               <w:sz w:val="18"/>
             </w:rPr>
             <w:drawing>
-              <wp:inline distT="0" distB="0" distL="0" distR="0">
+              <wp:inline distT="0" distB="0" distL="0" distR="0" wp14:anchorId="53E59B46" wp14:editId="2A82A3F3">
                 <wp:extent cx="283464" cy="283464"/>
                 <wp:effectExtent l="0" t="0" r="0" b="0"/>
                 <wp:docPr id="20" name="Picture 20"/>
@@ -11643,7 +12458,13 @@
             <w:rPr>
               <w:sz w:val="18"/>
             </w:rPr>
-            <w:t>MPI for Biological</w:t>
+            <w:t xml:space="preserve">MPI </w:t>
+          </w:r>
+          <w:r>
+            <w:rPr>
+              <w:sz w:val="18"/>
+            </w:rPr>
+            <w:t>for Biological</w:t>
           </w:r>
           <w:r>
             <w:rPr>
@@ -11693,7 +12514,7 @@
               <w:sz w:val="18"/>
             </w:rPr>
             <w:drawing>
-              <wp:inline distT="0" distB="0" distL="0" distR="0">
+              <wp:inline distT="0" distB="0" distL="0" distR="0" wp14:anchorId="70D85ABF" wp14:editId="371E3771">
                 <wp:extent cx="283464" cy="283464"/>
                 <wp:effectExtent l="0" t="0" r="0" b="0"/>
                 <wp:docPr id="22" name="Picture 22"/>
@@ -11819,7 +12640,7 @@
               <w:sz w:val="18"/>
             </w:rPr>
             <w:drawing>
-              <wp:inline distT="0" distB="0" distL="0" distR="0">
+              <wp:inline distT="0" distB="0" distL="0" distR="0" wp14:anchorId="1D41ACD0" wp14:editId="7B8F7B54">
                 <wp:extent cx="283464" cy="283464"/>
                 <wp:effectExtent l="0" t="0" r="0" b="0"/>
                 <wp:docPr id="23" name="Picture 23"/>
@@ -11945,7 +12766,7 @@
               <w:sz w:val="18"/>
             </w:rPr>
             <w:drawing>
-              <wp:inline distT="0" distB="0" distL="0" distR="0">
+              <wp:inline distT="0" distB="0" distL="0" distR="0" wp14:anchorId="4A7B4891" wp14:editId="769BB0AC">
                 <wp:extent cx="283464" cy="283464"/>
                 <wp:effectExtent l="0" t="0" r="0" b="0"/>
                 <wp:docPr id="25" name="Picture 25"/>
@@ -12071,7 +12892,7 @@
               <w:sz w:val="18"/>
             </w:rPr>
             <w:drawing>
-              <wp:inline distT="0" distB="0" distL="0" distR="0">
+              <wp:inline distT="0" distB="0" distL="0" distR="0" wp14:anchorId="4DD5BA0F" wp14:editId="1B4FA9CB">
                 <wp:extent cx="283464" cy="283464"/>
                 <wp:effectExtent l="0" t="0" r="0" b="0"/>
                 <wp:docPr id="26" name="Picture 26"/>
@@ -12197,7 +13018,7 @@
               <w:sz w:val="18"/>
             </w:rPr>
             <w:drawing>
-              <wp:inline distT="0" distB="0" distL="0" distR="0">
+              <wp:inline distT="0" distB="0" distL="0" distR="0" wp14:anchorId="5A318A24" wp14:editId="398D662A">
                 <wp:extent cx="283464" cy="283464"/>
                 <wp:effectExtent l="0" t="0" r="0" b="0"/>
                 <wp:docPr id="28" name="Picture 28"/>
@@ -12323,7 +13144,7 @@
               <w:sz w:val="18"/>
             </w:rPr>
             <w:drawing>
-              <wp:inline distT="0" distB="0" distL="0" distR="0">
+              <wp:inline distT="0" distB="0" distL="0" distR="0" wp14:anchorId="00951FFF" wp14:editId="73F918BB">
                 <wp:extent cx="283464" cy="283464"/>
                 <wp:effectExtent l="0" t="0" r="0" b="0"/>
                 <wp:docPr id="29" name="Picture 29"/>
@@ -12449,7 +13270,7 @@
               <w:sz w:val="18"/>
             </w:rPr>
             <w:drawing>
-              <wp:inline distT="0" distB="0" distL="0" distR="0">
+              <wp:inline distT="0" distB="0" distL="0" distR="0" wp14:anchorId="13F61250" wp14:editId="62294C12">
                 <wp:extent cx="283464" cy="283464"/>
                 <wp:effectExtent l="0" t="0" r="0" b="0"/>
                 <wp:docPr id="3" name="Picture 3"/>
@@ -12525,13 +13346,7 @@
             <w:rPr>
               <w:sz w:val="18"/>
             </w:rPr>
-            <w:t xml:space="preserve">MPI for </w:t>
-          </w:r>
-          <w:r>
-            <w:rPr>
-              <w:sz w:val="18"/>
-            </w:rPr>
-            <w:t>Biological</w:t>
+            <w:t>MPI for Biological</w:t>
           </w:r>
           <w:r>
             <w:rPr>
@@ -12581,7 +13396,7 @@
               <w:sz w:val="18"/>
             </w:rPr>
             <w:drawing>
-              <wp:inline distT="0" distB="0" distL="0" distR="0">
+              <wp:inline distT="0" distB="0" distL="0" distR="0" wp14:anchorId="6558338A" wp14:editId="03BE2FA5">
                 <wp:extent cx="283464" cy="283464"/>
                 <wp:effectExtent l="0" t="0" r="0" b="0"/>
                 <wp:docPr id="5" name="Picture 5"/>
@@ -12707,7 +13522,7 @@
               <w:sz w:val="18"/>
             </w:rPr>
             <w:drawing>
-              <wp:inline distT="0" distB="0" distL="0" distR="0">
+              <wp:inline distT="0" distB="0" distL="0" distR="0" wp14:anchorId="32367FBE" wp14:editId="6FCF7BB4">
                 <wp:extent cx="283464" cy="283464"/>
                 <wp:effectExtent l="0" t="0" r="0" b="0"/>
                 <wp:docPr id="7" name="Picture 7"/>
@@ -12833,7 +13648,7 @@
               <w:sz w:val="18"/>
             </w:rPr>
             <w:drawing>
-              <wp:inline distT="0" distB="0" distL="0" distR="0">
+              <wp:inline distT="0" distB="0" distL="0" distR="0" wp14:anchorId="05C9A6E0" wp14:editId="241383DE">
                 <wp:extent cx="283464" cy="283464"/>
                 <wp:effectExtent l="0" t="0" r="0" b="0"/>
                 <wp:docPr id="8" name="Picture 8"/>
@@ -12959,7 +13774,7 @@
               <w:sz w:val="18"/>
             </w:rPr>
             <w:drawing>
-              <wp:inline distT="0" distB="0" distL="0" distR="0">
+              <wp:inline distT="0" distB="0" distL="0" distR="0" wp14:anchorId="1BB6A0BC" wp14:editId="484111E8">
                 <wp:extent cx="283464" cy="283464"/>
                 <wp:effectExtent l="0" t="0" r="0" b="0"/>
                 <wp:docPr id="10" name="Picture 10"/>
@@ -13085,7 +13900,7 @@
               <w:sz w:val="18"/>
             </w:rPr>
             <w:drawing>
-              <wp:inline distT="0" distB="0" distL="0" distR="0">
+              <wp:inline distT="0" distB="0" distL="0" distR="0" wp14:anchorId="0358C14F" wp14:editId="7EFCA6DF">
                 <wp:extent cx="283464" cy="283464"/>
                 <wp:effectExtent l="0" t="0" r="0" b="0"/>
                 <wp:docPr id="11" name="Picture 11"/>
@@ -13211,7 +14026,7 @@
               <w:sz w:val="18"/>
             </w:rPr>
             <w:drawing>
-              <wp:inline distT="0" distB="0" distL="0" distR="0">
+              <wp:inline distT="0" distB="0" distL="0" distR="0" wp14:anchorId="3D9ABB8A" wp14:editId="741960CA">
                 <wp:extent cx="283464" cy="283464"/>
                 <wp:effectExtent l="0" t="0" r="0" b="0"/>
                 <wp:docPr id="13" name="Picture 13"/>
@@ -13337,7 +14152,7 @@
               <w:sz w:val="18"/>
             </w:rPr>
             <w:drawing>
-              <wp:inline distT="0" distB="0" distL="0" distR="0">
+              <wp:inline distT="0" distB="0" distL="0" distR="0" wp14:anchorId="0CA3266A" wp14:editId="6A055BE4">
                 <wp:extent cx="283464" cy="283464"/>
                 <wp:effectExtent l="0" t="0" r="0" b="0"/>
                 <wp:docPr id="14" name="Picture 14"/>
@@ -13607,31 +14422,31 @@
       </w:rPr>
     </w:lvl>
   </w:abstractNum>
-  <w:num w:numId="1" w16cid:durableId="149446776">
+  <w:num w:numId="1" w16cid:durableId="1264144260">
     <w:abstractNumId w:val="8"/>
   </w:num>
-  <w:num w:numId="2" w16cid:durableId="647978024">
+  <w:num w:numId="2" w16cid:durableId="1480727187">
     <w:abstractNumId w:val="6"/>
   </w:num>
-  <w:num w:numId="3" w16cid:durableId="1465539574">
+  <w:num w:numId="3" w16cid:durableId="919483017">
     <w:abstractNumId w:val="5"/>
   </w:num>
-  <w:num w:numId="4" w16cid:durableId="884370215">
+  <w:num w:numId="4" w16cid:durableId="1814633827">
     <w:abstractNumId w:val="4"/>
   </w:num>
-  <w:num w:numId="5" w16cid:durableId="801656418">
+  <w:num w:numId="5" w16cid:durableId="1296443968">
     <w:abstractNumId w:val="7"/>
   </w:num>
-  <w:num w:numId="6" w16cid:durableId="21176479">
+  <w:num w:numId="6" w16cid:durableId="200096636">
     <w:abstractNumId w:val="3"/>
   </w:num>
-  <w:num w:numId="7" w16cid:durableId="787892669">
+  <w:num w:numId="7" w16cid:durableId="1622492758">
     <w:abstractNumId w:val="2"/>
   </w:num>
-  <w:num w:numId="8" w16cid:durableId="1737052453">
+  <w:num w:numId="8" w16cid:durableId="1696956041">
     <w:abstractNumId w:val="1"/>
   </w:num>
-  <w:num w:numId="9" w16cid:durableId="1408915746">
+  <w:num w:numId="9" w16cid:durableId="101657586">
     <w:abstractNumId w:val="0"/>
   </w:num>
 </w:numbering>
@@ -25083,7 +25898,7 @@
     <w:autoRedefine/>
     <w:uiPriority w:val="39"/>
     <w:unhideWhenUsed/>
-    <w:rsid w:val="00D963DB"/>
+    <w:rsid w:val="00A828BB"/>
     <w:pPr>
       <w:spacing w:after="100"/>
     </w:pPr>
@@ -25095,7 +25910,7 @@
     <w:autoRedefine/>
     <w:uiPriority w:val="39"/>
     <w:unhideWhenUsed/>
-    <w:rsid w:val="00D963DB"/>
+    <w:rsid w:val="00A828BB"/>
     <w:pPr>
       <w:spacing w:after="100"/>
       <w:ind w:left="220"/>
@@ -25106,7 +25921,7 @@
     <w:basedOn w:val="DefaultParagraphFont"/>
     <w:uiPriority w:val="99"/>
     <w:unhideWhenUsed/>
-    <w:rsid w:val="00D963DB"/>
+    <w:rsid w:val="00A828BB"/>
     <w:rPr>
       <w:color w:val="0000FF" w:themeColor="hyperlink"/>
       <w:u w:val="single"/>

</xml_diff>